<commit_message>
Paper A: Kopfzeilen als eigene Zeilen
Co-Authored-By: Claude Opus 5.5 <noreply@anthropic.com>
Claude-Session: https://claude.ai/code/session_013WHGNh61Va4DrXQ4AxtPNr
</commit_message>
<xml_diff>
--- a/Paper_ODT/Panorama_Pipeline_Paper/Manuscript_SoftwareX_EN.docx
+++ b/Paper_ODT/Panorama_Pipeline_Paper/Manuscript_SoftwareX_EN.docx
@@ -148,7 +148,7 @@
         <w:t xml:space="preserve">Angel Naya, Independent researcher, [city, country]</w:t>
       </w:r>
       <w:r>
-        <w:t xml:space="preserve"> </w:t>
+        <w:br/>
       </w:r>
       <w:r>
         <w:rPr>
@@ -164,7 +164,7 @@
         <w:t xml:space="preserve">Angel Naya, angel.naya@posteo.de</w:t>
       </w:r>
       <w:r>
-        <w:t xml:space="preserve"> </w:t>
+        <w:br/>
       </w:r>
       <w:r>
         <w:rPr>

</xml_diff>

<commit_message>
Paper A: Zitat [5] Huber 2011 bestaetigt, Artikelnummer 78640A
Co-Authored-By: Claude Opus 5.5 <noreply@anthropic.com>
Claude-Session: https://claude.ai/code/session_013WHGNh61Va4DrXQ4AxtPNr
</commit_message>
<xml_diff>
--- a/Paper_ODT/Panorama_Pipeline_Paper/Manuscript_SoftwareX_EN.docx
+++ b/Paper_ODT/Panorama_Pipeline_Paper/Manuscript_SoftwareX_EN.docx
@@ -3896,13 +3896,13 @@
         <w:t xml:space="preserve"> </w:t>
       </w:r>
       <w:r>
-        <w:t xml:space="preserve">7864, Three-Dimensional Imaging, Interaction, and Measurement.</w:t>
-      </w:r>
-      <w:r>
-        <w:t xml:space="preserve"> </w:t>
-      </w:r>
-      <w:r>
-        <w:t xml:space="preserve">https://doi.org/10.1117/12.876555</w:t>
+        <w:t xml:space="preserve">7864, Three-Dimensional Imaging, Interaction, and Measurement,</w:t>
+      </w:r>
+      <w:r>
+        <w:t xml:space="preserve"> </w:t>
+      </w:r>
+      <w:r>
+        <w:t xml:space="preserve">78640A. https://doi.org/10.1117/12.876555</w:t>
       </w:r>
     </w:p>
     <w:p>
@@ -4414,7 +4414,7 @@
           <w:iCs/>
           <w:i/>
         </w:rPr>
-        <w:t xml:space="preserve">Checked against publisher records (Oct 2026): [1]–[3], [6], [7], [11]–[14]. Still to check: DOI of [5], [10].</w:t>
+        <w:t xml:space="preserve">Checked against publisher records (Oct 2026): [1]–[3], [5]–[7], [11]–[14], [17]. Still to check: [10].</w:t>
       </w:r>
     </w:p>
     <w:bookmarkEnd w:id="40"/>

</xml_diff>

<commit_message>
Paper A: Zitat [10] als Zenodo-Datensatz (PASSTA, CC BY 4.0) bestaetigt
Autoren laut Zenodo: Meneghetti, Danelljan, Felsberg (ohne Nordberg).
Alle 17 Literaturangaben sind damit geprueft.

Co-Authored-By: Claude Opus 5.5 <noreply@anthropic.com>
Claude-Session: https://claude.ai/code/session_013WHGNh61Va4DrXQ4AxtPNr
</commit_message>
<xml_diff>
--- a/Paper_ODT/Panorama_Pipeline_Paper/Manuscript_SoftwareX_EN.docx
+++ b/Paper_ODT/Panorama_Pipeline_Paper/Manuscript_SoftwareX_EN.docx
@@ -3732,7 +3732,7 @@
       </w:r>
     </w:p>
     <w:bookmarkEnd w:id="39"/>
-    <w:bookmarkStart w:id="40" w:name="references"/>
+    <w:bookmarkStart w:id="43" w:name="references"/>
     <w:p>
       <w:pPr>
         <w:pStyle w:val="Heading2"/>
@@ -4059,13 +4059,91 @@
         <w:pStyle w:val="BodyText"/>
       </w:pPr>
       <w:r>
-        <w:t xml:space="preserve">[10] Meneghetti, G., Danelljan, M., Felsberg, M., Nordberg, K. (2015). Image</w:t>
-      </w:r>
-      <w:r>
-        <w:t xml:space="preserve"> </w:t>
-      </w:r>
-      <w:r>
-        <w:t xml:space="preserve">alignment for panorama stitching in sparsely structured environments.</w:t>
+        <w:t xml:space="preserve">[10] Meneghetti, G., Danelljan, M., Felsberg, M. (2015). Image alignment for</w:t>
+      </w:r>
+      <w:r>
+        <w:t xml:space="preserve"> </w:t>
+      </w:r>
+      <w:r>
+        <w:t xml:space="preserve">panorama stitching in sparsely structured environments [Dataset]. Zenodo.</w:t>
+      </w:r>
+      <w:r>
+        <w:t xml:space="preserve"> </w:t>
+      </w:r>
+      <w:r>
+        <w:t xml:space="preserve">CC BY 4.0. https://doi.org/10.5281/zenodo.19663081</w:t>
+      </w:r>
+    </w:p>
+    <w:p>
+      <w:pPr>
+        <w:pStyle w:val="BodyText"/>
+      </w:pPr>
+      <w:r>
+        <w:t xml:space="preserve">[11] (authors’ configuration) |</w:t>
+      </w:r>
+      <w:r>
+        <w:t xml:space="preserve"> </w:t>
+      </w:r>
+      <w:r>
+        <w:rPr>
+          <w:bCs/>
+          <w:b/>
+        </w:rPr>
+        <w:t xml:space="preserve">98.5 % / 95.7 %</w:t>
+      </w:r>
+      <w:r>
+        <w:t xml:space="preserve"> </w:t>
+      </w:r>
+      <w:r>
+        <w:t xml:space="preserve">|</w:t>
+      </w:r>
+      <w:r>
+        <w:t xml:space="preserve"> </w:t>
+      </w:r>
+      <w:r>
+        <w:rPr>
+          <w:bCs/>
+          <w:b/>
+        </w:rPr>
+        <w:t xml:space="preserve">94.5 % / 100 %</w:t>
+      </w:r>
+      <w:r>
+        <w:t xml:space="preserve"> </w:t>
+      </w:r>
+      <w:r>
+        <w:t xml:space="preserve">|</w:t>
+      </w:r>
+    </w:p>
+    <w:p>
+      <w:pPr>
+        <w:pStyle w:val="BodyText"/>
+      </w:pPr>
+      <w:r>
+        <w:t xml:space="preserve">We report the uncomfortable result openly: the established domain tool 3DFin</w:t>
+      </w:r>
+      <w:r>
+        <w:t xml:space="preserve"> </w:t>
+      </w:r>
+      <w:r>
+        <w:t xml:space="preserve">clearly outperforms our own baseline, consistently across both plots, and the</w:t>
+      </w:r>
+      <w:r>
+        <w:t xml:space="preserve"> </w:t>
+      </w:r>
+      <w:r>
+        <w:t xml:space="preserve">chain therefore uses it as the detector on plot-wide TLS clouds rather than</w:t>
+      </w:r>
+      <w:r>
+        <w:t xml:space="preserve"> </w:t>
+      </w:r>
+      <w:r>
+        <w:t xml:space="preserve">merely as a comparison. Because the dataset also labels shrubs, downed wood,</w:t>
+      </w:r>
+      <w:r>
+        <w:t xml:space="preserve"> </w:t>
+      </w:r>
+      <w:r>
+        <w:t xml:space="preserve">rocks, and stakes, it is further verifiable</w:t>
       </w:r>
       <w:r>
         <w:t xml:space="preserve"> </w:t>
@@ -4075,58 +4153,79 @@
           <w:iCs/>
           <w:i/>
         </w:rPr>
-        <w:t xml:space="preserve">Scandinavian Conference on Image Analysis (SCIA)</w:t>
-      </w:r>
-      <w:r>
-        <w:t xml:space="preserve">. Data: CC-BY-4.0,</w:t>
-      </w:r>
-      <w:r>
-        <w:t xml:space="preserve"> </w:t>
-      </w:r>
-      <w:r>
-        <w:t xml:space="preserve">https://doi.org/10.5281/zenodo.19663081</w:t>
+        <w:t xml:space="preserve">what</w:t>
+      </w:r>
+      <w:r>
+        <w:t xml:space="preserve"> </w:t>
+      </w:r>
+      <w:r>
+        <w:t xml:space="preserve">the weaker methods detect</w:t>
+      </w:r>
+      <w:r>
+        <w:t xml:space="preserve"> </w:t>
+      </w:r>
+      <w:r>
+        <w:t xml:space="preserve">instead of stems — for the baseline on plot_06, half of the false alarms sit on</w:t>
+      </w:r>
+      <w:r>
+        <w:t xml:space="preserve"> </w:t>
+      </w:r>
+      <w:r>
+        <w:t xml:space="preserve">shrub and ground vegetation.</w:t>
       </w:r>
     </w:p>
     <w:p>
       <w:pPr>
         <w:pStyle w:val="BodyText"/>
       </w:pPr>
-      <w:r>
-        <w:t xml:space="preserve">[11] Laino, D., Cabo, C., Prendes, C., et al. (2024). 3DFin: a software for</w:t>
-      </w:r>
-      <w:r>
-        <w:t xml:space="preserve"> </w:t>
-      </w:r>
-      <w:r>
-        <w:t xml:space="preserve">automated 3D forest inventories from terrestrial point clouds.</w:t>
-      </w:r>
-      <w:r>
-        <w:t xml:space="preserve"> </w:t>
-      </w:r>
       <w:r>
         <w:rPr>
           <w:iCs/>
           <w:i/>
         </w:rPr>
-        <w:t xml:space="preserve">Forestry</w:t>
-      </w:r>
-      <w:r>
-        <w:t xml:space="preserve"> </w:t>
-      </w:r>
-      <w:r>
-        <w:t xml:space="preserve">97(4),</w:t>
-      </w:r>
-      <w:r>
-        <w:t xml:space="preserve"> </w:t>
-      </w:r>
-      <w:r>
-        <w:t xml:space="preserve">479–496.</w:t>
-      </w:r>
-      <w:r>
-        <w:t xml:space="preserve"> </w:t>
-      </w:r>
-      <w:r>
-        <w:t xml:space="preserve">https://doi.org/10.1093/forestry/cpae020</w:t>
+        <w:t xml:space="preserve">Scope.</w:t>
+      </w:r>
+      <w:r>
+        <w:t xml:space="preserve"> </w:t>
+      </w:r>
+      <w:r>
+        <w:t xml:space="preserve">This superiority is conditional on circumferential coverage. On our own</w:t>
+      </w:r>
+      <w:r>
+        <w:t xml:space="preserve"> </w:t>
+      </w:r>
+      <w:r>
+        <w:t xml:space="preserve">Renon stand (median 180° arc versus 280–360° in the reference plots) 3DFin</w:t>
+      </w:r>
+      <w:r>
+        <w:t xml:space="preserve"> </w:t>
+      </w:r>
+      <w:r>
+        <w:t xml:space="preserve">refuses a diameter for 29 of 37 detections — correct behaviour, since the data do</w:t>
+      </w:r>
+      <w:r>
+        <w:t xml:space="preserve"> </w:t>
+      </w:r>
+      <w:r>
+        <w:t xml:space="preserve">not support one; a sweep over the ground-model resolution (cloth simulation</w:t>
+      </w:r>
+      <w:r>
+        <w:t xml:space="preserve"> </w:t>
+      </w:r>
+      <w:r>
+        <w:t xml:space="preserve">filter [14]) does not change this.</w:t>
+      </w:r>
+      <w:r>
+        <w:t xml:space="preserve"> </w:t>
+      </w:r>
+      <w:r>
+        <w:t xml:space="preserve">Our own methods still return numbers there, resting on 180° arcs — a statement</w:t>
+      </w:r>
+      <w:r>
+        <w:t xml:space="preserve"> </w:t>
+      </w:r>
+      <w:r>
+        <w:t xml:space="preserve">about the acquisition, not about the methods.</w:t>
       </w:r>
     </w:p>
     <w:p>
@@ -4134,49 +4233,439 @@
         <w:pStyle w:val="BodyText"/>
       </w:pPr>
       <w:r>
-        <w:t xml:space="preserve">[12] Laino, D., Cabo, C., Ordóñez, C., et al. (2026). SegmentedForests: a labelled</w:t>
-      </w:r>
-      <w:r>
-        <w:t xml:space="preserve"> </w:t>
-      </w:r>
-      <w:r>
-        <w:t xml:space="preserve">dataset of terrestrial LiDAR point clouds for semantic segmentation of forests.</w:t>
-      </w:r>
-      <w:r>
-        <w:t xml:space="preserve"> </w:t>
-      </w:r>
+        <w:rPr>
+          <w:bCs/>
+          <w:b/>
+        </w:rPr>
+        <w:t xml:space="preserve">Consumer/DSLR fisheye → scene (stitching).</w:t>
+      </w:r>
+      <w:r>
+        <w:t xml:space="preserve"> </w:t>
+      </w:r>
+      <w:r>
+        <w:t xml:space="preserve">Six overlapping fisheye frames are</w:t>
+      </w:r>
+      <w:r>
+        <w:t xml:space="preserve"> </w:t>
+      </w:r>
+      <w:r>
+        <w:t xml:space="preserve">stitched automatically and published as a navigable scene, demonstrating the</w:t>
+      </w:r>
+      <w:r>
+        <w:t xml:space="preserve"> </w:t>
+      </w:r>
+      <w:r>
+        <w:t xml:space="preserve">pose-unknown branch across the low-cost end of the device spectrum.</w:t>
+      </w:r>
+    </w:p>
+    <w:p>
+      <w:pPr>
+        <w:pStyle w:val="BodyText"/>
+      </w:pPr>
+      <w:r>
+        <w:rPr>
+          <w:bCs/>
+          <w:b/>
+        </w:rPr>
+        <w:t xml:space="preserve">Quantitative comparison against CC0 ground truth.</w:t>
+      </w:r>
+      <w:r>
+        <w:t xml:space="preserve"> </w:t>
+      </w:r>
+      <w:r>
+        <w:t xml:space="preserve">From each of eleven CC0</w:t>
+      </w:r>
+      <w:r>
+        <w:t xml:space="preserve"> </w:t>
+      </w:r>
+      <w:r>
+        <w:t xml:space="preserve">reference panoramas (Poly Haven, 8192×4096) we render synthetic captures and rebuild</w:t>
+      </w:r>
+      <w:r>
+        <w:t xml:space="preserve"> </w:t>
+      </w:r>
+      <w:r>
+        <w:t xml:space="preserve">a panorama (2048×1024) — once by stitching six 180° fisheye frames (pose withheld),</w:t>
+      </w:r>
+      <w:r>
+        <w:t xml:space="preserve"> </w:t>
+      </w:r>
+      <w:r>
+        <w:t xml:space="preserve">once by reprojecting six 90° pinhole frames plus zenith/nadir (pose used) — and</w:t>
+      </w:r>
+      <w:r>
+        <w:t xml:space="preserve"> </w:t>
+      </w:r>
+      <w:r>
+        <w:t xml:space="preserve">measure both against the same original (PSNR, SSIM [8]).</w:t>
+      </w:r>
+    </w:p>
+    <w:p>
+      <w:pPr>
+        <w:pStyle w:val="BodyText"/>
+      </w:pPr>
       <w:r>
         <w:rPr>
           <w:iCs/>
           <w:i/>
         </w:rPr>
-        <w:t xml:space="preserve">Forestry</w:t>
-      </w:r>
-      <w:r>
-        <w:t xml:space="preserve"> </w:t>
-      </w:r>
-      <w:r>
-        <w:t xml:space="preserve">99(2). https://doi.org/10.1093/forestry/cpaf062 · Data:</w:t>
-      </w:r>
-      <w:r>
-        <w:t xml:space="preserve"> </w:t>
-      </w:r>
-      <w:r>
-        <w:t xml:space="preserve">https://doi.org/10.5281/zenodo.17396681</w:t>
-      </w:r>
-    </w:p>
+        <w:t xml:space="preserve">Counting convention (used throughout):</w:t>
+      </w:r>
+      <w:r>
+        <w:t xml:space="preserve"> </w:t>
+      </w:r>
+      <w:r>
+        <w:rPr>
+          <w:bCs/>
+          <w:b/>
+        </w:rPr>
+        <w:t xml:space="preserve">completed</w:t>
+      </w:r>
+      <w:r>
+        <w:t xml:space="preserve"> </w:t>
+      </w:r>
+      <w:r>
+        <w:t xml:space="preserve">means the chain wrote a</w:t>
+      </w:r>
+      <w:r>
+        <w:t xml:space="preserve"> </w:t>
+      </w:r>
+      <w:r>
+        <w:t xml:space="preserve">panorama at all;</w:t>
+      </w:r>
+      <w:r>
+        <w:t xml:space="preserve"> </w:t>
+      </w:r>
+      <w:r>
+        <w:rPr>
+          <w:bCs/>
+          <w:b/>
+        </w:rPr>
+        <w:t xml:space="preserve">usable</w:t>
+      </w:r>
+      <w:r>
+        <w:t xml:space="preserve"> </w:t>
+      </w:r>
+      <w:r>
+        <w:t xml:space="preserve">additionally means the result is geometrically</w:t>
+      </w:r>
+      <w:r>
+        <w:t xml:space="preserve"> </w:t>
+      </w:r>
+      <w:r>
+        <w:t xml:space="preserve">correct. The distinction matters for stitching, where two runs produce a</w:t>
+      </w:r>
+      <w:r>
+        <w:t xml:space="preserve"> </w:t>
+      </w:r>
+      <w:r>
+        <w:t xml:space="preserve">complete but misregistered image.</w:t>
+      </w:r>
+    </w:p>
+    <w:tbl>
+      <w:tblPr>
+        <w:tblStyle w:val="Table"/>
+        <w:tblW w:type="pct" w:w="5000"/>
+        <w:tblLook w:firstRow="1" w:lastRow="0" w:firstColumn="0" w:lastColumn="0" w:noHBand="0" w:noVBand="0" w:val="0020"/>
+        <w:jc w:val="start"/>
+      </w:tblPr>
+      <w:tblGrid>
+        <w:gridCol w:w="1131"/>
+        <w:gridCol w:w="1131"/>
+        <w:gridCol w:w="1131"/>
+        <w:gridCol w:w="1131"/>
+        <w:gridCol w:w="1131"/>
+        <w:gridCol w:w="1131"/>
+        <w:gridCol w:w="1131"/>
+      </w:tblGrid>
+      <w:tr>
+        <w:trPr>
+          <w:tblHeader w:val="true"/>
+        </w:trPr>
+        <w:tc>
+          <w:tcPr/>
+          <w:p>
+            <w:pPr>
+              <w:pStyle w:val="Compact"/>
+              <w:jc w:val="left"/>
+            </w:pPr>
+            <w:r>
+              <w:t xml:space="preserve">Branch</w:t>
+            </w:r>
+          </w:p>
+        </w:tc>
+        <w:tc>
+          <w:tcPr/>
+          <w:p>
+            <w:pPr>
+              <w:pStyle w:val="Compact"/>
+              <w:jc w:val="right"/>
+            </w:pPr>
+            <w:r>
+              <w:t xml:space="preserve">completed</w:t>
+            </w:r>
+          </w:p>
+        </w:tc>
+        <w:tc>
+          <w:tcPr/>
+          <w:p>
+            <w:pPr>
+              <w:pStyle w:val="Compact"/>
+              <w:jc w:val="right"/>
+            </w:pPr>
+            <w:r>
+              <w:t xml:space="preserve">usable</w:t>
+            </w:r>
+          </w:p>
+        </w:tc>
+        <w:tc>
+          <w:tcPr/>
+          <w:p>
+            <w:pPr>
+              <w:pStyle w:val="Compact"/>
+              <w:jc w:val="right"/>
+            </w:pPr>
+            <w:r>
+              <w:t xml:space="preserve">PSNR (dB)</w:t>
+            </w:r>
+          </w:p>
+        </w:tc>
+        <w:tc>
+          <w:tcPr/>
+          <w:p>
+            <w:pPr>
+              <w:pStyle w:val="Compact"/>
+              <w:jc w:val="right"/>
+            </w:pPr>
+            <w:r>
+              <w:t xml:space="preserve">SSIM</w:t>
+            </w:r>
+          </w:p>
+        </w:tc>
+        <w:tc>
+          <w:tcPr/>
+          <w:p>
+            <w:pPr>
+              <w:pStyle w:val="Compact"/>
+              <w:jc w:val="right"/>
+            </w:pPr>
+            <w:r>
+              <w:t xml:space="preserve">seam offset (px)</w:t>
+            </w:r>
+          </w:p>
+        </w:tc>
+        <w:tc>
+          <w:tcPr/>
+          <w:p>
+            <w:pPr>
+              <w:pStyle w:val="Compact"/>
+              <w:jc w:val="right"/>
+            </w:pPr>
+            <w:r>
+              <w:t xml:space="preserve">runtime</w:t>
+            </w:r>
+          </w:p>
+        </w:tc>
+      </w:tr>
+      <w:tr>
+        <w:tc>
+          <w:tcPr/>
+          <w:p>
+            <w:pPr>
+              <w:pStyle w:val="Compact"/>
+              <w:jc w:val="left"/>
+            </w:pPr>
+            <w:r>
+              <w:t xml:space="preserve">Stitching (pose estimated)</w:t>
+            </w:r>
+          </w:p>
+        </w:tc>
+        <w:tc>
+          <w:tcPr/>
+          <w:p>
+            <w:pPr>
+              <w:pStyle w:val="Compact"/>
+              <w:jc w:val="right"/>
+            </w:pPr>
+            <w:r>
+              <w:t xml:space="preserve">8 / 11</w:t>
+            </w:r>
+          </w:p>
+        </w:tc>
+        <w:tc>
+          <w:tcPr/>
+          <w:p>
+            <w:pPr>
+              <w:pStyle w:val="Compact"/>
+              <w:jc w:val="right"/>
+            </w:pPr>
+            <w:r>
+              <w:rPr>
+                <w:bCs/>
+                <w:b/>
+              </w:rPr>
+              <w:t xml:space="preserve">6 / 11</w:t>
+            </w:r>
+          </w:p>
+        </w:tc>
+        <w:tc>
+          <w:tcPr/>
+          <w:p>
+            <w:pPr>
+              <w:pStyle w:val="Compact"/>
+              <w:jc w:val="right"/>
+            </w:pPr>
+            <w:r>
+              <w:t xml:space="preserve">22.98 ± 2.74</w:t>
+            </w:r>
+          </w:p>
+        </w:tc>
+        <w:tc>
+          <w:tcPr/>
+          <w:p>
+            <w:pPr>
+              <w:pStyle w:val="Compact"/>
+              <w:jc w:val="right"/>
+            </w:pPr>
+            <w:r>
+              <w:t xml:space="preserve">0.837 ± 0.060</w:t>
+            </w:r>
+          </w:p>
+        </w:tc>
+        <w:tc>
+          <w:tcPr/>
+          <w:p>
+            <w:pPr>
+              <w:pStyle w:val="Compact"/>
+              <w:jc w:val="right"/>
+            </w:pPr>
+            <w:r>
+              <w:t xml:space="preserve">0.14 (p95 0.53)</w:t>
+            </w:r>
+          </w:p>
+        </w:tc>
+        <w:tc>
+          <w:tcPr/>
+          <w:p>
+            <w:pPr>
+              <w:pStyle w:val="Compact"/>
+              <w:jc w:val="right"/>
+            </w:pPr>
+            <w:r>
+              <w:t xml:space="preserve">14.6 s</w:t>
+            </w:r>
+          </w:p>
+        </w:tc>
+      </w:tr>
+      <w:tr>
+        <w:tc>
+          <w:tcPr/>
+          <w:p>
+            <w:pPr>
+              <w:pStyle w:val="Compact"/>
+              <w:jc w:val="left"/>
+            </w:pPr>
+            <w:r>
+              <w:t xml:space="preserve">Reprojection (pose known)</w:t>
+            </w:r>
+          </w:p>
+        </w:tc>
+        <w:tc>
+          <w:tcPr/>
+          <w:p>
+            <w:pPr>
+              <w:pStyle w:val="Compact"/>
+              <w:jc w:val="right"/>
+            </w:pPr>
+            <w:r>
+              <w:t xml:space="preserve">11 / 11</w:t>
+            </w:r>
+          </w:p>
+        </w:tc>
+        <w:tc>
+          <w:tcPr/>
+          <w:p>
+            <w:pPr>
+              <w:pStyle w:val="Compact"/>
+              <w:jc w:val="right"/>
+            </w:pPr>
+            <w:r>
+              <w:rPr>
+                <w:bCs/>
+                <w:b/>
+              </w:rPr>
+              <w:t xml:space="preserve">11 / 11</w:t>
+            </w:r>
+          </w:p>
+        </w:tc>
+        <w:tc>
+          <w:tcPr/>
+          <w:p>
+            <w:pPr>
+              <w:pStyle w:val="Compact"/>
+              <w:jc w:val="right"/>
+            </w:pPr>
+            <w:r>
+              <w:rPr>
+                <w:bCs/>
+                <w:b/>
+              </w:rPr>
+              <w:t xml:space="preserve">26.87 ± 1.96</w:t>
+            </w:r>
+          </w:p>
+        </w:tc>
+        <w:tc>
+          <w:tcPr/>
+          <w:p>
+            <w:pPr>
+              <w:pStyle w:val="Compact"/>
+              <w:jc w:val="right"/>
+            </w:pPr>
+            <w:r>
+              <w:rPr>
+                <w:bCs/>
+                <w:b/>
+              </w:rPr>
+              <w:t xml:space="preserve">0.886 ± 0.039</w:t>
+            </w:r>
+          </w:p>
+        </w:tc>
+        <w:tc>
+          <w:tcPr/>
+          <w:p>
+            <w:pPr>
+              <w:pStyle w:val="Compact"/>
+              <w:jc w:val="right"/>
+            </w:pPr>
+            <w:r>
+              <w:rPr>
+                <w:bCs/>
+                <w:b/>
+              </w:rPr>
+              <w:t xml:space="preserve">0.10 (p95 0.23)</w:t>
+            </w:r>
+          </w:p>
+        </w:tc>
+        <w:tc>
+          <w:tcPr/>
+          <w:p>
+            <w:pPr>
+              <w:pStyle w:val="Compact"/>
+              <w:jc w:val="right"/>
+            </w:pPr>
+            <w:r>
+              <w:t xml:space="preserve">2.1 s</w:t>
+            </w:r>
+          </w:p>
+        </w:tc>
+      </w:tr>
+    </w:tbl>
     <w:p>
       <w:pPr>
         <w:pStyle w:val="BodyText"/>
       </w:pPr>
       <w:r>
-        <w:t xml:space="preserve">[13] Roussel, J.-R., et al. (2020). lidR: An R package for analysis of Airborne</w:t>
-      </w:r>
-      <w:r>
-        <w:t xml:space="preserve"> </w:t>
-      </w:r>
-      <w:r>
-        <w:t xml:space="preserve">Laser Scanning (ALS) data.</w:t>
+        <w:t xml:space="preserve">Aggregate figures refer to the</w:t>
       </w:r>
       <w:r>
         <w:t xml:space="preserve"> </w:t>
@@ -4186,19 +4675,25 @@
           <w:iCs/>
           <w:i/>
         </w:rPr>
-        <w:t xml:space="preserve">Remote Sensing of Environment</w:t>
-      </w:r>
-      <w:r>
-        <w:t xml:space="preserve"> </w:t>
-      </w:r>
-      <w:r>
-        <w:t xml:space="preserve">251, 112061.</w:t>
-      </w:r>
-      <w:r>
-        <w:t xml:space="preserve"> </w:t>
-      </w:r>
-      <w:r>
-        <w:t xml:space="preserve">https://doi.org/10.1016/j.rse.2020.112061</w:t>
+        <w:t xml:space="preserve">usable</w:t>
+      </w:r>
+      <w:r>
+        <w:t xml:space="preserve"> </w:t>
+      </w:r>
+      <w:r>
+        <w:t xml:space="preserve">runs; the two misregistered stitches</w:t>
+      </w:r>
+      <w:r>
+        <w:t xml:space="preserve"> </w:t>
+      </w:r>
+      <w:r>
+        <w:t xml:space="preserve">(8.6 and 11.7 dB) are excluded because they would otherwise dominate mean and</w:t>
+      </w:r>
+      <w:r>
+        <w:t xml:space="preserve"> </w:t>
+      </w:r>
+      <w:r>
+        <w:t xml:space="preserve">spread, and are reported separately below.</w:t>
       </w:r>
     </w:p>
     <w:p>
@@ -4206,77 +4701,1152 @@
         <w:pStyle w:val="BodyText"/>
       </w:pPr>
       <w:r>
-        <w:t xml:space="preserve">[14] Zhang, W., et al. (2016). An easy-to-use airborne LiDAR data filtering method</w:t>
-      </w:r>
-      <w:r>
-        <w:t xml:space="preserve"> </w:t>
-      </w:r>
-      <w:r>
-        <w:t xml:space="preserve">based on cloth simulation.</w:t>
-      </w:r>
-      <w:r>
-        <w:t xml:space="preserve"> </w:t>
-      </w:r>
+        <w:t xml:space="preserve">The pose-based branch is better on every measure (+3.9 dB, +0.05 SSIM, a third</w:t>
+      </w:r>
+      <w:r>
+        <w:t xml:space="preserve"> </w:t>
+      </w:r>
+      <w:r>
+        <w:t xml:space="preserve">less local displacement) and reconstructs all eleven scenes, while stitching fails</w:t>
+      </w:r>
+      <w:r>
+        <w:t xml:space="preserve"> </w:t>
+      </w:r>
+      <w:r>
+        <w:t xml:space="preserve">on five: three times</w:t>
+      </w:r>
+      <w:r>
+        <w:t xml:space="preserve"> </w:t>
+      </w:r>
+      <w:r>
+        <w:rPr>
+          <w:rStyle w:val="VerbatimChar"/>
+        </w:rPr>
+        <w:t xml:space="preserve">enblend</w:t>
+      </w:r>
+      <w:r>
+        <w:t xml:space="preserve"> </w:t>
+      </w:r>
+      <w:r>
+        <w:t xml:space="preserve">aborts (excessive overlap, degenerate mask</w:t>
+      </w:r>
+      <w:r>
+        <w:t xml:space="preserve"> </w:t>
+      </w:r>
+      <w:r>
+        <w:t xml:space="preserve">geometry, no detectable seam) and twice a geometrically wrong panorama results</w:t>
+      </w:r>
+      <w:r>
+        <w:t xml:space="preserve"> </w:t>
+      </w:r>
+      <w:r>
+        <w:t xml:space="preserve">(confirmed under exhaustive search over rotation, tilt, and mirroring, staying</w:t>
+      </w:r>
+      <w:r>
+        <w:t xml:space="preserve"> </w:t>
+      </w:r>
+      <w:r>
+        <w:t xml:space="preserve">below 11.7 dB).</w:t>
+      </w:r>
+    </w:p>
+    <w:p>
+      <w:pPr>
+        <w:pStyle w:val="CaptionedFigure"/>
+      </w:pPr>
+      <w:r>
+        <w:drawing>
+          <wp:inline>
+            <wp:extent cx="5334000" cy="2255553"/>
+            <wp:effectExtent b="0" l="0" r="0" t="0"/>
+            <wp:docPr descr="Figure 2. Panorama evaluation against eleven CC0 references. The pose-based branch is more accurate and reconstructs every scene; the seam offset separates good from failed reconstructions by a factor of ~40 and is therefore usable as a ground-truth-free quality flag. Real captures with parallax lie ~56× above the synthetic case, which makes the synthetic figures a lower bound." title="" id="40" name="Picture"/>
+            <a:graphic>
+              <a:graphicData uri="http://schemas.openxmlformats.org/drawingml/2006/picture">
+                <pic:pic>
+                  <pic:nvPicPr>
+                    <pic:cNvPr descr="figures/fig2_evaluation.png" id="41" name="Picture"/>
+                    <pic:cNvPicPr>
+                      <a:picLocks noChangeArrowheads="1" noChangeAspect="1"/>
+                    </pic:cNvPicPr>
+                  </pic:nvPicPr>
+                  <pic:blipFill>
+                    <a:blip r:embed="rId29"/>
+                    <a:stretch>
+                      <a:fillRect/>
+                    </a:stretch>
+                  </pic:blipFill>
+                  <pic:spPr bwMode="auto">
+                    <a:xfrm>
+                      <a:off x="0" y="0"/>
+                      <a:ext cx="5334000" cy="2255553"/>
+                    </a:xfrm>
+                    <a:prstGeom prst="rect">
+                      <a:avLst/>
+                    </a:prstGeom>
+                    <a:noFill/>
+                    <a:ln w="9525">
+                      <a:noFill/>
+                      <a:headEnd/>
+                      <a:tailEnd/>
+                    </a:ln>
+                  </pic:spPr>
+                </pic:pic>
+              </a:graphicData>
+            </a:graphic>
+          </wp:inline>
+        </w:drawing>
+      </w:r>
+    </w:p>
+    <w:p>
+      <w:pPr>
+        <w:pStyle w:val="ImageCaption"/>
+      </w:pPr>
+      <w:r>
+        <w:rPr>
+          <w:bCs/>
+          <w:b/>
+        </w:rPr>
+        <w:t xml:space="preserve">Figure 2.</w:t>
+      </w:r>
+      <w:r>
+        <w:t xml:space="preserve"> </w:t>
+      </w:r>
+      <w:r>
+        <w:t xml:space="preserve">Panorama evaluation against eleven CC0 references. The pose-based</w:t>
+      </w:r>
+      <w:r>
+        <w:t xml:space="preserve"> </w:t>
+      </w:r>
+      <w:r>
+        <w:t xml:space="preserve">branch is more accurate and reconstructs every scene; the seam offset separates</w:t>
+      </w:r>
+      <w:r>
+        <w:t xml:space="preserve"> </w:t>
+      </w:r>
+      <w:r>
+        <w:t xml:space="preserve">good from failed reconstructions by a factor of ~40 and is therefore usable as a</w:t>
+      </w:r>
+      <w:r>
+        <w:t xml:space="preserve"> </w:t>
+      </w:r>
+      <w:r>
+        <w:t xml:space="preserve">ground-truth-free quality flag. Real captures with parallax lie ~56× above the</w:t>
+      </w:r>
+      <w:r>
+        <w:t xml:space="preserve"> </w:t>
+      </w:r>
+      <w:r>
+        <w:t xml:space="preserve">synthetic case, which makes the synthetic figures a lower bound.</w:t>
+      </w:r>
+    </w:p>
+    <w:p>
+      <w:pPr>
+        <w:pStyle w:val="BodyText"/>
+      </w:pPr>
+      <w:r>
+        <w:rPr>
+          <w:bCs/>
+          <w:b/>
+        </w:rPr>
+        <w:t xml:space="preserve">Seam offset as an automatic quality flag.</w:t>
+      </w:r>
+      <w:r>
+        <w:t xml:space="preserve"> </w:t>
+      </w:r>
+      <w:r>
+        <w:t xml:space="preserve">Block-wise phase correlation [9] against</w:t>
+      </w:r>
+      <w:r>
+        <w:t xml:space="preserve"> </w:t>
+      </w:r>
+      <w:r>
+        <w:t xml:space="preserve">the reference (64-px blocks, 50% overlap, low-structure blocks discarded)</w:t>
+      </w:r>
+      <w:r>
+        <w:t xml:space="preserve"> </w:t>
+      </w:r>
+      <w:r>
+        <w:t xml:space="preserve">separates good from failed reconstructions more sharply than PSNR or SSIM: median</w:t>
+      </w:r>
+      <w:r>
+        <w:t xml:space="preserve"> </w:t>
+      </w:r>
+      <w:r>
+        <w:t xml:space="preserve">seam offset 0.11–0.19 px (good stitches) and 0.07–0.13 px (reprojection) versus</w:t>
+      </w:r>
+      <w:r>
+        <w:t xml:space="preserve"> </w:t>
+      </w:r>
+      <w:r>
+        <w:t xml:space="preserve">5.95–6.14 px (failed stitches) — a factor of ~40, interpretable without knowing</w:t>
+      </w:r>
+      <w:r>
+        <w:t xml:space="preserve"> </w:t>
+      </w:r>
+      <w:r>
+        <w:t xml:space="preserve">the ground truth of a single scene, and thus a robust threshold (here &gt; 1 px</w:t>
+      </w:r>
+      <w:r>
+        <w:t xml:space="preserve"> </w:t>
+      </w:r>
+      <w:r>
+        <w:t xml:space="preserve">median) for a GUI quality flag.</w:t>
+      </w:r>
+    </w:p>
+    <w:bookmarkStart w:id="42" w:name="Xdd2eeefe0fa72e9ff9dff604cfb03bd70b719e9"/>
+    <w:p>
+      <w:pPr>
+        <w:pStyle w:val="Heading3"/>
+      </w:pPr>
+      <w:r>
+        <w:t xml:space="preserve">Real captures: the actual cost of parallax</w:t>
+      </w:r>
+    </w:p>
+    <w:p>
+      <w:pPr>
+        <w:pStyle w:val="FirstParagraph"/>
+      </w:pPr>
+      <w:r>
+        <w:t xml:space="preserve">The caveat that the synthetic figures are upper bounds can be resolved with open</w:t>
+      </w:r>
+      <w:r>
+        <w:t xml:space="preserve"> </w:t>
+      </w:r>
+      <w:r>
+        <w:t xml:space="preserve">data.</w:t>
+      </w:r>
+      <w:r>
+        <w:t xml:space="preserve"> </w:t>
+      </w:r>
+      <w:r>
+        <w:rPr>
+          <w:rStyle w:val="VerbatimChar"/>
+        </w:rPr>
+        <w:t xml:space="preserve">eval_seams.py</w:t>
+      </w:r>
+      <w:r>
+        <w:t xml:space="preserve"> </w:t>
+      </w:r>
+      <w:r>
+        <w:t xml:space="preserve">measures seam offset</w:t>
+      </w:r>
+      <w:r>
+        <w:t xml:space="preserve"> </w:t>
+      </w:r>
+      <w:r>
+        <w:rPr>
+          <w:bCs/>
+          <w:b/>
+        </w:rPr>
+        <w:t xml:space="preserve">without a reference panorama</w:t>
+      </w:r>
+      <w:r>
+        <w:t xml:space="preserve">:</w:t>
+      </w:r>
+      <w:r>
+        <w:t xml:space="preserve"> </w:t>
+      </w:r>
+      <w:r>
+        <w:rPr>
+          <w:rStyle w:val="VerbatimChar"/>
+        </w:rPr>
+        <w:t xml:space="preserve">nona</w:t>
+      </w:r>
+      <w:r>
+        <w:t xml:space="preserve"> </w:t>
+      </w:r>
+      <w:r>
+        <w:t xml:space="preserve">remaps each capture separately into the panorama canvas, and in the</w:t>
+      </w:r>
+      <w:r>
+        <w:t xml:space="preserve"> </w:t>
+      </w:r>
+      <w:r>
+        <w:t xml:space="preserve">overlaps two source images show the same viewing direction — with perfect</w:t>
+      </w:r>
+      <w:r>
+        <w:t xml:space="preserve"> </w:t>
+      </w:r>
+      <w:r>
+        <w:t xml:space="preserve">registration and rotation about the nodal point they would be identical there.</w:t>
+      </w:r>
+      <w:r>
+        <w:t xml:space="preserve"> </w:t>
+      </w:r>
+      <w:r>
+        <w:t xml:space="preserve">Their local displacement is the error.</w:t>
+      </w:r>
+    </w:p>
+    <w:p>
+      <w:pPr>
+        <w:pStyle w:val="BodyText"/>
+      </w:pPr>
+      <w:r>
+        <w:t xml:space="preserve">The real capture is</w:t>
+      </w:r>
+      <w:r>
+        <w:t xml:space="preserve"> </w:t>
+      </w:r>
+      <w:r>
+        <w:rPr>
+          <w:bCs/>
+          <w:b/>
+        </w:rPr>
+        <w:t xml:space="preserve">PASSTA LunchRoom</w:t>
+      </w:r>
+      <w:r>
+        <w:t xml:space="preserve"> </w:t>
+      </w:r>
+      <w:r>
+        <w:t xml:space="preserve">[10] (Zenodo, CC BY 4.0): 72 photographs from</w:t>
+      </w:r>
+      <w:r>
+        <w:t xml:space="preserve"> </w:t>
+      </w:r>
+      <w:r>
+        <w:t xml:space="preserve">a rotating Canon EOS 70D with supplied calibration. As a control, synthetic</w:t>
+      </w:r>
+      <w:r>
+        <w:t xml:space="preserve"> </w:t>
+      </w:r>
+      <w:r>
+        <w:t xml:space="preserve">captures with</w:t>
+      </w:r>
+      <w:r>
+        <w:t xml:space="preserve"> </w:t>
+      </w:r>
+      <w:r>
+        <w:rPr>
+          <w:bCs/>
+          <w:b/>
+        </w:rPr>
+        <w:t xml:space="preserve">identical geometry</w:t>
+      </w:r>
+      <w:r>
+        <w:t xml:space="preserve"> </w:t>
+      </w:r>
+      <w:r>
+        <w:t xml:space="preserve">are rendered from a CC0 panorama — 18</w:t>
+      </w:r>
+      <w:r>
+        <w:t xml:space="preserve"> </w:t>
+      </w:r>
+      <w:r>
+        <w:t xml:space="preserve">positions, 93.6° rectilinear, same stitching chain, same canvas width. The only</w:t>
+      </w:r>
+      <w:r>
+        <w:t xml:space="preserve"> </w:t>
+      </w:r>
+      <w:r>
+        <w:t xml:space="preserve">difference is that the real captures carry genuine parallax, sensor noise, and</w:t>
+      </w:r>
+      <w:r>
+        <w:t xml:space="preserve"> </w:t>
+      </w:r>
+      <w:r>
+        <w:t xml:space="preserve">exposure differences:</w:t>
+      </w:r>
+    </w:p>
+    <w:tbl>
+      <w:tblPr>
+        <w:tblStyle w:val="Table"/>
+        <w:tblW w:type="auto" w:w="0"/>
+        <w:tblLook w:firstRow="1" w:lastRow="0" w:firstColumn="0" w:lastColumn="0" w:noHBand="0" w:noVBand="0" w:val="0020"/>
+        <w:jc w:val="start"/>
+      </w:tblPr>
+      <w:tblGrid>
+        <w:gridCol w:w="2640"/>
+        <w:gridCol w:w="2640"/>
+        <w:gridCol w:w="2640"/>
+      </w:tblGrid>
+      <w:tr>
+        <w:trPr>
+          <w:tblHeader w:val="true"/>
+        </w:trPr>
+        <w:tc>
+          <w:tcPr/>
+          <w:p>
+            <w:pPr>
+              <w:pStyle w:val="Compact"/>
+            </w:pPr>
+          </w:p>
+        </w:tc>
+        <w:tc>
+          <w:tcPr/>
+          <w:p>
+            <w:pPr>
+              <w:pStyle w:val="Compact"/>
+              <w:jc w:val="right"/>
+            </w:pPr>
+            <w:r>
+              <w:t xml:space="preserve">synthetic (parallax-free)</w:t>
+            </w:r>
+          </w:p>
+        </w:tc>
+        <w:tc>
+          <w:tcPr/>
+          <w:p>
+            <w:pPr>
+              <w:pStyle w:val="Compact"/>
+              <w:jc w:val="right"/>
+            </w:pPr>
+            <w:r>
+              <w:t xml:space="preserve">real (rotating camera)</w:t>
+            </w:r>
+          </w:p>
+        </w:tc>
+      </w:tr>
+      <w:tr>
+        <w:tc>
+          <w:tcPr/>
+          <w:p>
+            <w:pPr>
+              <w:pStyle w:val="Compact"/>
+              <w:jc w:val="left"/>
+            </w:pPr>
+            <w:r>
+              <w:t xml:space="preserve">seam offset, median</w:t>
+            </w:r>
+          </w:p>
+        </w:tc>
+        <w:tc>
+          <w:tcPr/>
+          <w:p>
+            <w:pPr>
+              <w:pStyle w:val="Compact"/>
+              <w:jc w:val="right"/>
+            </w:pPr>
+            <w:r>
+              <w:rPr>
+                <w:bCs/>
+                <w:b/>
+              </w:rPr>
+              <w:t xml:space="preserve">0.07 px</w:t>
+            </w:r>
+          </w:p>
+        </w:tc>
+        <w:tc>
+          <w:tcPr/>
+          <w:p>
+            <w:pPr>
+              <w:pStyle w:val="Compact"/>
+              <w:jc w:val="right"/>
+            </w:pPr>
+            <w:r>
+              <w:rPr>
+                <w:bCs/>
+                <w:b/>
+              </w:rPr>
+              <w:t xml:space="preserve">3.95 px</w:t>
+            </w:r>
+          </w:p>
+        </w:tc>
+      </w:tr>
+      <w:tr>
+        <w:tc>
+          <w:tcPr/>
+          <w:p>
+            <w:pPr>
+              <w:pStyle w:val="Compact"/>
+              <w:jc w:val="left"/>
+            </w:pPr>
+            <w:r>
+              <w:t xml:space="preserve">p95</w:t>
+            </w:r>
+          </w:p>
+        </w:tc>
+        <w:tc>
+          <w:tcPr/>
+          <w:p>
+            <w:pPr>
+              <w:pStyle w:val="Compact"/>
+              <w:jc w:val="right"/>
+            </w:pPr>
+            <w:r>
+              <w:t xml:space="preserve">0.18 px</w:t>
+            </w:r>
+          </w:p>
+        </w:tc>
+        <w:tc>
+          <w:tcPr/>
+          <w:p>
+            <w:pPr>
+              <w:pStyle w:val="Compact"/>
+              <w:jc w:val="right"/>
+            </w:pPr>
+            <w:r>
+              <w:t xml:space="preserve">24.78 px</w:t>
+            </w:r>
+          </w:p>
+        </w:tc>
+      </w:tr>
+      <w:tr>
+        <w:tc>
+          <w:tcPr/>
+          <w:p>
+            <w:pPr>
+              <w:pStyle w:val="Compact"/>
+              <w:jc w:val="left"/>
+            </w:pPr>
+            <w:r>
+              <w:t xml:space="preserve">maximum</w:t>
+            </w:r>
+          </w:p>
+        </w:tc>
+        <w:tc>
+          <w:tcPr/>
+          <w:p>
+            <w:pPr>
+              <w:pStyle w:val="Compact"/>
+              <w:jc w:val="right"/>
+            </w:pPr>
+            <w:r>
+              <w:t xml:space="preserve">0.48 px</w:t>
+            </w:r>
+          </w:p>
+        </w:tc>
+        <w:tc>
+          <w:tcPr/>
+          <w:p>
+            <w:pPr>
+              <w:pStyle w:val="Compact"/>
+              <w:jc w:val="right"/>
+            </w:pPr>
+            <w:r>
+              <w:t xml:space="preserve">29.99 px</w:t>
+            </w:r>
+          </w:p>
+        </w:tc>
+      </w:tr>
+      <w:tr>
+        <w:tc>
+          <w:tcPr/>
+          <w:p>
+            <w:pPr>
+              <w:pStyle w:val="Compact"/>
+              <w:jc w:val="left"/>
+            </w:pPr>
+            <w:r>
+              <w:t xml:space="preserve">blocks above 1 px</w:t>
+            </w:r>
+          </w:p>
+        </w:tc>
+        <w:tc>
+          <w:tcPr/>
+          <w:p>
+            <w:pPr>
+              <w:pStyle w:val="Compact"/>
+              <w:jc w:val="right"/>
+            </w:pPr>
+            <w:r>
+              <w:t xml:space="preserve">0.0 %</w:t>
+            </w:r>
+          </w:p>
+        </w:tc>
+        <w:tc>
+          <w:tcPr/>
+          <w:p>
+            <w:pPr>
+              <w:pStyle w:val="Compact"/>
+              <w:jc w:val="right"/>
+            </w:pPr>
+            <w:r>
+              <w:t xml:space="preserve">67.5 %</w:t>
+            </w:r>
+          </w:p>
+        </w:tc>
+      </w:tr>
+    </w:tbl>
+    <w:p>
+      <w:pPr>
+        <w:pStyle w:val="BodyText"/>
+      </w:pPr>
+      <w:r>
+        <w:rPr>
+          <w:bCs/>
+          <w:b/>
+        </w:rPr>
+        <w:t xml:space="preserve">The median is ~56× higher and the 95th percentile ~140×.</w:t>
+      </w:r>
+      <w:r>
+        <w:t xml:space="preserve"> </w:t>
+      </w:r>
+      <w:r>
+        <w:t xml:space="preserve">This substantiates</w:t>
+      </w:r>
+      <w:r>
+        <w:t xml:space="preserve"> </w:t>
+      </w:r>
+      <w:r>
+        <w:t xml:space="preserve">what could previously only be asserted: the synthetic evaluation understates the</w:t>
+      </w:r>
+      <w:r>
+        <w:t xml:space="preserve"> </w:t>
+      </w:r>
+      <w:r>
+        <w:t xml:space="preserve">real stitching error by orders of magnitude, and the gap measured there between</w:t>
+      </w:r>
+      <w:r>
+        <w:t xml:space="preserve"> </w:t>
+      </w:r>
+      <w:r>
+        <w:t xml:space="preserve">the two branches is a</w:t>
+      </w:r>
+      <w:r>
+        <w:t xml:space="preserve"> </w:t>
+      </w:r>
+      <w:r>
+        <w:rPr>
+          <w:bCs/>
+          <w:b/>
+        </w:rPr>
+        <w:t xml:space="preserve">lower bound</w:t>
+      </w:r>
+      <w:r>
+        <w:t xml:space="preserve">.</w:t>
+      </w:r>
+    </w:p>
+    <w:p>
+      <w:pPr>
+        <w:pStyle w:val="BodyText"/>
+      </w:pPr>
       <w:r>
         <w:rPr>
           <w:iCs/>
           <w:i/>
         </w:rPr>
-        <w:t xml:space="preserve">Remote Sensing</w:t>
-      </w:r>
-      <w:r>
-        <w:t xml:space="preserve"> </w:t>
-      </w:r>
-      <w:r>
-        <w:t xml:space="preserve">8(6), 501.</w:t>
-      </w:r>
-      <w:r>
-        <w:t xml:space="preserve"> </w:t>
-      </w:r>
-      <w:r>
-        <w:t xml:space="preserve">https://doi.org/10.3390/rs8060501</w:t>
+        <w:t xml:space="preserve">Interpretation.</w:t>
+      </w:r>
+      <w:r>
+        <w:t xml:space="preserve"> </w:t>
+      </w:r>
+      <w:r>
+        <w:t xml:space="preserve">PASSTA LunchRoom is an indoor scene with nearby objects, and</w:t>
+      </w:r>
+      <w:r>
+        <w:t xml:space="preserve"> </w:t>
+      </w:r>
+      <w:r>
+        <w:t xml:space="preserve">parallax is worst at short range. An outdoor stand with predominantly distant</w:t>
+      </w:r>
+      <w:r>
+        <w:t xml:space="preserve"> </w:t>
+      </w:r>
+      <w:r>
+        <w:t xml:space="preserve">objects will fare better; the 3.95 px is therefore an example of the unfavourable</w:t>
+      </w:r>
+      <w:r>
+        <w:t xml:space="preserve"> </w:t>
+      </w:r>
+      <w:r>
+        <w:t xml:space="preserve">case, not a universal value. Part of the difference also stems from noise and</w:t>
+      </w:r>
+      <w:r>
+        <w:t xml:space="preserve"> </w:t>
+      </w:r>
+      <w:r>
+        <w:t xml:space="preserve">exposure variation rather than parallax alone. The pose-based branch is unaffected</w:t>
+      </w:r>
+      <w:r>
+        <w:t xml:space="preserve"> </w:t>
+      </w:r>
+      <w:r>
+        <w:t xml:space="preserve">by all of this: it has no overlap seams, because every viewing direction comes</w:t>
+      </w:r>
+      <w:r>
+        <w:t xml:space="preserve"> </w:t>
+      </w:r>
+      <w:r>
+        <w:t xml:space="preserve">from exactly one camera.</w:t>
       </w:r>
     </w:p>
     <w:p>
       <w:pPr>
         <w:pStyle w:val="BodyText"/>
       </w:pPr>
-      <w:r>
-        <w:t xml:space="preserve">[15] Brooke, J. (1996). SUS: a</w:t>
-      </w:r>
-      <w:r>
-        <w:t xml:space="preserve"> </w:t>
-      </w:r>
-      <w:r>
-        <w:t xml:space="preserve">“</w:t>
-      </w:r>
-      <w:r>
-        <w:t xml:space="preserve">quick and dirty</w:t>
-      </w:r>
-      <w:r>
-        <w:t xml:space="preserve">”</w:t>
-      </w:r>
-      <w:r>
-        <w:t xml:space="preserve"> </w:t>
-      </w:r>
-      <w:r>
-        <w:t xml:space="preserve">usability scale. In:</w:t>
-      </w:r>
-      <w:r>
-        <w:t xml:space="preserve"> </w:t>
-      </w:r>
       <w:r>
         <w:rPr>
           <w:iCs/>
           <w:i/>
         </w:rPr>
-        <w:t xml:space="preserve">Usability</w:t>
+        <w:t xml:space="preserve">Honesty of the numbers.</w:t>
+      </w:r>
+      <w:r>
+        <w:t xml:space="preserve"> </w:t>
+      </w:r>
+      <w:r>
+        <w:t xml:space="preserve">All synthetic captures share one nodal point; the</w:t>
+      </w:r>
+      <w:r>
+        <w:t xml:space="preserve"> </w:t>
+      </w:r>
+      <w:r>
+        <w:t xml:space="preserve">PSNR/SSIM stitching figures are therefore</w:t>
+      </w:r>
+      <w:r>
+        <w:t xml:space="preserve"> </w:t>
+      </w:r>
+      <w:r>
+        <w:rPr>
+          <w:bCs/>
+          <w:b/>
+        </w:rPr>
+        <w:t xml:space="preserve">upper bounds</w:t>
+      </w:r>
+      <w:r>
+        <w:t xml:space="preserve">, and the section above</w:t>
+      </w:r>
+      <w:r>
+        <w:t xml:space="preserve"> </w:t>
+      </w:r>
+      <w:r>
+        <w:t xml:space="preserve">quantifies the distance to reality (~56× in median seam offset). No sensor noise, exposure differences, or distortion are simulated — the</w:t>
+      </w:r>
+      <w:r>
+        <w:t xml:space="preserve"> </w:t>
+      </w:r>
+      <w:r>
+        <w:t xml:space="preserve">geometry of the chain is measured, not camera image quality. Absolute PSNR is</w:t>
+      </w:r>
+      <w:r>
+        <w:t xml:space="preserve"> </w:t>
+      </w:r>
+      <w:r>
+        <w:t xml:space="preserve">capped by the resolution chain and is meaningful only in the comparison of the two</w:t>
+      </w:r>
+      <w:r>
+        <w:t xml:space="preserve"> </w:t>
+      </w:r>
+      <w:r>
+        <w:t xml:space="preserve">branches. The reprojection figures hold only since switching to bilinear sampling;</w:t>
+      </w:r>
+      <w:r>
+        <w:t xml:space="preserve"> </w:t>
+      </w:r>
+      <w:r>
+        <w:t xml:space="preserve">with nearest-neighbour sampling the same branch scored 25.4 dB / SSIM 0.871</w:t>
+      </w:r>
+      <w:r>
+        <w:t xml:space="preserve"> </w:t>
+      </w:r>
+      <w:r>
+        <w:t xml:space="preserve">instead of 28.2 / 0.935 (ph-mossy-forest) — an implementation artefact that could</w:t>
+      </w:r>
+      <w:r>
+        <w:t xml:space="preserve"> </w:t>
+      </w:r>
+      <w:r>
+        <w:t xml:space="preserve">have been reported as a property of the method.</w:t>
+      </w:r>
+    </w:p>
+    <w:p>
+      <w:pPr>
+        <w:pStyle w:val="BodyText"/>
+      </w:pPr>
+      <w:r>
+        <w:rPr>
+          <w:bCs/>
+          <w:b/>
+        </w:rPr>
+        <w:t xml:space="preserve">Runtime per input class, end to end.</w:t>
+      </w:r>
+      <w:r>
+        <w:t xml:space="preserve"> </w:t>
+      </w:r>
+      <w:r>
+        <w:t xml:space="preserve">Measured through the running</w:t>
+      </w:r>
+      <w:r>
+        <w:t xml:space="preserve"> </w:t>
+      </w:r>
+      <w:r>
+        <w:t xml:space="preserve">containerized service — upload, queue, processing, and publication included — with</w:t>
+      </w:r>
+      <w:r>
+        <w:t xml:space="preserve"> </w:t>
+      </w:r>
+      <w:r>
+        <w:t xml:space="preserve">the input type</w:t>
+      </w:r>
+      <w:r>
+        <w:t xml:space="preserve"> </w:t>
       </w:r>
       <w:r>
         <w:rPr>
           <w:iCs/>
           <w:i/>
         </w:rPr>
+        <w:t xml:space="preserve">not</w:t>
+      </w:r>
+      <w:r>
+        <w:t xml:space="preserve"> </w:t>
+      </w:r>
+      <w:r>
+        <w:t xml:space="preserve">declared, so the chain detects it itself:</w:t>
+      </w:r>
+    </w:p>
+    <w:tbl>
+      <w:tblPr>
+        <w:tblStyle w:val="Table"/>
+        <w:tblW w:type="pct" w:w="5000"/>
+        <w:tblLook w:firstRow="1" w:lastRow="0" w:firstColumn="0" w:lastColumn="0" w:noHBand="0" w:noVBand="0" w:val="0020"/>
+        <w:jc w:val="start"/>
+      </w:tblPr>
+      <w:tblGrid>
+        <w:gridCol w:w="1320"/>
+        <w:gridCol w:w="1320"/>
+        <w:gridCol w:w="1320"/>
+        <w:gridCol w:w="1320"/>
+        <w:gridCol w:w="1320"/>
+        <w:gridCol w:w="1320"/>
+      </w:tblGrid>
+      <w:tr>
+        <w:trPr>
+          <w:tblHeader w:val="true"/>
+        </w:trPr>
+        <w:tc>
+          <w:tcPr/>
+          <w:p>
+            <w:pPr>
+              <w:pStyle w:val="Compact"/>
+              <w:jc w:val="left"/>
+            </w:pPr>
+            <w:r>
+              <w:t xml:space="preserve">Input class</w:t>
+            </w:r>
+          </w:p>
+        </w:tc>
+        <w:tc>
+          <w:tcPr/>
+          <w:p>
+            <w:pPr>
+              <w:pStyle w:val="Compact"/>
+              <w:jc w:val="right"/>
+            </w:pPr>
+            <w:r>
+              <w:t xml:space="preserve">captures</w:t>
+            </w:r>
+          </w:p>
+        </w:tc>
+        <w:tc>
+          <w:tcPr/>
+          <w:p>
+            <w:pPr>
+              <w:pStyle w:val="Compact"/>
+              <w:jc w:val="right"/>
+            </w:pPr>
+            <w:r>
+              <w:t xml:space="preserve">input</w:t>
+            </w:r>
+          </w:p>
+        </w:tc>
+        <w:tc>
+          <w:tcPr/>
+          <w:p>
+            <w:pPr>
+              <w:pStyle w:val="Compact"/>
+              <w:jc w:val="right"/>
+            </w:pPr>
+            <w:r>
+              <w:t xml:space="preserve">upload</w:t>
+            </w:r>
+          </w:p>
+        </w:tc>
+        <w:tc>
+          <w:tcPr/>
+          <w:p>
+            <w:pPr>
+              <w:pStyle w:val="Compact"/>
+              <w:jc w:val="right"/>
+            </w:pPr>
+            <w:r>
+              <w:t xml:space="preserve">processing</w:t>
+            </w:r>
+          </w:p>
+        </w:tc>
+        <w:tc>
+          <w:tcPr/>
+          <w:p>
+            <w:pPr>
+              <w:pStyle w:val="Compact"/>
+              <w:jc w:val="right"/>
+            </w:pPr>
+            <w:r>
+              <w:rPr>
+                <w:bCs/>
+                <w:b/>
+              </w:rPr>
+              <w:t xml:space="preserve">total</w:t>
+            </w:r>
+          </w:p>
+        </w:tc>
+      </w:tr>
+      <w:tr>
+        <w:tc>
+          <w:tcPr/>
+          <w:p>
+            <w:pPr>
+              <w:pStyle w:val="Compact"/>
+              <w:jc w:val="left"/>
+            </w:pPr>
+            <w:r>
+              <w:t xml:space="preserve">Consumer 360° (finished equirect)</w:t>
+            </w:r>
+          </w:p>
+        </w:tc>
+        <w:tc>
+          <w:tcPr/>
+          <w:p>
+            <w:pPr>
+              <w:pStyle w:val="Compact"/>
+              <w:jc w:val="right"/>
+            </w:pPr>
+            <w:r>
+              <w:t xml:space="preserve">1</w:t>
+            </w:r>
+          </w:p>
+        </w:tc>
+        <w:tc>
+          <w:tcPr/>
+          <w:p>
+            <w:pPr>
+              <w:pStyle w:val="Compact"/>
+              <w:jc w:val="right"/>
+            </w:pPr>
+            <w:r>
+              <w:t xml:space="preserve">2.5 MB</w:t>
+            </w:r>
+          </w:p>
+        </w:tc>
+        <w:tc>
+          <w:tcPr/>
+          <w:p>
+            <w:pPr>
+              <w:pStyle w:val="Compact"/>
+              <w:jc w:val="right"/>
+            </w:pPr>
+            <w:r>
+              <w:t xml:space="preserve">0.2 s</w:t>
+            </w:r>
+          </w:p>
+        </w:tc>
+        <w:tc>
+          <w:tcPr/>
+          <w:p>
+            <w:pPr>
+              <w:pStyle w:val="Compact"/>
+              <w:jc w:val="right"/>
+            </w:pPr>
+            <w:r>
+              <w:t xml:space="preserve">2.0 s</w:t>
+            </w:r>
+          </w:p>
+        </w:tc>
+        <w:tc>
+          <w:tcPr/>
+          <w:p>
+            <w:pPr>
+              <w:pStyle w:val="Compact"/>
+              <w:jc w:val="right"/>
+            </w:pPr>
+            <w:r>
+              <w:rPr>
+                <w:bCs/>
+                <w:b/>
+              </w:rPr>
+              <w:t xml:space="preserve">2.2 s</w:t>
+            </w:r>
+          </w:p>
+        </w:tc>
+      </w:tr>
+      <w:tr>
+        <w:tc>
+          <w:tcPr/>
+          <w:p>
+            <w:pPr>
+              <w:pStyle w:val="Compact"/>
+              <w:jc w:val="left"/>
+            </w:pPr>
+            <w:r>
+              <w:t xml:space="preserve">DSLR/fisheye (stitching)</w:t>
+            </w:r>
+          </w:p>
+        </w:tc>
+        <w:tc>
+          <w:tcPr/>
+          <w:p>
+            <w:pPr>
+              <w:pStyle w:val="Compact"/>
+              <w:jc w:val="right"/>
+            </w:pPr>
+            <w:r>
+              <w:t xml:space="preserve">18</w:t>
+            </w:r>
+          </w:p>
+        </w:tc>
+        <w:tc>
+          <w:tcPr/>
+          <w:p>
+            <w:pPr>
+              <w:pStyle w:val="Compact"/>
+              <w:jc w:val="right"/>
+            </w:pPr>
+            <w:r>
+              <w:t xml:space="preserve">6.9 MB</w:t>
+            </w:r>
+          </w:p>
+        </w:tc>
+        <w:tc>
+          <w:tcPr/>
+          <w:p>
+            <w:pPr>
+              <w:pStyle w:val="Compact"/>
+              <w:jc w:val="right"/>
+            </w:pPr>
+            <w:r>
+              <w:t xml:space="preserve">0.4 s</w:t>
+            </w:r>
+          </w:p>
+        </w:tc>
+        <w:tc>
+          <w:tcPr/>
+          <w:p>
+            <w:pPr>
+              <w:pStyle w:val="Compact"/>
+              <w:jc w:val="right"/>
+            </w:pPr>
+            <w:r>
+              <w:t xml:space="preserve">69.3 s</w:t>
+            </w:r>
+          </w:p>
+        </w:tc>
+        <w:tc>
+          <w:tcPr/>
+          <w:p>
+            <w:pPr>
+              <w:pStyle w:val="Compact"/>
+              <w:jc w:val="right"/>
+            </w:pPr>
+            <w:r>
+              <w:rPr>
+                <w:bCs/>
+                <w:b/>
+              </w:rPr>
+              <w:t xml:space="preserve">69.7 s</w:t>
+            </w:r>
+          </w:p>
+        </w:tc>
+      </w:tr>
+      <w:tr>
+        <w:tc>
+          <w:tcPr/>
+          <w:p>
+            <w:pPr>
+              <w:pStyle w:val="Compact"/>
+              <w:jc w:val="left"/>
+            </w:pPr>
+            <w:r>
+              <w:t xml:space="preserve">TLS scan (E57, reprojection)</w:t>
+            </w:r>
+          </w:p>
+        </w:tc>
+        <w:tc>
+          <w:tcPr/>
+          <w:p>
+            <w:pPr>
+              <w:pStyle w:val="Compact"/>
+              <w:jc w:val="right"/>
+            </w:pPr>
+            <w:r>
+              <w:t xml:space="preserve">1</w:t>
+            </w:r>
+          </w:p>
+        </w:tc>
+        <w:tc>
+          <w:tcPr/>
+          <w:p>
+            <w:pPr>
+              <w:pStyle w:val="Compact"/>
+              <w:jc w:val="right"/>
+            </w:pPr>
+            <w:r>
+              <w:t xml:space="preserve">177.9 MB</w:t>
+            </w:r>
+          </w:p>
+        </w:tc>
+        <w:tc>
+          <w:tcPr/>
+          <w:p>
+            <w:pPr>
+              <w:pStyle w:val="Compact"/>
+              <w:jc w:val="right"/>
+            </w:pPr>
+            <w:r>
+              <w:t xml:space="preserve">4.8 s</w:t>
+            </w:r>
+          </w:p>
+        </w:tc>
+        <w:tc>
+          <w:tcPr/>
+          <w:p>
+            <w:pPr>
+              <w:pStyle w:val="Compact"/>
+              <w:jc w:val="right"/>
+            </w:pPr>
+            <w:r>
+              <w:t xml:space="preserve">27.7 s</w:t>
+            </w:r>
+          </w:p>
+        </w:tc>
+        <w:tc>
+          <w:tcPr/>
+          <w:p>
+            <w:pPr>
+              <w:pStyle w:val="Compact"/>
+              <w:jc w:val="right"/>
+            </w:pPr>
+            <w:r>
+              <w:rPr>
+                <w:bCs/>
+                <w:b/>
+              </w:rPr>
+              <w:t xml:space="preserve">32.5 s</w:t>
+            </w:r>
+          </w:p>
+        </w:tc>
+      </w:tr>
+    </w:tbl>
+    <w:p>
+      <w:pPr>
+        <w:pStyle w:val="BodyText"/>
+      </w:pPr>
+      <w:r>
+        <w:t xml:space="preserve">(Medians of two runs each, consumer CPU.) The input class was detected correctly</w:t>
+      </w:r>
+      <w:r>
+        <w:t xml:space="preserve"> </w:t>
+      </w:r>
+      <w:r>
+        <w:t xml:space="preserve">in all six runs — an independent confirmation of the dispatch described in</w:t>
+      </w:r>
+      <w:r>
+        <w:t xml:space="preserve"> </w:t>
+      </w:r>
+      <w:r>
+        <w:t xml:space="preserve">Section 2.1. Note that the most expensive case is not the largest dataset: the</w:t>
+      </w:r>
+      <w:r>
+        <w:t xml:space="preserve"> </w:t>
+      </w:r>
+      <w:r>
+        <w:t xml:space="preserve">178 MB scan finishes in 32 s while 6.9 MB of individual frames take 70 s. Cost</w:t>
+      </w:r>
+      <w:r>
+        <w:t xml:space="preserve"> </w:t>
+      </w:r>
+      <w:r>
+        <w:t xml:space="preserve">comes from</w:t>
+      </w:r>
+      <w:r>
         <w:t xml:space="preserve"> </w:t>
       </w:r>
       <w:r>
@@ -4284,18 +5854,351 @@
           <w:iCs/>
           <w:i/>
         </w:rPr>
-        <w:t xml:space="preserve">Evaluation in Industry</w:t>
-      </w:r>
-      <w:r>
-        <w:t xml:space="preserve">, Taylor &amp; Francis, 189–194.</w:t>
-      </w:r>
-    </w:p>
-    <w:p>
-      <w:pPr>
-        <w:pStyle w:val="BodyText"/>
-      </w:pPr>
-      <w:r>
-        <w:t xml:space="preserve">[16] Sauro, J., Lewis, J. R. (2016).</w:t>
+        <w:t xml:space="preserve">registration</w:t>
+      </w:r>
+      <w:r>
+        <w:t xml:space="preserve">, not data volume — precisely what pose-based</w:t>
+      </w:r>
+      <w:r>
+        <w:t xml:space="preserve"> </w:t>
+      </w:r>
+      <w:r>
+        <w:t xml:space="preserve">reprojection avoids. No manual intervention was required in any class.</w:t>
+      </w:r>
+    </w:p>
+    <w:bookmarkEnd w:id="42"/>
+    <w:bookmarkEnd w:id="43"/>
+    <w:bookmarkStart w:id="44" w:name="impact-1"/>
+    <w:p>
+      <w:pPr>
+        <w:pStyle w:val="Heading2"/>
+      </w:pPr>
+      <w:r>
+        <w:t xml:space="preserve">4. Impact</w:t>
+      </w:r>
+    </w:p>
+    <w:p>
+      <w:pPr>
+        <w:pStyle w:val="FirstParagraph"/>
+      </w:pPr>
+      <w:r>
+        <w:t xml:space="preserve">The tool makes reproducible, self-hosted 360°/3D documentation accessible without</w:t>
+      </w:r>
+      <w:r>
+        <w:t xml:space="preserve"> </w:t>
+      </w:r>
+      <w:r>
+        <w:t xml:space="preserve">vendor lock-in and across the full device–cost spectrum. Two contributions are of</w:t>
+      </w:r>
+      <w:r>
+        <w:t xml:space="preserve"> </w:t>
+      </w:r>
+      <w:r>
+        <w:t xml:space="preserve">wider use. First, it turns the routinely discarded, pose-bearing scanner RGB</w:t>
+      </w:r>
+      <w:r>
+        <w:t xml:space="preserve"> </w:t>
+      </w:r>
+      <w:r>
+        <w:t xml:space="preserve">images into first-class navigable panoramas and data carriers; the evaluation</w:t>
+      </w:r>
+      <w:r>
+        <w:t xml:space="preserve"> </w:t>
+      </w:r>
+      <w:r>
+        <w:t xml:space="preserve">quantifies why this is preferable when pose is available (seamless, ~7× faster,</w:t>
+      </w:r>
+      <w:r>
+        <w:t xml:space="preserve"> </w:t>
+      </w:r>
+      <w:r>
+        <w:t xml:space="preserve">no stitching failures). Second, the seam-offset metric provides a ground-truth-free</w:t>
+      </w:r>
+      <w:r>
+        <w:t xml:space="preserve"> </w:t>
+      </w:r>
+      <w:r>
+        <w:t xml:space="preserve">quality signal that can gate automated batch processing. For environmental and</w:t>
+      </w:r>
+      <w:r>
+        <w:t xml:space="preserve"> </w:t>
+      </w:r>
+      <w:r>
+        <w:t xml:space="preserve">forest monitoring specifically, the enrichment path couples a walkable visual</w:t>
+      </w:r>
+      <w:r>
+        <w:t xml:space="preserve"> </w:t>
+      </w:r>
+      <w:r>
+        <w:t xml:space="preserve">record with quantitative inventory on the same acquisition, supporting</w:t>
+      </w:r>
+      <w:r>
+        <w:t xml:space="preserve"> </w:t>
+      </w:r>
+      <w:r>
+        <w:t xml:space="preserve">communication and revisitation of plots.</w:t>
+      </w:r>
+    </w:p>
+    <w:bookmarkEnd w:id="44"/>
+    <w:bookmarkStart w:id="45" w:name="conclusions-1"/>
+    <w:p>
+      <w:pPr>
+        <w:pStyle w:val="Heading2"/>
+      </w:pPr>
+      <w:r>
+        <w:t xml:space="preserve">5. Conclusions</w:t>
+      </w:r>
+    </w:p>
+    <w:p>
+      <w:pPr>
+        <w:pStyle w:val="FirstParagraph"/>
+      </w:pPr>
+      <w:r>
+        <w:t xml:space="preserve">We presented an open-source, containerized, GUI-driven chain that converts</w:t>
+      </w:r>
+      <w:r>
+        <w:t xml:space="preserve"> </w:t>
+      </w:r>
+      <w:r>
+        <w:t xml:space="preserve">multi-image captures — with or without known pose — into walkable web 3D scenes,</w:t>
+      </w:r>
+      <w:r>
+        <w:t xml:space="preserve"> </w:t>
+      </w:r>
+      <w:r>
+        <w:t xml:space="preserve">self-hostable end to end. A ground-truth evaluation shows the pose-based</w:t>
+      </w:r>
+      <w:r>
+        <w:t xml:space="preserve"> </w:t>
+      </w:r>
+      <w:r>
+        <w:t xml:space="preserve">reprojection branch to be more accurate, more robust, and faster than stitching</w:t>
+      </w:r>
+      <w:r>
+        <w:t xml:space="preserve"> </w:t>
+      </w:r>
+      <w:r>
+        <w:t xml:space="preserve">when scanner poses are available, and yields an interpretable automatic quality</w:t>
+      </w:r>
+      <w:r>
+        <w:t xml:space="preserve"> </w:t>
+      </w:r>
+      <w:r>
+        <w:t xml:space="preserve">flag for the stitching branch. Future work: wire the quality flag into the GUI;</w:t>
+      </w:r>
+      <w:r>
+        <w:t xml:space="preserve"> </w:t>
+      </w:r>
+      <w:r>
+        <w:t xml:space="preserve">integrate further representations (3D Gaussian splatting, meshes) in the same</w:t>
+      </w:r>
+      <w:r>
+        <w:t xml:space="preserve"> </w:t>
+      </w:r>
+      <w:r>
+        <w:t xml:space="preserve">viewer; obtain a freely licensed set of raw dual-fisheye frames from a consumer</w:t>
+      </w:r>
+      <w:r>
+        <w:t xml:space="preserve"> </w:t>
+      </w:r>
+      <w:r>
+        <w:t xml:space="preserve">360° camera, which would close the last gap in device coverage for the stitching</w:t>
+      </w:r>
+      <w:r>
+        <w:t xml:space="preserve"> </w:t>
+      </w:r>
+      <w:r>
+        <w:t xml:space="preserve">branch; and run the prepared usability study (System Usability Scale [15, 16]).</w:t>
+      </w:r>
+    </w:p>
+    <w:bookmarkEnd w:id="45"/>
+    <w:bookmarkStart w:id="46" w:name="data-availability-1"/>
+    <w:p>
+      <w:pPr>
+        <w:pStyle w:val="Heading2"/>
+      </w:pPr>
+      <w:r>
+        <w:t xml:space="preserve">Data availability</w:t>
+      </w:r>
+    </w:p>
+    <w:p>
+      <w:pPr>
+        <w:pStyle w:val="FirstParagraph"/>
+      </w:pPr>
+      <w:r>
+        <w:t xml:space="preserve">All data used in this work are third-party open data. Terrestrial laser scans:</w:t>
+      </w:r>
+      <w:r>
+        <w:t xml:space="preserve"> </w:t>
+      </w:r>
+      <w:r>
+        <w:t xml:space="preserve">Renon / ICOS IT-Ren (Leica BLK360, E57; CC BY 4.0) [17] and SegmentedForests</w:t>
+      </w:r>
+      <w:r>
+        <w:t xml:space="preserve"> </w:t>
+      </w:r>
+      <w:r>
+        <w:t xml:space="preserve">(MIT) [12]. Reference panoramas for the quantitative evaluation: eleven Poly Haven</w:t>
+      </w:r>
+      <w:r>
+        <w:t xml:space="preserve"> </w:t>
+      </w:r>
+      <w:r>
+        <w:t xml:space="preserve">HDRIs (CC0, https://polyhaven.com). Real multi-image capture: PASSTA LunchRoom</w:t>
+      </w:r>
+      <w:r>
+        <w:t xml:space="preserve"> </w:t>
+      </w:r>
+      <w:r>
+        <w:t xml:space="preserve">(CC BY 4.0) [10]. Source code, container recipe and evaluation scripts:</w:t>
+      </w:r>
+      <w:r>
+        <w:t xml:space="preserve"> </w:t>
+      </w:r>
+      <w:r>
+        <w:t xml:space="preserve">https://github.com/anayana/For3Dsuite (GPL-3.0-or-later), archived at</w:t>
+      </w:r>
+      <w:r>
+        <w:t xml:space="preserve"> </w:t>
+      </w:r>
+      <w:r>
+        <w:t xml:space="preserve">[Zenodo DOI].</w:t>
+      </w:r>
+    </w:p>
+    <w:bookmarkEnd w:id="46"/>
+    <w:bookmarkStart w:id="47" w:name="declaration-of-competing-interest-1"/>
+    <w:p>
+      <w:pPr>
+        <w:pStyle w:val="Heading2"/>
+      </w:pPr>
+      <w:r>
+        <w:t xml:space="preserve">Declaration of competing interest</w:t>
+      </w:r>
+    </w:p>
+    <w:p>
+      <w:pPr>
+        <w:pStyle w:val="FirstParagraph"/>
+      </w:pPr>
+      <w:r>
+        <w:t xml:space="preserve">The author declares no known competing financial interests or personal</w:t>
+      </w:r>
+      <w:r>
+        <w:t xml:space="preserve"> </w:t>
+      </w:r>
+      <w:r>
+        <w:t xml:space="preserve">relationships that could have appeared to influence the work reported in this</w:t>
+      </w:r>
+      <w:r>
+        <w:t xml:space="preserve"> </w:t>
+      </w:r>
+      <w:r>
+        <w:t xml:space="preserve">paper.</w:t>
+      </w:r>
+    </w:p>
+    <w:bookmarkEnd w:id="47"/>
+    <w:bookmarkStart w:id="48" w:name="X62f0e0ad3a93e6397531f4cde20d8fe1b9e9558"/>
+    <w:p>
+      <w:pPr>
+        <w:pStyle w:val="Heading2"/>
+      </w:pPr>
+      <w:r>
+        <w:t xml:space="preserve">CRediT authorship contribution statement</w:t>
+      </w:r>
+    </w:p>
+    <w:p>
+      <w:pPr>
+        <w:pStyle w:val="FirstParagraph"/>
+      </w:pPr>
+      <w:r>
+        <w:rPr>
+          <w:bCs/>
+          <w:b/>
+        </w:rPr>
+        <w:t xml:space="preserve">Angel Naya:</w:t>
+      </w:r>
+      <w:r>
+        <w:t xml:space="preserve"> </w:t>
+      </w:r>
+      <w:r>
+        <w:t xml:space="preserve">Conceptualization, Methodology, Software, Validation, Formal</w:t>
+      </w:r>
+      <w:r>
+        <w:t xml:space="preserve"> </w:t>
+      </w:r>
+      <w:r>
+        <w:t xml:space="preserve">analysis, Data curation, Visualization, Writing – original draft, Writing –</w:t>
+      </w:r>
+      <w:r>
+        <w:t xml:space="preserve"> </w:t>
+      </w:r>
+      <w:r>
+        <w:t xml:space="preserve">review &amp; editing.</w:t>
+      </w:r>
+    </w:p>
+    <w:bookmarkEnd w:id="48"/>
+    <w:bookmarkStart w:id="49" w:name="acknowledgements-1"/>
+    <w:p>
+      <w:pPr>
+        <w:pStyle w:val="Heading2"/>
+      </w:pPr>
+      <w:r>
+        <w:t xml:space="preserve">Acknowledgements</w:t>
+      </w:r>
+    </w:p>
+    <w:p>
+      <w:pPr>
+        <w:pStyle w:val="FirstParagraph"/>
+      </w:pPr>
+      <w:r>
+        <w:t xml:space="preserve">The author thanks the providers of the open datasets used here: the ICOS</w:t>
+      </w:r>
+      <w:r>
+        <w:t xml:space="preserve"> </w:t>
+      </w:r>
+      <w:r>
+        <w:t xml:space="preserve">ecosystem station IT-Ren (Renon) and Chang et al. for the Renon laser scans, the</w:t>
+      </w:r>
+      <w:r>
+        <w:t xml:space="preserve"> </w:t>
+      </w:r>
+      <w:r>
+        <w:t xml:space="preserve">authors of SegmentedForests and PASSTA, and</w:t>
+      </w:r>
+      <w:r>
+        <w:t xml:space="preserve"> </w:t>
+      </w:r>
+      <w:r>
+        <w:t xml:space="preserve">the Poly Haven contributors. This research received no specific grant from any</w:t>
+      </w:r>
+      <w:r>
+        <w:t xml:space="preserve"> </w:t>
+      </w:r>
+      <w:r>
+        <w:t xml:space="preserve">funding agency in the public, commercial, or not-for-profit sectors.</w:t>
+      </w:r>
+    </w:p>
+    <w:bookmarkEnd w:id="49"/>
+    <w:bookmarkStart w:id="50" w:name="references-1"/>
+    <w:p>
+      <w:pPr>
+        <w:pStyle w:val="Heading2"/>
+      </w:pPr>
+      <w:r>
+        <w:t xml:space="preserve">References</w:t>
+      </w:r>
+    </w:p>
+    <w:p>
+      <w:pPr>
+        <w:pStyle w:val="FirstParagraph"/>
+      </w:pPr>
+      <w:r>
+        <w:t xml:space="preserve">[1] Brown, M., Lowe, D. G. (2007). Automatic panoramic image stitching using</w:t>
+      </w:r>
+      <w:r>
+        <w:t xml:space="preserve"> </w:t>
+      </w:r>
+      <w:r>
+        <w:t xml:space="preserve">invariant features.</w:t>
       </w:r>
       <w:r>
         <w:t xml:space="preserve"> </w:t>
@@ -4305,119 +6208,662 @@
           <w:iCs/>
           <w:i/>
         </w:rPr>
-        <w:t xml:space="preserve">Quantifying the User Experience: Practical</w:t>
+        <w:t xml:space="preserve">International Journal of Computer Vision</w:t>
+      </w:r>
+      <w:r>
+        <w:t xml:space="preserve"> </w:t>
+      </w:r>
+      <w:r>
+        <w:t xml:space="preserve">74(1), 59–73.</w:t>
+      </w:r>
+      <w:r>
+        <w:t xml:space="preserve"> </w:t>
+      </w:r>
+      <w:r>
+        <w:t xml:space="preserve">https://doi.org/10.1007/s11263-006-0002-3</w:t>
+      </w:r>
+    </w:p>
+    <w:p>
+      <w:pPr>
+        <w:pStyle w:val="BodyText"/>
+      </w:pPr>
+      <w:r>
+        <w:t xml:space="preserve">[2] Szeliski, R. (2006). Image alignment and stitching: a tutorial.</w:t>
+      </w:r>
+      <w:r>
+        <w:t xml:space="preserve"> </w:t>
       </w:r>
       <w:r>
         <w:rPr>
           <w:iCs/>
           <w:i/>
         </w:rPr>
-        <w:t xml:space="preserve"> </w:t>
+        <w:t xml:space="preserve">Foundations</w:t>
       </w:r>
       <w:r>
         <w:rPr>
           <w:iCs/>
           <w:i/>
         </w:rPr>
-        <w:t xml:space="preserve">Statistics for User Research</w:t>
-      </w:r>
-      <w:r>
-        <w:t xml:space="preserve">, 2nd ed., Morgan Kaufmann.</w:t>
-      </w:r>
-    </w:p>
-    <w:p>
-      <w:pPr>
-        <w:pStyle w:val="BodyText"/>
-      </w:pPr>
-      <w:r>
-        <w:t xml:space="preserve">[17] Chang, M., Candotti, A., von Ellenrieder, K., Tomelleri, E., Camurri, M.</w:t>
-      </w:r>
-      <w:r>
-        <w:t xml:space="preserve"> </w:t>
-      </w:r>
-      <w:r>
-        <w:t xml:space="preserve">(2025). Data for:</w:t>
-      </w:r>
-      <w:r>
-        <w:t xml:space="preserve"> </w:t>
-      </w:r>
-      <w:r>
-        <w:t xml:space="preserve">“</w:t>
-      </w:r>
-      <w:r>
-        <w:t xml:space="preserve">A multi-platform LiDAR dataset for standardized forest</w:t>
-      </w:r>
-      <w:r>
-        <w:t xml:space="preserve"> </w:t>
-      </w:r>
-      <w:r>
-        <w:t xml:space="preserve">inventory measurement at long term ecological monitoring sites</w:t>
-      </w:r>
-      <w:r>
-        <w:t xml:space="preserve">”</w:t>
-      </w:r>
-      <w:r>
-        <w:t xml:space="preserve"> </w:t>
-      </w:r>
-      <w:r>
-        <w:t xml:space="preserve">[Dataset].</w:t>
-      </w:r>
-      <w:r>
-        <w:t xml:space="preserve"> </w:t>
-      </w:r>
-      <w:r>
-        <w:t xml:space="preserve">Zenodo. https://doi.org/10.5281/zenodo.17186174</w:t>
-      </w:r>
-    </w:p>
-    <w:p>
-      <w:pPr>
-        <w:pStyle w:val="BodyText"/>
-      </w:pPr>
+        <w:t xml:space="preserve"> </w:t>
+      </w:r>
       <w:r>
         <w:rPr>
           <w:iCs/>
           <w:i/>
         </w:rPr>
-        <w:t xml:space="preserve">Software used, with the versions that produced the reported figures:</w:t>
-      </w:r>
-      <w:r>
-        <w:t xml:space="preserve"> </w:t>
-      </w:r>
-      <w:r>
-        <w:t xml:space="preserve">Hugin/Panotools 2024.0.1 (GPL-2.0), Pannellum 2.5.6 (MIT), three.js r160 (MIT),</w:t>
-      </w:r>
-      <w:r>
-        <w:t xml:space="preserve"> </w:t>
-      </w:r>
-      <w:r>
-        <w:t xml:space="preserve">Leaflet 1.9.4 (BSD-2), Caddy 2 (Apache-2.0), Garage 1.0.1 (AGPL-3.0), FastAPI</w:t>
-      </w:r>
-      <w:r>
-        <w:t xml:space="preserve"> </w:t>
-      </w:r>
-      <w:r>
-        <w:t xml:space="preserve">(MIT), NumPy 1.26.4, Pillow 12.3.0, OpenCV 5.0.0, laspy 2.5.4, 3DFin/dendromatics,</w:t>
-      </w:r>
-      <w:r>
-        <w:t xml:space="preserve"> </w:t>
-      </w:r>
-      <w:r>
-        <w:t xml:space="preserve">TreeGrOSS (GPL-3.0, isolated as a separate process).</w:t>
+        <w:t xml:space="preserve">and Trends in Computer Graphics and Vision</w:t>
+      </w:r>
+      <w:r>
+        <w:t xml:space="preserve"> </w:t>
+      </w:r>
+      <w:r>
+        <w:t xml:space="preserve">2(1), 1–104.</w:t>
+      </w:r>
+      <w:r>
+        <w:t xml:space="preserve"> </w:t>
+      </w:r>
+      <w:r>
+        <w:t xml:space="preserve">https://doi.org/10.1561/0600000009</w:t>
       </w:r>
     </w:p>
     <w:p>
       <w:pPr>
         <w:pStyle w:val="BodyText"/>
       </w:pPr>
+      <w:r>
+        <w:t xml:space="preserve">[3] Petroff, M. A. (2019). Pannellum: a lightweight web-based panorama viewer.</w:t>
+      </w:r>
+      <w:r>
+        <w:t xml:space="preserve"> </w:t>
+      </w:r>
       <w:r>
         <w:rPr>
           <w:iCs/>
           <w:i/>
         </w:rPr>
-        <w:t xml:space="preserve">Checked against publisher records (Oct 2026): [1]–[3], [5]–[7], [11]–[14], [17]. Still to check: [10].</w:t>
-      </w:r>
-    </w:p>
-    <w:bookmarkEnd w:id="40"/>
+        <w:t xml:space="preserve">Journal of Open Source Software</w:t>
+      </w:r>
+      <w:r>
+        <w:t xml:space="preserve"> </w:t>
+      </w:r>
+      <w:r>
+        <w:t xml:space="preserve">4(40), 1628.</w:t>
+      </w:r>
+      <w:r>
+        <w:t xml:space="preserve"> </w:t>
+      </w:r>
+      <w:r>
+        <w:t xml:space="preserve">https://doi.org/10.21105/joss.01628</w:t>
+      </w:r>
+    </w:p>
+    <w:p>
+      <w:pPr>
+        <w:pStyle w:val="BodyText"/>
+      </w:pPr>
+      <w:r>
+        <w:t xml:space="preserve">[4] Schütz, M. (2016).</w:t>
+      </w:r>
+      <w:r>
+        <w:t xml:space="preserve"> </w:t>
+      </w:r>
+      <w:r>
+        <w:rPr>
+          <w:iCs/>
+          <w:i/>
+        </w:rPr>
+        <w:t xml:space="preserve">Potree: Rendering large point clouds in web browsers.</w:t>
+      </w:r>
+      <w:r>
+        <w:t xml:space="preserve"> </w:t>
+      </w:r>
+      <w:r>
+        <w:t xml:space="preserve">Diploma thesis, TU Wien.</w:t>
+      </w:r>
+    </w:p>
+    <w:p>
+      <w:pPr>
+        <w:pStyle w:val="BodyText"/>
+      </w:pPr>
+      <w:r>
+        <w:t xml:space="preserve">[5] Huber, D. (2011). The ASTM E57 file format for 3D imaging data exchange.</w:t>
+      </w:r>
+      <w:r>
+        <w:t xml:space="preserve"> </w:t>
+      </w:r>
+      <w:r>
+        <w:rPr>
+          <w:iCs/>
+          <w:i/>
+        </w:rPr>
+        <w:t xml:space="preserve">Proc. SPIE</w:t>
+      </w:r>
+      <w:r>
+        <w:t xml:space="preserve"> </w:t>
+      </w:r>
+      <w:r>
+        <w:t xml:space="preserve">7864, Three-Dimensional Imaging, Interaction, and Measurement,</w:t>
+      </w:r>
+      <w:r>
+        <w:t xml:space="preserve"> </w:t>
+      </w:r>
+      <w:r>
+        <w:t xml:space="preserve">78640A. https://doi.org/10.1117/12.876555</w:t>
+      </w:r>
+    </w:p>
+    <w:p>
+      <w:pPr>
+        <w:pStyle w:val="BodyText"/>
+      </w:pPr>
+      <w:r>
+        <w:t xml:space="preserve">[6] Houshiar, H., Elseberg, J., Borrmann, D., Nüchter, A. (2015). A study of</w:t>
+      </w:r>
+      <w:r>
+        <w:t xml:space="preserve"> </w:t>
+      </w:r>
+      <w:r>
+        <w:t xml:space="preserve">projections for key point based registration of panoramic terrestrial 3D laser</w:t>
+      </w:r>
+      <w:r>
+        <w:t xml:space="preserve"> </w:t>
+      </w:r>
+      <w:r>
+        <w:t xml:space="preserve">scan.</w:t>
+      </w:r>
+      <w:r>
+        <w:t xml:space="preserve"> </w:t>
+      </w:r>
+      <w:r>
+        <w:rPr>
+          <w:iCs/>
+          <w:i/>
+        </w:rPr>
+        <w:t xml:space="preserve">Geo-spatial Information Science</w:t>
+      </w:r>
+      <w:r>
+        <w:t xml:space="preserve"> </w:t>
+      </w:r>
+      <w:r>
+        <w:t xml:space="preserve">18(1), 11–31.</w:t>
+      </w:r>
+      <w:r>
+        <w:t xml:space="preserve"> </w:t>
+      </w:r>
+      <w:r>
+        <w:t xml:space="preserve">https://doi.org/10.1080/10095020.2015.1017913</w:t>
+      </w:r>
+    </w:p>
+    <w:p>
+      <w:pPr>
+        <w:pStyle w:val="BodyText"/>
+      </w:pPr>
+      <w:r>
+        <w:t xml:space="preserve">[7] Kang, Z., et al. (2009). Automatic registration of terrestrial laser scanning</w:t>
+      </w:r>
+      <w:r>
+        <w:t xml:space="preserve"> </w:t>
+      </w:r>
+      <w:r>
+        <w:t xml:space="preserve">point clouds using panoramic reflectance images.</w:t>
+      </w:r>
+      <w:r>
+        <w:t xml:space="preserve"> </w:t>
+      </w:r>
+      <w:r>
+        <w:rPr>
+          <w:iCs/>
+          <w:i/>
+        </w:rPr>
+        <w:t xml:space="preserve">Sensors</w:t>
+      </w:r>
+      <w:r>
+        <w:t xml:space="preserve"> </w:t>
+      </w:r>
+      <w:r>
+        <w:t xml:space="preserve">9(4), 2621–2646.</w:t>
+      </w:r>
+      <w:r>
+        <w:t xml:space="preserve"> </w:t>
+      </w:r>
+      <w:r>
+        <w:t xml:space="preserve">https://doi.org/10.3390/s90402621</w:t>
+      </w:r>
+    </w:p>
+    <w:p>
+      <w:pPr>
+        <w:pStyle w:val="BodyText"/>
+      </w:pPr>
+      <w:r>
+        <w:t xml:space="preserve">[8] Wang, Z., Bovik, A. C., Sheikh, H. R., Simoncelli, E. P. (2004). Image quality</w:t>
+      </w:r>
+      <w:r>
+        <w:t xml:space="preserve"> </w:t>
+      </w:r>
+      <w:r>
+        <w:t xml:space="preserve">assessment: from error visibility to structural similarity.</w:t>
+      </w:r>
+      <w:r>
+        <w:t xml:space="preserve"> </w:t>
+      </w:r>
+      <w:r>
+        <w:rPr>
+          <w:iCs/>
+          <w:i/>
+        </w:rPr>
+        <w:t xml:space="preserve">IEEE Transactions on</w:t>
+      </w:r>
+      <w:r>
+        <w:rPr>
+          <w:iCs/>
+          <w:i/>
+        </w:rPr>
+        <w:t xml:space="preserve"> </w:t>
+      </w:r>
+      <w:r>
+        <w:rPr>
+          <w:iCs/>
+          <w:i/>
+        </w:rPr>
+        <w:t xml:space="preserve">Image Processing</w:t>
+      </w:r>
+      <w:r>
+        <w:t xml:space="preserve"> </w:t>
+      </w:r>
+      <w:r>
+        <w:t xml:space="preserve">13(4), 600–612. https://doi.org/10.1109/TIP.2003.819861</w:t>
+      </w:r>
+    </w:p>
+    <w:p>
+      <w:pPr>
+        <w:pStyle w:val="BodyText"/>
+      </w:pPr>
+      <w:r>
+        <w:t xml:space="preserve">[9] Kuglin, C. D., Hines, D. C. (1975). The phase correlation image alignment</w:t>
+      </w:r>
+      <w:r>
+        <w:t xml:space="preserve"> </w:t>
+      </w:r>
+      <w:r>
+        <w:t xml:space="preserve">method.</w:t>
+      </w:r>
+      <w:r>
+        <w:t xml:space="preserve"> </w:t>
+      </w:r>
+      <w:r>
+        <w:rPr>
+          <w:iCs/>
+          <w:i/>
+        </w:rPr>
+        <w:t xml:space="preserve">Proc. IEEE Int. Conf. on Cybernetics and Society</w:t>
+      </w:r>
+      <w:r>
+        <w:t xml:space="preserve">, 163–165.</w:t>
+      </w:r>
+    </w:p>
+    <w:p>
+      <w:pPr>
+        <w:pStyle w:val="BodyText"/>
+      </w:pPr>
+      <w:r>
+        <w:t xml:space="preserve">[10] Meneghetti, G., Danelljan, M., Felsberg, M., Nordberg, K. (2015). Image</w:t>
+      </w:r>
+      <w:r>
+        <w:t xml:space="preserve"> </w:t>
+      </w:r>
+      <w:r>
+        <w:t xml:space="preserve">alignment for panorama stitching in sparsely structured environments.</w:t>
+      </w:r>
+      <w:r>
+        <w:t xml:space="preserve"> </w:t>
+      </w:r>
+      <w:r>
+        <w:rPr>
+          <w:iCs/>
+          <w:i/>
+        </w:rPr>
+        <w:t xml:space="preserve">Scandinavian Conference on Image Analysis (SCIA)</w:t>
+      </w:r>
+      <w:r>
+        <w:t xml:space="preserve">. Data: CC-BY-4.0,</w:t>
+      </w:r>
+      <w:r>
+        <w:t xml:space="preserve"> </w:t>
+      </w:r>
+      <w:r>
+        <w:t xml:space="preserve">https://doi.org/10.5281/zenodo.19663081</w:t>
+      </w:r>
+    </w:p>
+    <w:p>
+      <w:pPr>
+        <w:pStyle w:val="BodyText"/>
+      </w:pPr>
+      <w:r>
+        <w:t xml:space="preserve">[11] Laino, D., Cabo, C., Prendes, C., et al. (2024). 3DFin: a software for</w:t>
+      </w:r>
+      <w:r>
+        <w:t xml:space="preserve"> </w:t>
+      </w:r>
+      <w:r>
+        <w:t xml:space="preserve">automated 3D forest inventories from terrestrial point clouds.</w:t>
+      </w:r>
+      <w:r>
+        <w:t xml:space="preserve"> </w:t>
+      </w:r>
+      <w:r>
+        <w:rPr>
+          <w:iCs/>
+          <w:i/>
+        </w:rPr>
+        <w:t xml:space="preserve">Forestry</w:t>
+      </w:r>
+      <w:r>
+        <w:t xml:space="preserve"> </w:t>
+      </w:r>
+      <w:r>
+        <w:t xml:space="preserve">97(4),</w:t>
+      </w:r>
+      <w:r>
+        <w:t xml:space="preserve"> </w:t>
+      </w:r>
+      <w:r>
+        <w:t xml:space="preserve">479–496.</w:t>
+      </w:r>
+      <w:r>
+        <w:t xml:space="preserve"> </w:t>
+      </w:r>
+      <w:r>
+        <w:t xml:space="preserve">https://doi.org/10.1093/forestry/cpae020</w:t>
+      </w:r>
+    </w:p>
+    <w:p>
+      <w:pPr>
+        <w:pStyle w:val="BodyText"/>
+      </w:pPr>
+      <w:r>
+        <w:t xml:space="preserve">[12] Laino, D., Cabo, C., Ordóñez, C., et al. (2026). SegmentedForests: a labelled</w:t>
+      </w:r>
+      <w:r>
+        <w:t xml:space="preserve"> </w:t>
+      </w:r>
+      <w:r>
+        <w:t xml:space="preserve">dataset of terrestrial LiDAR point clouds for semantic segmentation of forests.</w:t>
+      </w:r>
+      <w:r>
+        <w:t xml:space="preserve"> </w:t>
+      </w:r>
+      <w:r>
+        <w:rPr>
+          <w:iCs/>
+          <w:i/>
+        </w:rPr>
+        <w:t xml:space="preserve">Forestry</w:t>
+      </w:r>
+      <w:r>
+        <w:t xml:space="preserve"> </w:t>
+      </w:r>
+      <w:r>
+        <w:t xml:space="preserve">99(2). https://doi.org/10.1093/forestry/cpaf062 · Data:</w:t>
+      </w:r>
+      <w:r>
+        <w:t xml:space="preserve"> </w:t>
+      </w:r>
+      <w:r>
+        <w:t xml:space="preserve">https://doi.org/10.5281/zenodo.17396681</w:t>
+      </w:r>
+    </w:p>
+    <w:p>
+      <w:pPr>
+        <w:pStyle w:val="BodyText"/>
+      </w:pPr>
+      <w:r>
+        <w:t xml:space="preserve">[13] Roussel, J.-R., et al. (2020). lidR: An R package for analysis of Airborne</w:t>
+      </w:r>
+      <w:r>
+        <w:t xml:space="preserve"> </w:t>
+      </w:r>
+      <w:r>
+        <w:t xml:space="preserve">Laser Scanning (ALS) data.</w:t>
+      </w:r>
+      <w:r>
+        <w:t xml:space="preserve"> </w:t>
+      </w:r>
+      <w:r>
+        <w:rPr>
+          <w:iCs/>
+          <w:i/>
+        </w:rPr>
+        <w:t xml:space="preserve">Remote Sensing of Environment</w:t>
+      </w:r>
+      <w:r>
+        <w:t xml:space="preserve"> </w:t>
+      </w:r>
+      <w:r>
+        <w:t xml:space="preserve">251, 112061.</w:t>
+      </w:r>
+      <w:r>
+        <w:t xml:space="preserve"> </w:t>
+      </w:r>
+      <w:r>
+        <w:t xml:space="preserve">https://doi.org/10.1016/j.rse.2020.112061</w:t>
+      </w:r>
+    </w:p>
+    <w:p>
+      <w:pPr>
+        <w:pStyle w:val="BodyText"/>
+      </w:pPr>
+      <w:r>
+        <w:t xml:space="preserve">[14] Zhang, W., et al. (2016). An easy-to-use airborne LiDAR data filtering method</w:t>
+      </w:r>
+      <w:r>
+        <w:t xml:space="preserve"> </w:t>
+      </w:r>
+      <w:r>
+        <w:t xml:space="preserve">based on cloth simulation.</w:t>
+      </w:r>
+      <w:r>
+        <w:t xml:space="preserve"> </w:t>
+      </w:r>
+      <w:r>
+        <w:rPr>
+          <w:iCs/>
+          <w:i/>
+        </w:rPr>
+        <w:t xml:space="preserve">Remote Sensing</w:t>
+      </w:r>
+      <w:r>
+        <w:t xml:space="preserve"> </w:t>
+      </w:r>
+      <w:r>
+        <w:t xml:space="preserve">8(6), 501.</w:t>
+      </w:r>
+      <w:r>
+        <w:t xml:space="preserve"> </w:t>
+      </w:r>
+      <w:r>
+        <w:t xml:space="preserve">https://doi.org/10.3390/rs8060501</w:t>
+      </w:r>
+    </w:p>
+    <w:p>
+      <w:pPr>
+        <w:pStyle w:val="BodyText"/>
+      </w:pPr>
+      <w:r>
+        <w:t xml:space="preserve">[15] Brooke, J. (1996). SUS: a</w:t>
+      </w:r>
+      <w:r>
+        <w:t xml:space="preserve"> </w:t>
+      </w:r>
+      <w:r>
+        <w:t xml:space="preserve">“</w:t>
+      </w:r>
+      <w:r>
+        <w:t xml:space="preserve">quick and dirty</w:t>
+      </w:r>
+      <w:r>
+        <w:t xml:space="preserve">”</w:t>
+      </w:r>
+      <w:r>
+        <w:t xml:space="preserve"> </w:t>
+      </w:r>
+      <w:r>
+        <w:t xml:space="preserve">usability scale. In:</w:t>
+      </w:r>
+      <w:r>
+        <w:t xml:space="preserve"> </w:t>
+      </w:r>
+      <w:r>
+        <w:rPr>
+          <w:iCs/>
+          <w:i/>
+        </w:rPr>
+        <w:t xml:space="preserve">Usability</w:t>
+      </w:r>
+      <w:r>
+        <w:rPr>
+          <w:iCs/>
+          <w:i/>
+        </w:rPr>
+        <w:t xml:space="preserve"> </w:t>
+      </w:r>
+      <w:r>
+        <w:rPr>
+          <w:iCs/>
+          <w:i/>
+        </w:rPr>
+        <w:t xml:space="preserve">Evaluation in Industry</w:t>
+      </w:r>
+      <w:r>
+        <w:t xml:space="preserve">, Taylor &amp; Francis, 189–194.</w:t>
+      </w:r>
+    </w:p>
+    <w:p>
+      <w:pPr>
+        <w:pStyle w:val="BodyText"/>
+      </w:pPr>
+      <w:r>
+        <w:t xml:space="preserve">[16] Sauro, J., Lewis, J. R. (2016).</w:t>
+      </w:r>
+      <w:r>
+        <w:t xml:space="preserve"> </w:t>
+      </w:r>
+      <w:r>
+        <w:rPr>
+          <w:iCs/>
+          <w:i/>
+        </w:rPr>
+        <w:t xml:space="preserve">Quantifying the User Experience: Practical</w:t>
+      </w:r>
+      <w:r>
+        <w:rPr>
+          <w:iCs/>
+          <w:i/>
+        </w:rPr>
+        <w:t xml:space="preserve"> </w:t>
+      </w:r>
+      <w:r>
+        <w:rPr>
+          <w:iCs/>
+          <w:i/>
+        </w:rPr>
+        <w:t xml:space="preserve">Statistics for User Research</w:t>
+      </w:r>
+      <w:r>
+        <w:t xml:space="preserve">, 2nd ed., Morgan Kaufmann.</w:t>
+      </w:r>
+    </w:p>
+    <w:p>
+      <w:pPr>
+        <w:pStyle w:val="BodyText"/>
+      </w:pPr>
+      <w:r>
+        <w:t xml:space="preserve">[17] Chang, M., Candotti, A., von Ellenrieder, K., Tomelleri, E., Camurri, M.</w:t>
+      </w:r>
+      <w:r>
+        <w:t xml:space="preserve"> </w:t>
+      </w:r>
+      <w:r>
+        <w:t xml:space="preserve">(2025). Data for:</w:t>
+      </w:r>
+      <w:r>
+        <w:t xml:space="preserve"> </w:t>
+      </w:r>
+      <w:r>
+        <w:t xml:space="preserve">“</w:t>
+      </w:r>
+      <w:r>
+        <w:t xml:space="preserve">A multi-platform LiDAR dataset for standardized forest</w:t>
+      </w:r>
+      <w:r>
+        <w:t xml:space="preserve"> </w:t>
+      </w:r>
+      <w:r>
+        <w:t xml:space="preserve">inventory measurement at long term ecological monitoring sites</w:t>
+      </w:r>
+      <w:r>
+        <w:t xml:space="preserve">”</w:t>
+      </w:r>
+      <w:r>
+        <w:t xml:space="preserve"> </w:t>
+      </w:r>
+      <w:r>
+        <w:t xml:space="preserve">[Dataset].</w:t>
+      </w:r>
+      <w:r>
+        <w:t xml:space="preserve"> </w:t>
+      </w:r>
+      <w:r>
+        <w:t xml:space="preserve">Zenodo. https://doi.org/10.5281/zenodo.17186174</w:t>
+      </w:r>
+    </w:p>
+    <w:p>
+      <w:pPr>
+        <w:pStyle w:val="BodyText"/>
+      </w:pPr>
+      <w:r>
+        <w:rPr>
+          <w:iCs/>
+          <w:i/>
+        </w:rPr>
+        <w:t xml:space="preserve">Software used, with the versions that produced the reported figures:</w:t>
+      </w:r>
+      <w:r>
+        <w:t xml:space="preserve"> </w:t>
+      </w:r>
+      <w:r>
+        <w:t xml:space="preserve">Hugin/Panotools 2024.0.1 (GPL-2.0), Pannellum 2.5.6 (MIT), three.js r160 (MIT),</w:t>
+      </w:r>
+      <w:r>
+        <w:t xml:space="preserve"> </w:t>
+      </w:r>
+      <w:r>
+        <w:t xml:space="preserve">Leaflet 1.9.4 (BSD-2), Caddy 2 (Apache-2.0), Garage 1.0.1 (AGPL-3.0), FastAPI</w:t>
+      </w:r>
+      <w:r>
+        <w:t xml:space="preserve"> </w:t>
+      </w:r>
+      <w:r>
+        <w:t xml:space="preserve">(MIT), NumPy 1.26.4, Pillow 12.3.0, OpenCV 5.0.0, laspy 2.5.4, 3DFin/dendromatics,</w:t>
+      </w:r>
+      <w:r>
+        <w:t xml:space="preserve"> </w:t>
+      </w:r>
+      <w:r>
+        <w:t xml:space="preserve">TreeGrOSS (GPL-3.0, isolated as a separate process).</w:t>
+      </w:r>
+    </w:p>
+    <w:p>
+      <w:pPr>
+        <w:pStyle w:val="BodyText"/>
+      </w:pPr>
+      <w:r>
+        <w:rPr>
+          <w:iCs/>
+          <w:i/>
+        </w:rPr>
+        <w:t xml:space="preserve">Checked against publisher records (Oct 2026): [1]–[3], [5]–[7], [10]–[14], [17].</w:t>
+      </w:r>
+    </w:p>
+    <w:bookmarkEnd w:id="50"/>
     <w:sectPr/>
   </w:body>
 </w:document>

</xml_diff>

<commit_message>
Paper A: Verdopplung aus 379843e/3cc202d behoben
Die beiden Literatur-Korrekturen hatten den Bereich zwischen einem
gleichlautenden Verweis im Fliesstext und der Literaturliste kopiert
(Abschnitte 4 bis Literatur doppelt). Manuskript auf 590bdf3
zurueckgesetzt und [5] (Artikelnummer 78640A) sowie [10] (Zenodo-
Datensatz, CC BY 4.0) gezielt neu eingetragen; Word-Datei neu erzeugt.

Co-Authored-By: Claude Opus 5.5 <noreply@anthropic.com>
Claude-Session: https://claude.ai/code/session_013WHGNh61Va4DrXQ4AxtPNr
</commit_message>
<xml_diff>
--- a/Paper_ODT/Panorama_Pipeline_Paper/Manuscript_SoftwareX_EN.docx
+++ b/Paper_ODT/Panorama_Pipeline_Paper/Manuscript_SoftwareX_EN.docx
@@ -3732,7 +3732,7 @@
       </w:r>
     </w:p>
     <w:bookmarkEnd w:id="39"/>
-    <w:bookmarkStart w:id="43" w:name="references"/>
+    <w:bookmarkStart w:id="40" w:name="references"/>
     <w:p>
       <w:pPr>
         <w:pStyle w:val="Heading2"/>
@@ -4079,71 +4079,13 @@
         <w:pStyle w:val="BodyText"/>
       </w:pPr>
       <w:r>
-        <w:t xml:space="preserve">[11] (authors’ configuration) |</w:t>
-      </w:r>
-      <w:r>
-        <w:t xml:space="preserve"> </w:t>
-      </w:r>
-      <w:r>
-        <w:rPr>
-          <w:bCs/>
-          <w:b/>
-        </w:rPr>
-        <w:t xml:space="preserve">98.5 % / 95.7 %</w:t>
-      </w:r>
-      <w:r>
-        <w:t xml:space="preserve"> </w:t>
-      </w:r>
-      <w:r>
-        <w:t xml:space="preserve">|</w:t>
-      </w:r>
-      <w:r>
-        <w:t xml:space="preserve"> </w:t>
-      </w:r>
-      <w:r>
-        <w:rPr>
-          <w:bCs/>
-          <w:b/>
-        </w:rPr>
-        <w:t xml:space="preserve">94.5 % / 100 %</w:t>
-      </w:r>
-      <w:r>
-        <w:t xml:space="preserve"> </w:t>
-      </w:r>
-      <w:r>
-        <w:t xml:space="preserve">|</w:t>
-      </w:r>
-    </w:p>
-    <w:p>
-      <w:pPr>
-        <w:pStyle w:val="BodyText"/>
-      </w:pPr>
-      <w:r>
-        <w:t xml:space="preserve">We report the uncomfortable result openly: the established domain tool 3DFin</w:t>
-      </w:r>
-      <w:r>
-        <w:t xml:space="preserve"> </w:t>
-      </w:r>
-      <w:r>
-        <w:t xml:space="preserve">clearly outperforms our own baseline, consistently across both plots, and the</w:t>
-      </w:r>
-      <w:r>
-        <w:t xml:space="preserve"> </w:t>
-      </w:r>
-      <w:r>
-        <w:t xml:space="preserve">chain therefore uses it as the detector on plot-wide TLS clouds rather than</w:t>
-      </w:r>
-      <w:r>
-        <w:t xml:space="preserve"> </w:t>
-      </w:r>
-      <w:r>
-        <w:t xml:space="preserve">merely as a comparison. Because the dataset also labels shrubs, downed wood,</w:t>
-      </w:r>
-      <w:r>
-        <w:t xml:space="preserve"> </w:t>
-      </w:r>
-      <w:r>
-        <w:t xml:space="preserve">rocks, and stakes, it is further verifiable</w:t>
+        <w:t xml:space="preserve">[11] Laino, D., Cabo, C., Prendes, C., et al. (2024). 3DFin: a software for</w:t>
+      </w:r>
+      <w:r>
+        <w:t xml:space="preserve"> </w:t>
+      </w:r>
+      <w:r>
+        <w:t xml:space="preserve">automated 3D forest inventories from terrestrial point clouds.</w:t>
       </w:r>
       <w:r>
         <w:t xml:space="preserve"> </w:t>
@@ -4153,79 +4095,61 @@
           <w:iCs/>
           <w:i/>
         </w:rPr>
-        <w:t xml:space="preserve">what</w:t>
-      </w:r>
-      <w:r>
-        <w:t xml:space="preserve"> </w:t>
-      </w:r>
-      <w:r>
-        <w:t xml:space="preserve">the weaker methods detect</w:t>
-      </w:r>
-      <w:r>
-        <w:t xml:space="preserve"> </w:t>
-      </w:r>
-      <w:r>
-        <w:t xml:space="preserve">instead of stems — for the baseline on plot_06, half of the false alarms sit on</w:t>
-      </w:r>
-      <w:r>
-        <w:t xml:space="preserve"> </w:t>
-      </w:r>
-      <w:r>
-        <w:t xml:space="preserve">shrub and ground vegetation.</w:t>
+        <w:t xml:space="preserve">Forestry</w:t>
+      </w:r>
+      <w:r>
+        <w:t xml:space="preserve"> </w:t>
+      </w:r>
+      <w:r>
+        <w:t xml:space="preserve">97(4),</w:t>
+      </w:r>
+      <w:r>
+        <w:t xml:space="preserve"> </w:t>
+      </w:r>
+      <w:r>
+        <w:t xml:space="preserve">479–496.</w:t>
+      </w:r>
+      <w:r>
+        <w:t xml:space="preserve"> </w:t>
+      </w:r>
+      <w:r>
+        <w:t xml:space="preserve">https://doi.org/10.1093/forestry/cpae020</w:t>
       </w:r>
     </w:p>
     <w:p>
       <w:pPr>
         <w:pStyle w:val="BodyText"/>
       </w:pPr>
+      <w:r>
+        <w:t xml:space="preserve">[12] Laino, D., Cabo, C., Ordóñez, C., et al. (2026). SegmentedForests: a labelled</w:t>
+      </w:r>
+      <w:r>
+        <w:t xml:space="preserve"> </w:t>
+      </w:r>
+      <w:r>
+        <w:t xml:space="preserve">dataset of terrestrial LiDAR point clouds for semantic segmentation of forests.</w:t>
+      </w:r>
+      <w:r>
+        <w:t xml:space="preserve"> </w:t>
+      </w:r>
       <w:r>
         <w:rPr>
           <w:iCs/>
           <w:i/>
         </w:rPr>
-        <w:t xml:space="preserve">Scope.</w:t>
-      </w:r>
-      <w:r>
-        <w:t xml:space="preserve"> </w:t>
-      </w:r>
-      <w:r>
-        <w:t xml:space="preserve">This superiority is conditional on circumferential coverage. On our own</w:t>
-      </w:r>
-      <w:r>
-        <w:t xml:space="preserve"> </w:t>
-      </w:r>
-      <w:r>
-        <w:t xml:space="preserve">Renon stand (median 180° arc versus 280–360° in the reference plots) 3DFin</w:t>
-      </w:r>
-      <w:r>
-        <w:t xml:space="preserve"> </w:t>
-      </w:r>
-      <w:r>
-        <w:t xml:space="preserve">refuses a diameter for 29 of 37 detections — correct behaviour, since the data do</w:t>
-      </w:r>
-      <w:r>
-        <w:t xml:space="preserve"> </w:t>
-      </w:r>
-      <w:r>
-        <w:t xml:space="preserve">not support one; a sweep over the ground-model resolution (cloth simulation</w:t>
-      </w:r>
-      <w:r>
-        <w:t xml:space="preserve"> </w:t>
-      </w:r>
-      <w:r>
-        <w:t xml:space="preserve">filter [14]) does not change this.</w:t>
-      </w:r>
-      <w:r>
-        <w:t xml:space="preserve"> </w:t>
-      </w:r>
-      <w:r>
-        <w:t xml:space="preserve">Our own methods still return numbers there, resting on 180° arcs — a statement</w:t>
-      </w:r>
-      <w:r>
-        <w:t xml:space="preserve"> </w:t>
-      </w:r>
-      <w:r>
-        <w:t xml:space="preserve">about the acquisition, not about the methods.</w:t>
+        <w:t xml:space="preserve">Forestry</w:t>
+      </w:r>
+      <w:r>
+        <w:t xml:space="preserve"> </w:t>
+      </w:r>
+      <w:r>
+        <w:t xml:space="preserve">99(2). https://doi.org/10.1093/forestry/cpaf062 · Data:</w:t>
+      </w:r>
+      <w:r>
+        <w:t xml:space="preserve"> </w:t>
+      </w:r>
+      <w:r>
+        <w:t xml:space="preserve">https://doi.org/10.5281/zenodo.17396681</w:t>
       </w:r>
     </w:p>
     <w:p>
@@ -4233,439 +4157,49 @@
         <w:pStyle w:val="BodyText"/>
       </w:pPr>
       <w:r>
-        <w:rPr>
-          <w:bCs/>
-          <w:b/>
-        </w:rPr>
-        <w:t xml:space="preserve">Consumer/DSLR fisheye → scene (stitching).</w:t>
-      </w:r>
-      <w:r>
-        <w:t xml:space="preserve"> </w:t>
-      </w:r>
-      <w:r>
-        <w:t xml:space="preserve">Six overlapping fisheye frames are</w:t>
-      </w:r>
-      <w:r>
-        <w:t xml:space="preserve"> </w:t>
-      </w:r>
-      <w:r>
-        <w:t xml:space="preserve">stitched automatically and published as a navigable scene, demonstrating the</w:t>
-      </w:r>
-      <w:r>
-        <w:t xml:space="preserve"> </w:t>
-      </w:r>
-      <w:r>
-        <w:t xml:space="preserve">pose-unknown branch across the low-cost end of the device spectrum.</w:t>
-      </w:r>
-    </w:p>
-    <w:p>
-      <w:pPr>
-        <w:pStyle w:val="BodyText"/>
-      </w:pPr>
-      <w:r>
-        <w:rPr>
-          <w:bCs/>
-          <w:b/>
-        </w:rPr>
-        <w:t xml:space="preserve">Quantitative comparison against CC0 ground truth.</w:t>
-      </w:r>
-      <w:r>
-        <w:t xml:space="preserve"> </w:t>
-      </w:r>
-      <w:r>
-        <w:t xml:space="preserve">From each of eleven CC0</w:t>
-      </w:r>
-      <w:r>
-        <w:t xml:space="preserve"> </w:t>
-      </w:r>
-      <w:r>
-        <w:t xml:space="preserve">reference panoramas (Poly Haven, 8192×4096) we render synthetic captures and rebuild</w:t>
-      </w:r>
-      <w:r>
-        <w:t xml:space="preserve"> </w:t>
-      </w:r>
-      <w:r>
-        <w:t xml:space="preserve">a panorama (2048×1024) — once by stitching six 180° fisheye frames (pose withheld),</w:t>
-      </w:r>
-      <w:r>
-        <w:t xml:space="preserve"> </w:t>
-      </w:r>
-      <w:r>
-        <w:t xml:space="preserve">once by reprojecting six 90° pinhole frames plus zenith/nadir (pose used) — and</w:t>
-      </w:r>
-      <w:r>
-        <w:t xml:space="preserve"> </w:t>
-      </w:r>
-      <w:r>
-        <w:t xml:space="preserve">measure both against the same original (PSNR, SSIM [8]).</w:t>
-      </w:r>
-    </w:p>
-    <w:p>
-      <w:pPr>
-        <w:pStyle w:val="BodyText"/>
-      </w:pPr>
+        <w:t xml:space="preserve">[13] Roussel, J.-R., et al. (2020). lidR: An R package for analysis of Airborne</w:t>
+      </w:r>
+      <w:r>
+        <w:t xml:space="preserve"> </w:t>
+      </w:r>
+      <w:r>
+        <w:t xml:space="preserve">Laser Scanning (ALS) data.</w:t>
+      </w:r>
+      <w:r>
+        <w:t xml:space="preserve"> </w:t>
+      </w:r>
       <w:r>
         <w:rPr>
           <w:iCs/>
           <w:i/>
         </w:rPr>
-        <w:t xml:space="preserve">Counting convention (used throughout):</w:t>
-      </w:r>
-      <w:r>
-        <w:t xml:space="preserve"> </w:t>
-      </w:r>
-      <w:r>
-        <w:rPr>
-          <w:bCs/>
-          <w:b/>
-        </w:rPr>
-        <w:t xml:space="preserve">completed</w:t>
-      </w:r>
-      <w:r>
-        <w:t xml:space="preserve"> </w:t>
-      </w:r>
-      <w:r>
-        <w:t xml:space="preserve">means the chain wrote a</w:t>
-      </w:r>
-      <w:r>
-        <w:t xml:space="preserve"> </w:t>
-      </w:r>
-      <w:r>
-        <w:t xml:space="preserve">panorama at all;</w:t>
-      </w:r>
-      <w:r>
-        <w:t xml:space="preserve"> </w:t>
-      </w:r>
-      <w:r>
-        <w:rPr>
-          <w:bCs/>
-          <w:b/>
-        </w:rPr>
-        <w:t xml:space="preserve">usable</w:t>
-      </w:r>
-      <w:r>
-        <w:t xml:space="preserve"> </w:t>
-      </w:r>
-      <w:r>
-        <w:t xml:space="preserve">additionally means the result is geometrically</w:t>
-      </w:r>
-      <w:r>
-        <w:t xml:space="preserve"> </w:t>
-      </w:r>
-      <w:r>
-        <w:t xml:space="preserve">correct. The distinction matters for stitching, where two runs produce a</w:t>
-      </w:r>
-      <w:r>
-        <w:t xml:space="preserve"> </w:t>
-      </w:r>
-      <w:r>
-        <w:t xml:space="preserve">complete but misregistered image.</w:t>
-      </w:r>
-    </w:p>
-    <w:tbl>
-      <w:tblPr>
-        <w:tblStyle w:val="Table"/>
-        <w:tblW w:type="pct" w:w="5000"/>
-        <w:tblLook w:firstRow="1" w:lastRow="0" w:firstColumn="0" w:lastColumn="0" w:noHBand="0" w:noVBand="0" w:val="0020"/>
-        <w:jc w:val="start"/>
-      </w:tblPr>
-      <w:tblGrid>
-        <w:gridCol w:w="1131"/>
-        <w:gridCol w:w="1131"/>
-        <w:gridCol w:w="1131"/>
-        <w:gridCol w:w="1131"/>
-        <w:gridCol w:w="1131"/>
-        <w:gridCol w:w="1131"/>
-        <w:gridCol w:w="1131"/>
-      </w:tblGrid>
-      <w:tr>
-        <w:trPr>
-          <w:tblHeader w:val="true"/>
-        </w:trPr>
-        <w:tc>
-          <w:tcPr/>
-          <w:p>
-            <w:pPr>
-              <w:pStyle w:val="Compact"/>
-              <w:jc w:val="left"/>
-            </w:pPr>
-            <w:r>
-              <w:t xml:space="preserve">Branch</w:t>
-            </w:r>
-          </w:p>
-        </w:tc>
-        <w:tc>
-          <w:tcPr/>
-          <w:p>
-            <w:pPr>
-              <w:pStyle w:val="Compact"/>
-              <w:jc w:val="right"/>
-            </w:pPr>
-            <w:r>
-              <w:t xml:space="preserve">completed</w:t>
-            </w:r>
-          </w:p>
-        </w:tc>
-        <w:tc>
-          <w:tcPr/>
-          <w:p>
-            <w:pPr>
-              <w:pStyle w:val="Compact"/>
-              <w:jc w:val="right"/>
-            </w:pPr>
-            <w:r>
-              <w:t xml:space="preserve">usable</w:t>
-            </w:r>
-          </w:p>
-        </w:tc>
-        <w:tc>
-          <w:tcPr/>
-          <w:p>
-            <w:pPr>
-              <w:pStyle w:val="Compact"/>
-              <w:jc w:val="right"/>
-            </w:pPr>
-            <w:r>
-              <w:t xml:space="preserve">PSNR (dB)</w:t>
-            </w:r>
-          </w:p>
-        </w:tc>
-        <w:tc>
-          <w:tcPr/>
-          <w:p>
-            <w:pPr>
-              <w:pStyle w:val="Compact"/>
-              <w:jc w:val="right"/>
-            </w:pPr>
-            <w:r>
-              <w:t xml:space="preserve">SSIM</w:t>
-            </w:r>
-          </w:p>
-        </w:tc>
-        <w:tc>
-          <w:tcPr/>
-          <w:p>
-            <w:pPr>
-              <w:pStyle w:val="Compact"/>
-              <w:jc w:val="right"/>
-            </w:pPr>
-            <w:r>
-              <w:t xml:space="preserve">seam offset (px)</w:t>
-            </w:r>
-          </w:p>
-        </w:tc>
-        <w:tc>
-          <w:tcPr/>
-          <w:p>
-            <w:pPr>
-              <w:pStyle w:val="Compact"/>
-              <w:jc w:val="right"/>
-            </w:pPr>
-            <w:r>
-              <w:t xml:space="preserve">runtime</w:t>
-            </w:r>
-          </w:p>
-        </w:tc>
-      </w:tr>
-      <w:tr>
-        <w:tc>
-          <w:tcPr/>
-          <w:p>
-            <w:pPr>
-              <w:pStyle w:val="Compact"/>
-              <w:jc w:val="left"/>
-            </w:pPr>
-            <w:r>
-              <w:t xml:space="preserve">Stitching (pose estimated)</w:t>
-            </w:r>
-          </w:p>
-        </w:tc>
-        <w:tc>
-          <w:tcPr/>
-          <w:p>
-            <w:pPr>
-              <w:pStyle w:val="Compact"/>
-              <w:jc w:val="right"/>
-            </w:pPr>
-            <w:r>
-              <w:t xml:space="preserve">8 / 11</w:t>
-            </w:r>
-          </w:p>
-        </w:tc>
-        <w:tc>
-          <w:tcPr/>
-          <w:p>
-            <w:pPr>
-              <w:pStyle w:val="Compact"/>
-              <w:jc w:val="right"/>
-            </w:pPr>
-            <w:r>
-              <w:rPr>
-                <w:bCs/>
-                <w:b/>
-              </w:rPr>
-              <w:t xml:space="preserve">6 / 11</w:t>
-            </w:r>
-          </w:p>
-        </w:tc>
-        <w:tc>
-          <w:tcPr/>
-          <w:p>
-            <w:pPr>
-              <w:pStyle w:val="Compact"/>
-              <w:jc w:val="right"/>
-            </w:pPr>
-            <w:r>
-              <w:t xml:space="preserve">22.98 ± 2.74</w:t>
-            </w:r>
-          </w:p>
-        </w:tc>
-        <w:tc>
-          <w:tcPr/>
-          <w:p>
-            <w:pPr>
-              <w:pStyle w:val="Compact"/>
-              <w:jc w:val="right"/>
-            </w:pPr>
-            <w:r>
-              <w:t xml:space="preserve">0.837 ± 0.060</w:t>
-            </w:r>
-          </w:p>
-        </w:tc>
-        <w:tc>
-          <w:tcPr/>
-          <w:p>
-            <w:pPr>
-              <w:pStyle w:val="Compact"/>
-              <w:jc w:val="right"/>
-            </w:pPr>
-            <w:r>
-              <w:t xml:space="preserve">0.14 (p95 0.53)</w:t>
-            </w:r>
-          </w:p>
-        </w:tc>
-        <w:tc>
-          <w:tcPr/>
-          <w:p>
-            <w:pPr>
-              <w:pStyle w:val="Compact"/>
-              <w:jc w:val="right"/>
-            </w:pPr>
-            <w:r>
-              <w:t xml:space="preserve">14.6 s</w:t>
-            </w:r>
-          </w:p>
-        </w:tc>
-      </w:tr>
-      <w:tr>
-        <w:tc>
-          <w:tcPr/>
-          <w:p>
-            <w:pPr>
-              <w:pStyle w:val="Compact"/>
-              <w:jc w:val="left"/>
-            </w:pPr>
-            <w:r>
-              <w:t xml:space="preserve">Reprojection (pose known)</w:t>
-            </w:r>
-          </w:p>
-        </w:tc>
-        <w:tc>
-          <w:tcPr/>
-          <w:p>
-            <w:pPr>
-              <w:pStyle w:val="Compact"/>
-              <w:jc w:val="right"/>
-            </w:pPr>
-            <w:r>
-              <w:t xml:space="preserve">11 / 11</w:t>
-            </w:r>
-          </w:p>
-        </w:tc>
-        <w:tc>
-          <w:tcPr/>
-          <w:p>
-            <w:pPr>
-              <w:pStyle w:val="Compact"/>
-              <w:jc w:val="right"/>
-            </w:pPr>
-            <w:r>
-              <w:rPr>
-                <w:bCs/>
-                <w:b/>
-              </w:rPr>
-              <w:t xml:space="preserve">11 / 11</w:t>
-            </w:r>
-          </w:p>
-        </w:tc>
-        <w:tc>
-          <w:tcPr/>
-          <w:p>
-            <w:pPr>
-              <w:pStyle w:val="Compact"/>
-              <w:jc w:val="right"/>
-            </w:pPr>
-            <w:r>
-              <w:rPr>
-                <w:bCs/>
-                <w:b/>
-              </w:rPr>
-              <w:t xml:space="preserve">26.87 ± 1.96</w:t>
-            </w:r>
-          </w:p>
-        </w:tc>
-        <w:tc>
-          <w:tcPr/>
-          <w:p>
-            <w:pPr>
-              <w:pStyle w:val="Compact"/>
-              <w:jc w:val="right"/>
-            </w:pPr>
-            <w:r>
-              <w:rPr>
-                <w:bCs/>
-                <w:b/>
-              </w:rPr>
-              <w:t xml:space="preserve">0.886 ± 0.039</w:t>
-            </w:r>
-          </w:p>
-        </w:tc>
-        <w:tc>
-          <w:tcPr/>
-          <w:p>
-            <w:pPr>
-              <w:pStyle w:val="Compact"/>
-              <w:jc w:val="right"/>
-            </w:pPr>
-            <w:r>
-              <w:rPr>
-                <w:bCs/>
-                <w:b/>
-              </w:rPr>
-              <w:t xml:space="preserve">0.10 (p95 0.23)</w:t>
-            </w:r>
-          </w:p>
-        </w:tc>
-        <w:tc>
-          <w:tcPr/>
-          <w:p>
-            <w:pPr>
-              <w:pStyle w:val="Compact"/>
-              <w:jc w:val="right"/>
-            </w:pPr>
-            <w:r>
-              <w:t xml:space="preserve">2.1 s</w:t>
-            </w:r>
-          </w:p>
-        </w:tc>
-      </w:tr>
-    </w:tbl>
+        <w:t xml:space="preserve">Remote Sensing of Environment</w:t>
+      </w:r>
+      <w:r>
+        <w:t xml:space="preserve"> </w:t>
+      </w:r>
+      <w:r>
+        <w:t xml:space="preserve">251, 112061.</w:t>
+      </w:r>
+      <w:r>
+        <w:t xml:space="preserve"> </w:t>
+      </w:r>
+      <w:r>
+        <w:t xml:space="preserve">https://doi.org/10.1016/j.rse.2020.112061</w:t>
+      </w:r>
+    </w:p>
     <w:p>
       <w:pPr>
         <w:pStyle w:val="BodyText"/>
       </w:pPr>
       <w:r>
-        <w:t xml:space="preserve">Aggregate figures refer to the</w:t>
+        <w:t xml:space="preserve">[14] Zhang, W., et al. (2016). An easy-to-use airborne LiDAR data filtering method</w:t>
+      </w:r>
+      <w:r>
+        <w:t xml:space="preserve"> </w:t>
+      </w:r>
+      <w:r>
+        <w:t xml:space="preserve">based on cloth simulation.</w:t>
       </w:r>
       <w:r>
         <w:t xml:space="preserve"> </w:t>
@@ -4675,25 +4209,19 @@
           <w:iCs/>
           <w:i/>
         </w:rPr>
-        <w:t xml:space="preserve">usable</w:t>
-      </w:r>
-      <w:r>
-        <w:t xml:space="preserve"> </w:t>
-      </w:r>
-      <w:r>
-        <w:t xml:space="preserve">runs; the two misregistered stitches</w:t>
-      </w:r>
-      <w:r>
-        <w:t xml:space="preserve"> </w:t>
-      </w:r>
-      <w:r>
-        <w:t xml:space="preserve">(8.6 and 11.7 dB) are excluded because they would otherwise dominate mean and</w:t>
-      </w:r>
-      <w:r>
-        <w:t xml:space="preserve"> </w:t>
-      </w:r>
-      <w:r>
-        <w:t xml:space="preserve">spread, and are reported separately below.</w:t>
+        <w:t xml:space="preserve">Remote Sensing</w:t>
+      </w:r>
+      <w:r>
+        <w:t xml:space="preserve"> </w:t>
+      </w:r>
+      <w:r>
+        <w:t xml:space="preserve">8(6), 501.</w:t>
+      </w:r>
+      <w:r>
+        <w:t xml:space="preserve"> </w:t>
+      </w:r>
+      <w:r>
+        <w:t xml:space="preserve">https://doi.org/10.3390/rs8060501</w:t>
       </w:r>
     </w:p>
     <w:p>
@@ -4701,773 +4229,41 @@
         <w:pStyle w:val="BodyText"/>
       </w:pPr>
       <w:r>
-        <w:t xml:space="preserve">The pose-based branch is better on every measure (+3.9 dB, +0.05 SSIM, a third</w:t>
-      </w:r>
-      <w:r>
-        <w:t xml:space="preserve"> </w:t>
-      </w:r>
-      <w:r>
-        <w:t xml:space="preserve">less local displacement) and reconstructs all eleven scenes, while stitching fails</w:t>
-      </w:r>
-      <w:r>
-        <w:t xml:space="preserve"> </w:t>
-      </w:r>
-      <w:r>
-        <w:t xml:space="preserve">on five: three times</w:t>
-      </w:r>
-      <w:r>
-        <w:t xml:space="preserve"> </w:t>
-      </w:r>
-      <w:r>
-        <w:rPr>
-          <w:rStyle w:val="VerbatimChar"/>
-        </w:rPr>
-        <w:t xml:space="preserve">enblend</w:t>
-      </w:r>
-      <w:r>
-        <w:t xml:space="preserve"> </w:t>
-      </w:r>
-      <w:r>
-        <w:t xml:space="preserve">aborts (excessive overlap, degenerate mask</w:t>
-      </w:r>
-      <w:r>
-        <w:t xml:space="preserve"> </w:t>
-      </w:r>
-      <w:r>
-        <w:t xml:space="preserve">geometry, no detectable seam) and twice a geometrically wrong panorama results</w:t>
-      </w:r>
-      <w:r>
-        <w:t xml:space="preserve"> </w:t>
-      </w:r>
-      <w:r>
-        <w:t xml:space="preserve">(confirmed under exhaustive search over rotation, tilt, and mirroring, staying</w:t>
-      </w:r>
-      <w:r>
-        <w:t xml:space="preserve"> </w:t>
-      </w:r>
-      <w:r>
-        <w:t xml:space="preserve">below 11.7 dB).</w:t>
-      </w:r>
-    </w:p>
-    <w:p>
-      <w:pPr>
-        <w:pStyle w:val="CaptionedFigure"/>
-      </w:pPr>
-      <w:r>
-        <w:drawing>
-          <wp:inline>
-            <wp:extent cx="5334000" cy="2255553"/>
-            <wp:effectExtent b="0" l="0" r="0" t="0"/>
-            <wp:docPr descr="Figure 2. Panorama evaluation against eleven CC0 references. The pose-based branch is more accurate and reconstructs every scene; the seam offset separates good from failed reconstructions by a factor of ~40 and is therefore usable as a ground-truth-free quality flag. Real captures with parallax lie ~56× above the synthetic case, which makes the synthetic figures a lower bound." title="" id="40" name="Picture"/>
-            <a:graphic>
-              <a:graphicData uri="http://schemas.openxmlformats.org/drawingml/2006/picture">
-                <pic:pic>
-                  <pic:nvPicPr>
-                    <pic:cNvPr descr="figures/fig2_evaluation.png" id="41" name="Picture"/>
-                    <pic:cNvPicPr>
-                      <a:picLocks noChangeArrowheads="1" noChangeAspect="1"/>
-                    </pic:cNvPicPr>
-                  </pic:nvPicPr>
-                  <pic:blipFill>
-                    <a:blip r:embed="rId29"/>
-                    <a:stretch>
-                      <a:fillRect/>
-                    </a:stretch>
-                  </pic:blipFill>
-                  <pic:spPr bwMode="auto">
-                    <a:xfrm>
-                      <a:off x="0" y="0"/>
-                      <a:ext cx="5334000" cy="2255553"/>
-                    </a:xfrm>
-                    <a:prstGeom prst="rect">
-                      <a:avLst/>
-                    </a:prstGeom>
-                    <a:noFill/>
-                    <a:ln w="9525">
-                      <a:noFill/>
-                      <a:headEnd/>
-                      <a:tailEnd/>
-                    </a:ln>
-                  </pic:spPr>
-                </pic:pic>
-              </a:graphicData>
-            </a:graphic>
-          </wp:inline>
-        </w:drawing>
-      </w:r>
-    </w:p>
-    <w:p>
-      <w:pPr>
-        <w:pStyle w:val="ImageCaption"/>
-      </w:pPr>
-      <w:r>
-        <w:rPr>
-          <w:bCs/>
-          <w:b/>
-        </w:rPr>
-        <w:t xml:space="preserve">Figure 2.</w:t>
-      </w:r>
-      <w:r>
-        <w:t xml:space="preserve"> </w:t>
-      </w:r>
-      <w:r>
-        <w:t xml:space="preserve">Panorama evaluation against eleven CC0 references. The pose-based</w:t>
-      </w:r>
-      <w:r>
-        <w:t xml:space="preserve"> </w:t>
-      </w:r>
-      <w:r>
-        <w:t xml:space="preserve">branch is more accurate and reconstructs every scene; the seam offset separates</w:t>
-      </w:r>
-      <w:r>
-        <w:t xml:space="preserve"> </w:t>
-      </w:r>
-      <w:r>
-        <w:t xml:space="preserve">good from failed reconstructions by a factor of ~40 and is therefore usable as a</w:t>
-      </w:r>
-      <w:r>
-        <w:t xml:space="preserve"> </w:t>
-      </w:r>
-      <w:r>
-        <w:t xml:space="preserve">ground-truth-free quality flag. Real captures with parallax lie ~56× above the</w:t>
-      </w:r>
-      <w:r>
-        <w:t xml:space="preserve"> </w:t>
-      </w:r>
-      <w:r>
-        <w:t xml:space="preserve">synthetic case, which makes the synthetic figures a lower bound.</w:t>
-      </w:r>
-    </w:p>
-    <w:p>
-      <w:pPr>
-        <w:pStyle w:val="BodyText"/>
-      </w:pPr>
-      <w:r>
-        <w:rPr>
-          <w:bCs/>
-          <w:b/>
-        </w:rPr>
-        <w:t xml:space="preserve">Seam offset as an automatic quality flag.</w:t>
-      </w:r>
-      <w:r>
-        <w:t xml:space="preserve"> </w:t>
-      </w:r>
-      <w:r>
-        <w:t xml:space="preserve">Block-wise phase correlation [9] against</w:t>
-      </w:r>
-      <w:r>
-        <w:t xml:space="preserve"> </w:t>
-      </w:r>
-      <w:r>
-        <w:t xml:space="preserve">the reference (64-px blocks, 50% overlap, low-structure blocks discarded)</w:t>
-      </w:r>
-      <w:r>
-        <w:t xml:space="preserve"> </w:t>
-      </w:r>
-      <w:r>
-        <w:t xml:space="preserve">separates good from failed reconstructions more sharply than PSNR or SSIM: median</w:t>
-      </w:r>
-      <w:r>
-        <w:t xml:space="preserve"> </w:t>
-      </w:r>
-      <w:r>
-        <w:t xml:space="preserve">seam offset 0.11–0.19 px (good stitches) and 0.07–0.13 px (reprojection) versus</w:t>
-      </w:r>
-      <w:r>
-        <w:t xml:space="preserve"> </w:t>
-      </w:r>
-      <w:r>
-        <w:t xml:space="preserve">5.95–6.14 px (failed stitches) — a factor of ~40, interpretable without knowing</w:t>
-      </w:r>
-      <w:r>
-        <w:t xml:space="preserve"> </w:t>
-      </w:r>
-      <w:r>
-        <w:t xml:space="preserve">the ground truth of a single scene, and thus a robust threshold (here &gt; 1 px</w:t>
-      </w:r>
-      <w:r>
-        <w:t xml:space="preserve"> </w:t>
-      </w:r>
-      <w:r>
-        <w:t xml:space="preserve">median) for a GUI quality flag.</w:t>
-      </w:r>
-    </w:p>
-    <w:bookmarkStart w:id="42" w:name="Xdd2eeefe0fa72e9ff9dff604cfb03bd70b719e9"/>
-    <w:p>
-      <w:pPr>
-        <w:pStyle w:val="Heading3"/>
-      </w:pPr>
-      <w:r>
-        <w:t xml:space="preserve">Real captures: the actual cost of parallax</w:t>
-      </w:r>
-    </w:p>
-    <w:p>
-      <w:pPr>
-        <w:pStyle w:val="FirstParagraph"/>
-      </w:pPr>
-      <w:r>
-        <w:t xml:space="preserve">The caveat that the synthetic figures are upper bounds can be resolved with open</w:t>
-      </w:r>
-      <w:r>
-        <w:t xml:space="preserve"> </w:t>
-      </w:r>
-      <w:r>
-        <w:t xml:space="preserve">data.</w:t>
-      </w:r>
-      <w:r>
-        <w:t xml:space="preserve"> </w:t>
-      </w:r>
-      <w:r>
-        <w:rPr>
-          <w:rStyle w:val="VerbatimChar"/>
-        </w:rPr>
-        <w:t xml:space="preserve">eval_seams.py</w:t>
-      </w:r>
-      <w:r>
-        <w:t xml:space="preserve"> </w:t>
-      </w:r>
-      <w:r>
-        <w:t xml:space="preserve">measures seam offset</w:t>
-      </w:r>
-      <w:r>
-        <w:t xml:space="preserve"> </w:t>
-      </w:r>
-      <w:r>
-        <w:rPr>
-          <w:bCs/>
-          <w:b/>
-        </w:rPr>
-        <w:t xml:space="preserve">without a reference panorama</w:t>
-      </w:r>
-      <w:r>
-        <w:t xml:space="preserve">:</w:t>
-      </w:r>
-      <w:r>
-        <w:t xml:space="preserve"> </w:t>
-      </w:r>
-      <w:r>
-        <w:rPr>
-          <w:rStyle w:val="VerbatimChar"/>
-        </w:rPr>
-        <w:t xml:space="preserve">nona</w:t>
-      </w:r>
-      <w:r>
-        <w:t xml:space="preserve"> </w:t>
-      </w:r>
-      <w:r>
-        <w:t xml:space="preserve">remaps each capture separately into the panorama canvas, and in the</w:t>
-      </w:r>
-      <w:r>
-        <w:t xml:space="preserve"> </w:t>
-      </w:r>
-      <w:r>
-        <w:t xml:space="preserve">overlaps two source images show the same viewing direction — with perfect</w:t>
-      </w:r>
-      <w:r>
-        <w:t xml:space="preserve"> </w:t>
-      </w:r>
-      <w:r>
-        <w:t xml:space="preserve">registration and rotation about the nodal point they would be identical there.</w:t>
-      </w:r>
-      <w:r>
-        <w:t xml:space="preserve"> </w:t>
-      </w:r>
-      <w:r>
-        <w:t xml:space="preserve">Their local displacement is the error.</w:t>
-      </w:r>
-    </w:p>
-    <w:p>
-      <w:pPr>
-        <w:pStyle w:val="BodyText"/>
-      </w:pPr>
-      <w:r>
-        <w:t xml:space="preserve">The real capture is</w:t>
-      </w:r>
-      <w:r>
-        <w:t xml:space="preserve"> </w:t>
-      </w:r>
-      <w:r>
-        <w:rPr>
-          <w:bCs/>
-          <w:b/>
-        </w:rPr>
-        <w:t xml:space="preserve">PASSTA LunchRoom</w:t>
-      </w:r>
-      <w:r>
-        <w:t xml:space="preserve"> </w:t>
-      </w:r>
-      <w:r>
-        <w:t xml:space="preserve">[10] (Zenodo, CC BY 4.0): 72 photographs from</w:t>
-      </w:r>
-      <w:r>
-        <w:t xml:space="preserve"> </w:t>
-      </w:r>
-      <w:r>
-        <w:t xml:space="preserve">a rotating Canon EOS 70D with supplied calibration. As a control, synthetic</w:t>
-      </w:r>
-      <w:r>
-        <w:t xml:space="preserve"> </w:t>
-      </w:r>
-      <w:r>
-        <w:t xml:space="preserve">captures with</w:t>
-      </w:r>
-      <w:r>
-        <w:t xml:space="preserve"> </w:t>
-      </w:r>
-      <w:r>
-        <w:rPr>
-          <w:bCs/>
-          <w:b/>
-        </w:rPr>
-        <w:t xml:space="preserve">identical geometry</w:t>
-      </w:r>
-      <w:r>
-        <w:t xml:space="preserve"> </w:t>
-      </w:r>
-      <w:r>
-        <w:t xml:space="preserve">are rendered from a CC0 panorama — 18</w:t>
-      </w:r>
-      <w:r>
-        <w:t xml:space="preserve"> </w:t>
-      </w:r>
-      <w:r>
-        <w:t xml:space="preserve">positions, 93.6° rectilinear, same stitching chain, same canvas width. The only</w:t>
-      </w:r>
-      <w:r>
-        <w:t xml:space="preserve"> </w:t>
-      </w:r>
-      <w:r>
-        <w:t xml:space="preserve">difference is that the real captures carry genuine parallax, sensor noise, and</w:t>
-      </w:r>
-      <w:r>
-        <w:t xml:space="preserve"> </w:t>
-      </w:r>
-      <w:r>
-        <w:t xml:space="preserve">exposure differences:</w:t>
-      </w:r>
-    </w:p>
-    <w:tbl>
-      <w:tblPr>
-        <w:tblStyle w:val="Table"/>
-        <w:tblW w:type="auto" w:w="0"/>
-        <w:tblLook w:firstRow="1" w:lastRow="0" w:firstColumn="0" w:lastColumn="0" w:noHBand="0" w:noVBand="0" w:val="0020"/>
-        <w:jc w:val="start"/>
-      </w:tblPr>
-      <w:tblGrid>
-        <w:gridCol w:w="2640"/>
-        <w:gridCol w:w="2640"/>
-        <w:gridCol w:w="2640"/>
-      </w:tblGrid>
-      <w:tr>
-        <w:trPr>
-          <w:tblHeader w:val="true"/>
-        </w:trPr>
-        <w:tc>
-          <w:tcPr/>
-          <w:p>
-            <w:pPr>
-              <w:pStyle w:val="Compact"/>
-            </w:pPr>
-          </w:p>
-        </w:tc>
-        <w:tc>
-          <w:tcPr/>
-          <w:p>
-            <w:pPr>
-              <w:pStyle w:val="Compact"/>
-              <w:jc w:val="right"/>
-            </w:pPr>
-            <w:r>
-              <w:t xml:space="preserve">synthetic (parallax-free)</w:t>
-            </w:r>
-          </w:p>
-        </w:tc>
-        <w:tc>
-          <w:tcPr/>
-          <w:p>
-            <w:pPr>
-              <w:pStyle w:val="Compact"/>
-              <w:jc w:val="right"/>
-            </w:pPr>
-            <w:r>
-              <w:t xml:space="preserve">real (rotating camera)</w:t>
-            </w:r>
-          </w:p>
-        </w:tc>
-      </w:tr>
-      <w:tr>
-        <w:tc>
-          <w:tcPr/>
-          <w:p>
-            <w:pPr>
-              <w:pStyle w:val="Compact"/>
-              <w:jc w:val="left"/>
-            </w:pPr>
-            <w:r>
-              <w:t xml:space="preserve">seam offset, median</w:t>
-            </w:r>
-          </w:p>
-        </w:tc>
-        <w:tc>
-          <w:tcPr/>
-          <w:p>
-            <w:pPr>
-              <w:pStyle w:val="Compact"/>
-              <w:jc w:val="right"/>
-            </w:pPr>
-            <w:r>
-              <w:rPr>
-                <w:bCs/>
-                <w:b/>
-              </w:rPr>
-              <w:t xml:space="preserve">0.07 px</w:t>
-            </w:r>
-          </w:p>
-        </w:tc>
-        <w:tc>
-          <w:tcPr/>
-          <w:p>
-            <w:pPr>
-              <w:pStyle w:val="Compact"/>
-              <w:jc w:val="right"/>
-            </w:pPr>
-            <w:r>
-              <w:rPr>
-                <w:bCs/>
-                <w:b/>
-              </w:rPr>
-              <w:t xml:space="preserve">3.95 px</w:t>
-            </w:r>
-          </w:p>
-        </w:tc>
-      </w:tr>
-      <w:tr>
-        <w:tc>
-          <w:tcPr/>
-          <w:p>
-            <w:pPr>
-              <w:pStyle w:val="Compact"/>
-              <w:jc w:val="left"/>
-            </w:pPr>
-            <w:r>
-              <w:t xml:space="preserve">p95</w:t>
-            </w:r>
-          </w:p>
-        </w:tc>
-        <w:tc>
-          <w:tcPr/>
-          <w:p>
-            <w:pPr>
-              <w:pStyle w:val="Compact"/>
-              <w:jc w:val="right"/>
-            </w:pPr>
-            <w:r>
-              <w:t xml:space="preserve">0.18 px</w:t>
-            </w:r>
-          </w:p>
-        </w:tc>
-        <w:tc>
-          <w:tcPr/>
-          <w:p>
-            <w:pPr>
-              <w:pStyle w:val="Compact"/>
-              <w:jc w:val="right"/>
-            </w:pPr>
-            <w:r>
-              <w:t xml:space="preserve">24.78 px</w:t>
-            </w:r>
-          </w:p>
-        </w:tc>
-      </w:tr>
-      <w:tr>
-        <w:tc>
-          <w:tcPr/>
-          <w:p>
-            <w:pPr>
-              <w:pStyle w:val="Compact"/>
-              <w:jc w:val="left"/>
-            </w:pPr>
-            <w:r>
-              <w:t xml:space="preserve">maximum</w:t>
-            </w:r>
-          </w:p>
-        </w:tc>
-        <w:tc>
-          <w:tcPr/>
-          <w:p>
-            <w:pPr>
-              <w:pStyle w:val="Compact"/>
-              <w:jc w:val="right"/>
-            </w:pPr>
-            <w:r>
-              <w:t xml:space="preserve">0.48 px</w:t>
-            </w:r>
-          </w:p>
-        </w:tc>
-        <w:tc>
-          <w:tcPr/>
-          <w:p>
-            <w:pPr>
-              <w:pStyle w:val="Compact"/>
-              <w:jc w:val="right"/>
-            </w:pPr>
-            <w:r>
-              <w:t xml:space="preserve">29.99 px</w:t>
-            </w:r>
-          </w:p>
-        </w:tc>
-      </w:tr>
-      <w:tr>
-        <w:tc>
-          <w:tcPr/>
-          <w:p>
-            <w:pPr>
-              <w:pStyle w:val="Compact"/>
-              <w:jc w:val="left"/>
-            </w:pPr>
-            <w:r>
-              <w:t xml:space="preserve">blocks above 1 px</w:t>
-            </w:r>
-          </w:p>
-        </w:tc>
-        <w:tc>
-          <w:tcPr/>
-          <w:p>
-            <w:pPr>
-              <w:pStyle w:val="Compact"/>
-              <w:jc w:val="right"/>
-            </w:pPr>
-            <w:r>
-              <w:t xml:space="preserve">0.0 %</w:t>
-            </w:r>
-          </w:p>
-        </w:tc>
-        <w:tc>
-          <w:tcPr/>
-          <w:p>
-            <w:pPr>
-              <w:pStyle w:val="Compact"/>
-              <w:jc w:val="right"/>
-            </w:pPr>
-            <w:r>
-              <w:t xml:space="preserve">67.5 %</w:t>
-            </w:r>
-          </w:p>
-        </w:tc>
-      </w:tr>
-    </w:tbl>
-    <w:p>
-      <w:pPr>
-        <w:pStyle w:val="BodyText"/>
-      </w:pPr>
-      <w:r>
-        <w:rPr>
-          <w:bCs/>
-          <w:b/>
-        </w:rPr>
-        <w:t xml:space="preserve">The median is ~56× higher and the 95th percentile ~140×.</w:t>
-      </w:r>
-      <w:r>
-        <w:t xml:space="preserve"> </w:t>
-      </w:r>
-      <w:r>
-        <w:t xml:space="preserve">This substantiates</w:t>
-      </w:r>
-      <w:r>
-        <w:t xml:space="preserve"> </w:t>
-      </w:r>
-      <w:r>
-        <w:t xml:space="preserve">what could previously only be asserted: the synthetic evaluation understates the</w:t>
-      </w:r>
-      <w:r>
-        <w:t xml:space="preserve"> </w:t>
-      </w:r>
-      <w:r>
-        <w:t xml:space="preserve">real stitching error by orders of magnitude, and the gap measured there between</w:t>
-      </w:r>
-      <w:r>
-        <w:t xml:space="preserve"> </w:t>
-      </w:r>
-      <w:r>
-        <w:t xml:space="preserve">the two branches is a</w:t>
-      </w:r>
-      <w:r>
-        <w:t xml:space="preserve"> </w:t>
-      </w:r>
-      <w:r>
-        <w:rPr>
-          <w:bCs/>
-          <w:b/>
-        </w:rPr>
-        <w:t xml:space="preserve">lower bound</w:t>
-      </w:r>
-      <w:r>
-        <w:t xml:space="preserve">.</w:t>
-      </w:r>
-    </w:p>
-    <w:p>
-      <w:pPr>
-        <w:pStyle w:val="BodyText"/>
-      </w:pPr>
+        <w:t xml:space="preserve">[15] Brooke, J. (1996). SUS: a</w:t>
+      </w:r>
+      <w:r>
+        <w:t xml:space="preserve"> </w:t>
+      </w:r>
+      <w:r>
+        <w:t xml:space="preserve">“</w:t>
+      </w:r>
+      <w:r>
+        <w:t xml:space="preserve">quick and dirty</w:t>
+      </w:r>
+      <w:r>
+        <w:t xml:space="preserve">”</w:t>
+      </w:r>
+      <w:r>
+        <w:t xml:space="preserve"> </w:t>
+      </w:r>
+      <w:r>
+        <w:t xml:space="preserve">usability scale. In:</w:t>
+      </w:r>
+      <w:r>
+        <w:t xml:space="preserve"> </w:t>
+      </w:r>
       <w:r>
         <w:rPr>
           <w:iCs/>
           <w:i/>
         </w:rPr>
-        <w:t xml:space="preserve">Interpretation.</w:t>
-      </w:r>
-      <w:r>
-        <w:t xml:space="preserve"> </w:t>
-      </w:r>
-      <w:r>
-        <w:t xml:space="preserve">PASSTA LunchRoom is an indoor scene with nearby objects, and</w:t>
-      </w:r>
-      <w:r>
-        <w:t xml:space="preserve"> </w:t>
-      </w:r>
-      <w:r>
-        <w:t xml:space="preserve">parallax is worst at short range. An outdoor stand with predominantly distant</w:t>
-      </w:r>
-      <w:r>
-        <w:t xml:space="preserve"> </w:t>
-      </w:r>
-      <w:r>
-        <w:t xml:space="preserve">objects will fare better; the 3.95 px is therefore an example of the unfavourable</w:t>
-      </w:r>
-      <w:r>
-        <w:t xml:space="preserve"> </w:t>
-      </w:r>
-      <w:r>
-        <w:t xml:space="preserve">case, not a universal value. Part of the difference also stems from noise and</w:t>
-      </w:r>
-      <w:r>
-        <w:t xml:space="preserve"> </w:t>
-      </w:r>
-      <w:r>
-        <w:t xml:space="preserve">exposure variation rather than parallax alone. The pose-based branch is unaffected</w:t>
-      </w:r>
-      <w:r>
-        <w:t xml:space="preserve"> </w:t>
-      </w:r>
-      <w:r>
-        <w:t xml:space="preserve">by all of this: it has no overlap seams, because every viewing direction comes</w:t>
-      </w:r>
-      <w:r>
-        <w:t xml:space="preserve"> </w:t>
-      </w:r>
-      <w:r>
-        <w:t xml:space="preserve">from exactly one camera.</w:t>
-      </w:r>
-    </w:p>
-    <w:p>
-      <w:pPr>
-        <w:pStyle w:val="BodyText"/>
-      </w:pPr>
+        <w:t xml:space="preserve">Usability</w:t>
+      </w:r>
       <w:r>
         <w:rPr>
           <w:iCs/>
           <w:i/>
         </w:rPr>
-        <w:t xml:space="preserve">Honesty of the numbers.</w:t>
-      </w:r>
-      <w:r>
-        <w:t xml:space="preserve"> </w:t>
-      </w:r>
-      <w:r>
-        <w:t xml:space="preserve">All synthetic captures share one nodal point; the</w:t>
-      </w:r>
-      <w:r>
-        <w:t xml:space="preserve"> </w:t>
-      </w:r>
-      <w:r>
-        <w:t xml:space="preserve">PSNR/SSIM stitching figures are therefore</w:t>
-      </w:r>
-      <w:r>
-        <w:t xml:space="preserve"> </w:t>
-      </w:r>
-      <w:r>
-        <w:rPr>
-          <w:bCs/>
-          <w:b/>
-        </w:rPr>
-        <w:t xml:space="preserve">upper bounds</w:t>
-      </w:r>
-      <w:r>
-        <w:t xml:space="preserve">, and the section above</w:t>
-      </w:r>
-      <w:r>
-        <w:t xml:space="preserve"> </w:t>
-      </w:r>
-      <w:r>
-        <w:t xml:space="preserve">quantifies the distance to reality (~56× in median seam offset). No sensor noise, exposure differences, or distortion are simulated — the</w:t>
-      </w:r>
-      <w:r>
-        <w:t xml:space="preserve"> </w:t>
-      </w:r>
-      <w:r>
-        <w:t xml:space="preserve">geometry of the chain is measured, not camera image quality. Absolute PSNR is</w:t>
-      </w:r>
-      <w:r>
-        <w:t xml:space="preserve"> </w:t>
-      </w:r>
-      <w:r>
-        <w:t xml:space="preserve">capped by the resolution chain and is meaningful only in the comparison of the two</w:t>
-      </w:r>
-      <w:r>
-        <w:t xml:space="preserve"> </w:t>
-      </w:r>
-      <w:r>
-        <w:t xml:space="preserve">branches. The reprojection figures hold only since switching to bilinear sampling;</w:t>
-      </w:r>
-      <w:r>
-        <w:t xml:space="preserve"> </w:t>
-      </w:r>
-      <w:r>
-        <w:t xml:space="preserve">with nearest-neighbour sampling the same branch scored 25.4 dB / SSIM 0.871</w:t>
-      </w:r>
-      <w:r>
-        <w:t xml:space="preserve"> </w:t>
-      </w:r>
-      <w:r>
-        <w:t xml:space="preserve">instead of 28.2 / 0.935 (ph-mossy-forest) — an implementation artefact that could</w:t>
-      </w:r>
-      <w:r>
-        <w:t xml:space="preserve"> </w:t>
-      </w:r>
-      <w:r>
-        <w:t xml:space="preserve">have been reported as a property of the method.</w:t>
-      </w:r>
-    </w:p>
-    <w:p>
-      <w:pPr>
-        <w:pStyle w:val="BodyText"/>
-      </w:pPr>
-      <w:r>
-        <w:rPr>
-          <w:bCs/>
-          <w:b/>
-        </w:rPr>
-        <w:t xml:space="preserve">Runtime per input class, end to end.</w:t>
-      </w:r>
-      <w:r>
-        <w:t xml:space="preserve"> </w:t>
-      </w:r>
-      <w:r>
-        <w:t xml:space="preserve">Measured through the running</w:t>
-      </w:r>
-      <w:r>
-        <w:t xml:space="preserve"> </w:t>
-      </w:r>
-      <w:r>
-        <w:t xml:space="preserve">containerized service — upload, queue, processing, and publication included — with</w:t>
-      </w:r>
-      <w:r>
-        <w:t xml:space="preserve"> </w:t>
-      </w:r>
-      <w:r>
-        <w:t xml:space="preserve">the input type</w:t>
-      </w:r>
-      <w:r>
         <w:t xml:space="preserve"> </w:t>
       </w:r>
       <w:r>
@@ -5475,376 +4271,18 @@
           <w:iCs/>
           <w:i/>
         </w:rPr>
-        <w:t xml:space="preserve">not</w:t>
-      </w:r>
-      <w:r>
-        <w:t xml:space="preserve"> </w:t>
-      </w:r>
-      <w:r>
-        <w:t xml:space="preserve">declared, so the chain detects it itself:</w:t>
-      </w:r>
-    </w:p>
-    <w:tbl>
-      <w:tblPr>
-        <w:tblStyle w:val="Table"/>
-        <w:tblW w:type="pct" w:w="5000"/>
-        <w:tblLook w:firstRow="1" w:lastRow="0" w:firstColumn="0" w:lastColumn="0" w:noHBand="0" w:noVBand="0" w:val="0020"/>
-        <w:jc w:val="start"/>
-      </w:tblPr>
-      <w:tblGrid>
-        <w:gridCol w:w="1320"/>
-        <w:gridCol w:w="1320"/>
-        <w:gridCol w:w="1320"/>
-        <w:gridCol w:w="1320"/>
-        <w:gridCol w:w="1320"/>
-        <w:gridCol w:w="1320"/>
-      </w:tblGrid>
-      <w:tr>
-        <w:trPr>
-          <w:tblHeader w:val="true"/>
-        </w:trPr>
-        <w:tc>
-          <w:tcPr/>
-          <w:p>
-            <w:pPr>
-              <w:pStyle w:val="Compact"/>
-              <w:jc w:val="left"/>
-            </w:pPr>
-            <w:r>
-              <w:t xml:space="preserve">Input class</w:t>
-            </w:r>
-          </w:p>
-        </w:tc>
-        <w:tc>
-          <w:tcPr/>
-          <w:p>
-            <w:pPr>
-              <w:pStyle w:val="Compact"/>
-              <w:jc w:val="right"/>
-            </w:pPr>
-            <w:r>
-              <w:t xml:space="preserve">captures</w:t>
-            </w:r>
-          </w:p>
-        </w:tc>
-        <w:tc>
-          <w:tcPr/>
-          <w:p>
-            <w:pPr>
-              <w:pStyle w:val="Compact"/>
-              <w:jc w:val="right"/>
-            </w:pPr>
-            <w:r>
-              <w:t xml:space="preserve">input</w:t>
-            </w:r>
-          </w:p>
-        </w:tc>
-        <w:tc>
-          <w:tcPr/>
-          <w:p>
-            <w:pPr>
-              <w:pStyle w:val="Compact"/>
-              <w:jc w:val="right"/>
-            </w:pPr>
-            <w:r>
-              <w:t xml:space="preserve">upload</w:t>
-            </w:r>
-          </w:p>
-        </w:tc>
-        <w:tc>
-          <w:tcPr/>
-          <w:p>
-            <w:pPr>
-              <w:pStyle w:val="Compact"/>
-              <w:jc w:val="right"/>
-            </w:pPr>
-            <w:r>
-              <w:t xml:space="preserve">processing</w:t>
-            </w:r>
-          </w:p>
-        </w:tc>
-        <w:tc>
-          <w:tcPr/>
-          <w:p>
-            <w:pPr>
-              <w:pStyle w:val="Compact"/>
-              <w:jc w:val="right"/>
-            </w:pPr>
-            <w:r>
-              <w:rPr>
-                <w:bCs/>
-                <w:b/>
-              </w:rPr>
-              <w:t xml:space="preserve">total</w:t>
-            </w:r>
-          </w:p>
-        </w:tc>
-      </w:tr>
-      <w:tr>
-        <w:tc>
-          <w:tcPr/>
-          <w:p>
-            <w:pPr>
-              <w:pStyle w:val="Compact"/>
-              <w:jc w:val="left"/>
-            </w:pPr>
-            <w:r>
-              <w:t xml:space="preserve">Consumer 360° (finished equirect)</w:t>
-            </w:r>
-          </w:p>
-        </w:tc>
-        <w:tc>
-          <w:tcPr/>
-          <w:p>
-            <w:pPr>
-              <w:pStyle w:val="Compact"/>
-              <w:jc w:val="right"/>
-            </w:pPr>
-            <w:r>
-              <w:t xml:space="preserve">1</w:t>
-            </w:r>
-          </w:p>
-        </w:tc>
-        <w:tc>
-          <w:tcPr/>
-          <w:p>
-            <w:pPr>
-              <w:pStyle w:val="Compact"/>
-              <w:jc w:val="right"/>
-            </w:pPr>
-            <w:r>
-              <w:t xml:space="preserve">2.5 MB</w:t>
-            </w:r>
-          </w:p>
-        </w:tc>
-        <w:tc>
-          <w:tcPr/>
-          <w:p>
-            <w:pPr>
-              <w:pStyle w:val="Compact"/>
-              <w:jc w:val="right"/>
-            </w:pPr>
-            <w:r>
-              <w:t xml:space="preserve">0.2 s</w:t>
-            </w:r>
-          </w:p>
-        </w:tc>
-        <w:tc>
-          <w:tcPr/>
-          <w:p>
-            <w:pPr>
-              <w:pStyle w:val="Compact"/>
-              <w:jc w:val="right"/>
-            </w:pPr>
-            <w:r>
-              <w:t xml:space="preserve">2.0 s</w:t>
-            </w:r>
-          </w:p>
-        </w:tc>
-        <w:tc>
-          <w:tcPr/>
-          <w:p>
-            <w:pPr>
-              <w:pStyle w:val="Compact"/>
-              <w:jc w:val="right"/>
-            </w:pPr>
-            <w:r>
-              <w:rPr>
-                <w:bCs/>
-                <w:b/>
-              </w:rPr>
-              <w:t xml:space="preserve">2.2 s</w:t>
-            </w:r>
-          </w:p>
-        </w:tc>
-      </w:tr>
-      <w:tr>
-        <w:tc>
-          <w:tcPr/>
-          <w:p>
-            <w:pPr>
-              <w:pStyle w:val="Compact"/>
-              <w:jc w:val="left"/>
-            </w:pPr>
-            <w:r>
-              <w:t xml:space="preserve">DSLR/fisheye (stitching)</w:t>
-            </w:r>
-          </w:p>
-        </w:tc>
-        <w:tc>
-          <w:tcPr/>
-          <w:p>
-            <w:pPr>
-              <w:pStyle w:val="Compact"/>
-              <w:jc w:val="right"/>
-            </w:pPr>
-            <w:r>
-              <w:t xml:space="preserve">18</w:t>
-            </w:r>
-          </w:p>
-        </w:tc>
-        <w:tc>
-          <w:tcPr/>
-          <w:p>
-            <w:pPr>
-              <w:pStyle w:val="Compact"/>
-              <w:jc w:val="right"/>
-            </w:pPr>
-            <w:r>
-              <w:t xml:space="preserve">6.9 MB</w:t>
-            </w:r>
-          </w:p>
-        </w:tc>
-        <w:tc>
-          <w:tcPr/>
-          <w:p>
-            <w:pPr>
-              <w:pStyle w:val="Compact"/>
-              <w:jc w:val="right"/>
-            </w:pPr>
-            <w:r>
-              <w:t xml:space="preserve">0.4 s</w:t>
-            </w:r>
-          </w:p>
-        </w:tc>
-        <w:tc>
-          <w:tcPr/>
-          <w:p>
-            <w:pPr>
-              <w:pStyle w:val="Compact"/>
-              <w:jc w:val="right"/>
-            </w:pPr>
-            <w:r>
-              <w:t xml:space="preserve">69.3 s</w:t>
-            </w:r>
-          </w:p>
-        </w:tc>
-        <w:tc>
-          <w:tcPr/>
-          <w:p>
-            <w:pPr>
-              <w:pStyle w:val="Compact"/>
-              <w:jc w:val="right"/>
-            </w:pPr>
-            <w:r>
-              <w:rPr>
-                <w:bCs/>
-                <w:b/>
-              </w:rPr>
-              <w:t xml:space="preserve">69.7 s</w:t>
-            </w:r>
-          </w:p>
-        </w:tc>
-      </w:tr>
-      <w:tr>
-        <w:tc>
-          <w:tcPr/>
-          <w:p>
-            <w:pPr>
-              <w:pStyle w:val="Compact"/>
-              <w:jc w:val="left"/>
-            </w:pPr>
-            <w:r>
-              <w:t xml:space="preserve">TLS scan (E57, reprojection)</w:t>
-            </w:r>
-          </w:p>
-        </w:tc>
-        <w:tc>
-          <w:tcPr/>
-          <w:p>
-            <w:pPr>
-              <w:pStyle w:val="Compact"/>
-              <w:jc w:val="right"/>
-            </w:pPr>
-            <w:r>
-              <w:t xml:space="preserve">1</w:t>
-            </w:r>
-          </w:p>
-        </w:tc>
-        <w:tc>
-          <w:tcPr/>
-          <w:p>
-            <w:pPr>
-              <w:pStyle w:val="Compact"/>
-              <w:jc w:val="right"/>
-            </w:pPr>
-            <w:r>
-              <w:t xml:space="preserve">177.9 MB</w:t>
-            </w:r>
-          </w:p>
-        </w:tc>
-        <w:tc>
-          <w:tcPr/>
-          <w:p>
-            <w:pPr>
-              <w:pStyle w:val="Compact"/>
-              <w:jc w:val="right"/>
-            </w:pPr>
-            <w:r>
-              <w:t xml:space="preserve">4.8 s</w:t>
-            </w:r>
-          </w:p>
-        </w:tc>
-        <w:tc>
-          <w:tcPr/>
-          <w:p>
-            <w:pPr>
-              <w:pStyle w:val="Compact"/>
-              <w:jc w:val="right"/>
-            </w:pPr>
-            <w:r>
-              <w:t xml:space="preserve">27.7 s</w:t>
-            </w:r>
-          </w:p>
-        </w:tc>
-        <w:tc>
-          <w:tcPr/>
-          <w:p>
-            <w:pPr>
-              <w:pStyle w:val="Compact"/>
-              <w:jc w:val="right"/>
-            </w:pPr>
-            <w:r>
-              <w:rPr>
-                <w:bCs/>
-                <w:b/>
-              </w:rPr>
-              <w:t xml:space="preserve">32.5 s</w:t>
-            </w:r>
-          </w:p>
-        </w:tc>
-      </w:tr>
-    </w:tbl>
+        <w:t xml:space="preserve">Evaluation in Industry</w:t>
+      </w:r>
+      <w:r>
+        <w:t xml:space="preserve">, Taylor &amp; Francis, 189–194.</w:t>
+      </w:r>
+    </w:p>
     <w:p>
       <w:pPr>
         <w:pStyle w:val="BodyText"/>
       </w:pPr>
       <w:r>
-        <w:t xml:space="preserve">(Medians of two runs each, consumer CPU.) The input class was detected correctly</w:t>
-      </w:r>
-      <w:r>
-        <w:t xml:space="preserve"> </w:t>
-      </w:r>
-      <w:r>
-        <w:t xml:space="preserve">in all six runs — an independent confirmation of the dispatch described in</w:t>
-      </w:r>
-      <w:r>
-        <w:t xml:space="preserve"> </w:t>
-      </w:r>
-      <w:r>
-        <w:t xml:space="preserve">Section 2.1. Note that the most expensive case is not the largest dataset: the</w:t>
-      </w:r>
-      <w:r>
-        <w:t xml:space="preserve"> </w:t>
-      </w:r>
-      <w:r>
-        <w:t xml:space="preserve">178 MB scan finishes in 32 s while 6.9 MB of individual frames take 70 s. Cost</w:t>
-      </w:r>
-      <w:r>
-        <w:t xml:space="preserve"> </w:t>
-      </w:r>
-      <w:r>
-        <w:t xml:space="preserve">comes from</w:t>
+        <w:t xml:space="preserve">[16] Sauro, J., Lewis, J. R. (2016).</w:t>
       </w:r>
       <w:r>
         <w:t xml:space="preserve"> </w:t>
@@ -5854,383 +4292,13 @@
           <w:iCs/>
           <w:i/>
         </w:rPr>
-        <w:t xml:space="preserve">registration</w:t>
-      </w:r>
-      <w:r>
-        <w:t xml:space="preserve">, not data volume — precisely what pose-based</w:t>
-      </w:r>
-      <w:r>
-        <w:t xml:space="preserve"> </w:t>
-      </w:r>
-      <w:r>
-        <w:t xml:space="preserve">reprojection avoids. No manual intervention was required in any class.</w:t>
-      </w:r>
-    </w:p>
-    <w:bookmarkEnd w:id="42"/>
-    <w:bookmarkEnd w:id="43"/>
-    <w:bookmarkStart w:id="44" w:name="impact-1"/>
-    <w:p>
-      <w:pPr>
-        <w:pStyle w:val="Heading2"/>
-      </w:pPr>
-      <w:r>
-        <w:t xml:space="preserve">4. Impact</w:t>
-      </w:r>
-    </w:p>
-    <w:p>
-      <w:pPr>
-        <w:pStyle w:val="FirstParagraph"/>
-      </w:pPr>
-      <w:r>
-        <w:t xml:space="preserve">The tool makes reproducible, self-hosted 360°/3D documentation accessible without</w:t>
-      </w:r>
-      <w:r>
-        <w:t xml:space="preserve"> </w:t>
-      </w:r>
-      <w:r>
-        <w:t xml:space="preserve">vendor lock-in and across the full device–cost spectrum. Two contributions are of</w:t>
-      </w:r>
-      <w:r>
-        <w:t xml:space="preserve"> </w:t>
-      </w:r>
-      <w:r>
-        <w:t xml:space="preserve">wider use. First, it turns the routinely discarded, pose-bearing scanner RGB</w:t>
-      </w:r>
-      <w:r>
-        <w:t xml:space="preserve"> </w:t>
-      </w:r>
-      <w:r>
-        <w:t xml:space="preserve">images into first-class navigable panoramas and data carriers; the evaluation</w:t>
-      </w:r>
-      <w:r>
-        <w:t xml:space="preserve"> </w:t>
-      </w:r>
-      <w:r>
-        <w:t xml:space="preserve">quantifies why this is preferable when pose is available (seamless, ~7× faster,</w:t>
-      </w:r>
-      <w:r>
-        <w:t xml:space="preserve"> </w:t>
-      </w:r>
-      <w:r>
-        <w:t xml:space="preserve">no stitching failures). Second, the seam-offset metric provides a ground-truth-free</w:t>
-      </w:r>
-      <w:r>
-        <w:t xml:space="preserve"> </w:t>
-      </w:r>
-      <w:r>
-        <w:t xml:space="preserve">quality signal that can gate automated batch processing. For environmental and</w:t>
-      </w:r>
-      <w:r>
-        <w:t xml:space="preserve"> </w:t>
-      </w:r>
-      <w:r>
-        <w:t xml:space="preserve">forest monitoring specifically, the enrichment path couples a walkable visual</w:t>
-      </w:r>
-      <w:r>
-        <w:t xml:space="preserve"> </w:t>
-      </w:r>
-      <w:r>
-        <w:t xml:space="preserve">record with quantitative inventory on the same acquisition, supporting</w:t>
-      </w:r>
-      <w:r>
-        <w:t xml:space="preserve"> </w:t>
-      </w:r>
-      <w:r>
-        <w:t xml:space="preserve">communication and revisitation of plots.</w:t>
-      </w:r>
-    </w:p>
-    <w:bookmarkEnd w:id="44"/>
-    <w:bookmarkStart w:id="45" w:name="conclusions-1"/>
-    <w:p>
-      <w:pPr>
-        <w:pStyle w:val="Heading2"/>
-      </w:pPr>
-      <w:r>
-        <w:t xml:space="preserve">5. Conclusions</w:t>
-      </w:r>
-    </w:p>
-    <w:p>
-      <w:pPr>
-        <w:pStyle w:val="FirstParagraph"/>
-      </w:pPr>
-      <w:r>
-        <w:t xml:space="preserve">We presented an open-source, containerized, GUI-driven chain that converts</w:t>
-      </w:r>
-      <w:r>
-        <w:t xml:space="preserve"> </w:t>
-      </w:r>
-      <w:r>
-        <w:t xml:space="preserve">multi-image captures — with or without known pose — into walkable web 3D scenes,</w:t>
-      </w:r>
-      <w:r>
-        <w:t xml:space="preserve"> </w:t>
-      </w:r>
-      <w:r>
-        <w:t xml:space="preserve">self-hostable end to end. A ground-truth evaluation shows the pose-based</w:t>
-      </w:r>
-      <w:r>
-        <w:t xml:space="preserve"> </w:t>
-      </w:r>
-      <w:r>
-        <w:t xml:space="preserve">reprojection branch to be more accurate, more robust, and faster than stitching</w:t>
-      </w:r>
-      <w:r>
-        <w:t xml:space="preserve"> </w:t>
-      </w:r>
-      <w:r>
-        <w:t xml:space="preserve">when scanner poses are available, and yields an interpretable automatic quality</w:t>
-      </w:r>
-      <w:r>
-        <w:t xml:space="preserve"> </w:t>
-      </w:r>
-      <w:r>
-        <w:t xml:space="preserve">flag for the stitching branch. Future work: wire the quality flag into the GUI;</w:t>
-      </w:r>
-      <w:r>
-        <w:t xml:space="preserve"> </w:t>
-      </w:r>
-      <w:r>
-        <w:t xml:space="preserve">integrate further representations (3D Gaussian splatting, meshes) in the same</w:t>
-      </w:r>
-      <w:r>
-        <w:t xml:space="preserve"> </w:t>
-      </w:r>
-      <w:r>
-        <w:t xml:space="preserve">viewer; obtain a freely licensed set of raw dual-fisheye frames from a consumer</w:t>
-      </w:r>
-      <w:r>
-        <w:t xml:space="preserve"> </w:t>
-      </w:r>
-      <w:r>
-        <w:t xml:space="preserve">360° camera, which would close the last gap in device coverage for the stitching</w:t>
-      </w:r>
-      <w:r>
-        <w:t xml:space="preserve"> </w:t>
-      </w:r>
-      <w:r>
-        <w:t xml:space="preserve">branch; and run the prepared usability study (System Usability Scale [15, 16]).</w:t>
-      </w:r>
-    </w:p>
-    <w:bookmarkEnd w:id="45"/>
-    <w:bookmarkStart w:id="46" w:name="data-availability-1"/>
-    <w:p>
-      <w:pPr>
-        <w:pStyle w:val="Heading2"/>
-      </w:pPr>
-      <w:r>
-        <w:t xml:space="preserve">Data availability</w:t>
-      </w:r>
-    </w:p>
-    <w:p>
-      <w:pPr>
-        <w:pStyle w:val="FirstParagraph"/>
-      </w:pPr>
-      <w:r>
-        <w:t xml:space="preserve">All data used in this work are third-party open data. Terrestrial laser scans:</w:t>
-      </w:r>
-      <w:r>
-        <w:t xml:space="preserve"> </w:t>
-      </w:r>
-      <w:r>
-        <w:t xml:space="preserve">Renon / ICOS IT-Ren (Leica BLK360, E57; CC BY 4.0) [17] and SegmentedForests</w:t>
-      </w:r>
-      <w:r>
-        <w:t xml:space="preserve"> </w:t>
-      </w:r>
-      <w:r>
-        <w:t xml:space="preserve">(MIT) [12]. Reference panoramas for the quantitative evaluation: eleven Poly Haven</w:t>
-      </w:r>
-      <w:r>
-        <w:t xml:space="preserve"> </w:t>
-      </w:r>
-      <w:r>
-        <w:t xml:space="preserve">HDRIs (CC0, https://polyhaven.com). Real multi-image capture: PASSTA LunchRoom</w:t>
-      </w:r>
-      <w:r>
-        <w:t xml:space="preserve"> </w:t>
-      </w:r>
-      <w:r>
-        <w:t xml:space="preserve">(CC BY 4.0) [10]. Source code, container recipe and evaluation scripts:</w:t>
-      </w:r>
-      <w:r>
-        <w:t xml:space="preserve"> </w:t>
-      </w:r>
-      <w:r>
-        <w:t xml:space="preserve">https://github.com/anayana/For3Dsuite (GPL-3.0-or-later), archived at</w:t>
-      </w:r>
-      <w:r>
-        <w:t xml:space="preserve"> </w:t>
-      </w:r>
-      <w:r>
-        <w:t xml:space="preserve">[Zenodo DOI].</w:t>
-      </w:r>
-    </w:p>
-    <w:bookmarkEnd w:id="46"/>
-    <w:bookmarkStart w:id="47" w:name="declaration-of-competing-interest-1"/>
-    <w:p>
-      <w:pPr>
-        <w:pStyle w:val="Heading2"/>
-      </w:pPr>
-      <w:r>
-        <w:t xml:space="preserve">Declaration of competing interest</w:t>
-      </w:r>
-    </w:p>
-    <w:p>
-      <w:pPr>
-        <w:pStyle w:val="FirstParagraph"/>
-      </w:pPr>
-      <w:r>
-        <w:t xml:space="preserve">The author declares no known competing financial interests or personal</w:t>
-      </w:r>
-      <w:r>
-        <w:t xml:space="preserve"> </w:t>
-      </w:r>
-      <w:r>
-        <w:t xml:space="preserve">relationships that could have appeared to influence the work reported in this</w:t>
-      </w:r>
-      <w:r>
-        <w:t xml:space="preserve"> </w:t>
-      </w:r>
-      <w:r>
-        <w:t xml:space="preserve">paper.</w:t>
-      </w:r>
-    </w:p>
-    <w:bookmarkEnd w:id="47"/>
-    <w:bookmarkStart w:id="48" w:name="X62f0e0ad3a93e6397531f4cde20d8fe1b9e9558"/>
-    <w:p>
-      <w:pPr>
-        <w:pStyle w:val="Heading2"/>
-      </w:pPr>
-      <w:r>
-        <w:t xml:space="preserve">CRediT authorship contribution statement</w:t>
-      </w:r>
-    </w:p>
-    <w:p>
-      <w:pPr>
-        <w:pStyle w:val="FirstParagraph"/>
-      </w:pPr>
-      <w:r>
-        <w:rPr>
-          <w:bCs/>
-          <w:b/>
-        </w:rPr>
-        <w:t xml:space="preserve">Angel Naya:</w:t>
-      </w:r>
-      <w:r>
-        <w:t xml:space="preserve"> </w:t>
-      </w:r>
-      <w:r>
-        <w:t xml:space="preserve">Conceptualization, Methodology, Software, Validation, Formal</w:t>
-      </w:r>
-      <w:r>
-        <w:t xml:space="preserve"> </w:t>
-      </w:r>
-      <w:r>
-        <w:t xml:space="preserve">analysis, Data curation, Visualization, Writing – original draft, Writing –</w:t>
-      </w:r>
-      <w:r>
-        <w:t xml:space="preserve"> </w:t>
-      </w:r>
-      <w:r>
-        <w:t xml:space="preserve">review &amp; editing.</w:t>
-      </w:r>
-    </w:p>
-    <w:bookmarkEnd w:id="48"/>
-    <w:bookmarkStart w:id="49" w:name="acknowledgements-1"/>
-    <w:p>
-      <w:pPr>
-        <w:pStyle w:val="Heading2"/>
-      </w:pPr>
-      <w:r>
-        <w:t xml:space="preserve">Acknowledgements</w:t>
-      </w:r>
-    </w:p>
-    <w:p>
-      <w:pPr>
-        <w:pStyle w:val="FirstParagraph"/>
-      </w:pPr>
-      <w:r>
-        <w:t xml:space="preserve">The author thanks the providers of the open datasets used here: the ICOS</w:t>
-      </w:r>
-      <w:r>
-        <w:t xml:space="preserve"> </w:t>
-      </w:r>
-      <w:r>
-        <w:t xml:space="preserve">ecosystem station IT-Ren (Renon) and Chang et al. for the Renon laser scans, the</w:t>
-      </w:r>
-      <w:r>
-        <w:t xml:space="preserve"> </w:t>
-      </w:r>
-      <w:r>
-        <w:t xml:space="preserve">authors of SegmentedForests and PASSTA, and</w:t>
-      </w:r>
-      <w:r>
-        <w:t xml:space="preserve"> </w:t>
-      </w:r>
-      <w:r>
-        <w:t xml:space="preserve">the Poly Haven contributors. This research received no specific grant from any</w:t>
-      </w:r>
-      <w:r>
-        <w:t xml:space="preserve"> </w:t>
-      </w:r>
-      <w:r>
-        <w:t xml:space="preserve">funding agency in the public, commercial, or not-for-profit sectors.</w:t>
-      </w:r>
-    </w:p>
-    <w:bookmarkEnd w:id="49"/>
-    <w:bookmarkStart w:id="50" w:name="references-1"/>
-    <w:p>
-      <w:pPr>
-        <w:pStyle w:val="Heading2"/>
-      </w:pPr>
-      <w:r>
-        <w:t xml:space="preserve">References</w:t>
-      </w:r>
-    </w:p>
-    <w:p>
-      <w:pPr>
-        <w:pStyle w:val="FirstParagraph"/>
-      </w:pPr>
-      <w:r>
-        <w:t xml:space="preserve">[1] Brown, M., Lowe, D. G. (2007). Automatic panoramic image stitching using</w:t>
-      </w:r>
-      <w:r>
-        <w:t xml:space="preserve"> </w:t>
-      </w:r>
-      <w:r>
-        <w:t xml:space="preserve">invariant features.</w:t>
-      </w:r>
-      <w:r>
-        <w:t xml:space="preserve"> </w:t>
+        <w:t xml:space="preserve">Quantifying the User Experience: Practical</w:t>
       </w:r>
       <w:r>
         <w:rPr>
           <w:iCs/>
           <w:i/>
         </w:rPr>
-        <w:t xml:space="preserve">International Journal of Computer Vision</w:t>
-      </w:r>
-      <w:r>
-        <w:t xml:space="preserve"> </w:t>
-      </w:r>
-      <w:r>
-        <w:t xml:space="preserve">74(1), 59–73.</w:t>
-      </w:r>
-      <w:r>
-        <w:t xml:space="preserve"> </w:t>
-      </w:r>
-      <w:r>
-        <w:t xml:space="preserve">https://doi.org/10.1007/s11263-006-0002-3</w:t>
-      </w:r>
-    </w:p>
-    <w:p>
-      <w:pPr>
-        <w:pStyle w:val="BodyText"/>
-      </w:pPr>
-      <w:r>
-        <w:t xml:space="preserve">[2] Szeliski, R. (2006). Image alignment and stitching: a tutorial.</w:t>
-      </w:r>
-      <w:r>
         <w:t xml:space="preserve"> </w:t>
       </w:r>
       <w:r>
@@ -6238,632 +4306,105 @@
           <w:iCs/>
           <w:i/>
         </w:rPr>
-        <w:t xml:space="preserve">Foundations</w:t>
-      </w:r>
+        <w:t xml:space="preserve">Statistics for User Research</w:t>
+      </w:r>
+      <w:r>
+        <w:t xml:space="preserve">, 2nd ed., Morgan Kaufmann.</w:t>
+      </w:r>
+    </w:p>
+    <w:p>
+      <w:pPr>
+        <w:pStyle w:val="BodyText"/>
+      </w:pPr>
+      <w:r>
+        <w:t xml:space="preserve">[17] Chang, M., Candotti, A., von Ellenrieder, K., Tomelleri, E., Camurri, M.</w:t>
+      </w:r>
+      <w:r>
+        <w:t xml:space="preserve"> </w:t>
+      </w:r>
+      <w:r>
+        <w:t xml:space="preserve">(2025). Data for:</w:t>
+      </w:r>
+      <w:r>
+        <w:t xml:space="preserve"> </w:t>
+      </w:r>
+      <w:r>
+        <w:t xml:space="preserve">“</w:t>
+      </w:r>
+      <w:r>
+        <w:t xml:space="preserve">A multi-platform LiDAR dataset for standardized forest</w:t>
+      </w:r>
+      <w:r>
+        <w:t xml:space="preserve"> </w:t>
+      </w:r>
+      <w:r>
+        <w:t xml:space="preserve">inventory measurement at long term ecological monitoring sites</w:t>
+      </w:r>
+      <w:r>
+        <w:t xml:space="preserve">”</w:t>
+      </w:r>
+      <w:r>
+        <w:t xml:space="preserve"> </w:t>
+      </w:r>
+      <w:r>
+        <w:t xml:space="preserve">[Dataset].</w:t>
+      </w:r>
+      <w:r>
+        <w:t xml:space="preserve"> </w:t>
+      </w:r>
+      <w:r>
+        <w:t xml:space="preserve">Zenodo. https://doi.org/10.5281/zenodo.17186174</w:t>
+      </w:r>
+    </w:p>
+    <w:p>
+      <w:pPr>
+        <w:pStyle w:val="BodyText"/>
+      </w:pPr>
       <w:r>
         <w:rPr>
           <w:iCs/>
           <w:i/>
         </w:rPr>
-        <w:t xml:space="preserve"> </w:t>
-      </w:r>
+        <w:t xml:space="preserve">Software used, with the versions that produced the reported figures:</w:t>
+      </w:r>
+      <w:r>
+        <w:t xml:space="preserve"> </w:t>
+      </w:r>
+      <w:r>
+        <w:t xml:space="preserve">Hugin/Panotools 2024.0.1 (GPL-2.0), Pannellum 2.5.6 (MIT), three.js r160 (MIT),</w:t>
+      </w:r>
+      <w:r>
+        <w:t xml:space="preserve"> </w:t>
+      </w:r>
+      <w:r>
+        <w:t xml:space="preserve">Leaflet 1.9.4 (BSD-2), Caddy 2 (Apache-2.0), Garage 1.0.1 (AGPL-3.0), FastAPI</w:t>
+      </w:r>
+      <w:r>
+        <w:t xml:space="preserve"> </w:t>
+      </w:r>
+      <w:r>
+        <w:t xml:space="preserve">(MIT), NumPy 1.26.4, Pillow 12.3.0, OpenCV 5.0.0, laspy 2.5.4, 3DFin/dendromatics,</w:t>
+      </w:r>
+      <w:r>
+        <w:t xml:space="preserve"> </w:t>
+      </w:r>
+      <w:r>
+        <w:t xml:space="preserve">TreeGrOSS (GPL-3.0, isolated as a separate process).</w:t>
+      </w:r>
+    </w:p>
+    <w:p>
+      <w:pPr>
+        <w:pStyle w:val="BodyText"/>
+      </w:pPr>
       <w:r>
         <w:rPr>
           <w:iCs/>
           <w:i/>
         </w:rPr>
-        <w:t xml:space="preserve">and Trends in Computer Graphics and Vision</w:t>
-      </w:r>
-      <w:r>
-        <w:t xml:space="preserve"> </w:t>
-      </w:r>
-      <w:r>
-        <w:t xml:space="preserve">2(1), 1–104.</w:t>
-      </w:r>
-      <w:r>
-        <w:t xml:space="preserve"> </w:t>
-      </w:r>
-      <w:r>
-        <w:t xml:space="preserve">https://doi.org/10.1561/0600000009</w:t>
-      </w:r>
-    </w:p>
-    <w:p>
-      <w:pPr>
-        <w:pStyle w:val="BodyText"/>
-      </w:pPr>
-      <w:r>
-        <w:t xml:space="preserve">[3] Petroff, M. A. (2019). Pannellum: a lightweight web-based panorama viewer.</w:t>
-      </w:r>
-      <w:r>
-        <w:t xml:space="preserve"> </w:t>
-      </w:r>
-      <w:r>
-        <w:rPr>
-          <w:iCs/>
-          <w:i/>
-        </w:rPr>
-        <w:t xml:space="preserve">Journal of Open Source Software</w:t>
-      </w:r>
-      <w:r>
-        <w:t xml:space="preserve"> </w:t>
-      </w:r>
-      <w:r>
-        <w:t xml:space="preserve">4(40), 1628.</w:t>
-      </w:r>
-      <w:r>
-        <w:t xml:space="preserve"> </w:t>
-      </w:r>
-      <w:r>
-        <w:t xml:space="preserve">https://doi.org/10.21105/joss.01628</w:t>
-      </w:r>
-    </w:p>
-    <w:p>
-      <w:pPr>
-        <w:pStyle w:val="BodyText"/>
-      </w:pPr>
-      <w:r>
-        <w:t xml:space="preserve">[4] Schütz, M. (2016).</w:t>
-      </w:r>
-      <w:r>
-        <w:t xml:space="preserve"> </w:t>
-      </w:r>
-      <w:r>
-        <w:rPr>
-          <w:iCs/>
-          <w:i/>
-        </w:rPr>
-        <w:t xml:space="preserve">Potree: Rendering large point clouds in web browsers.</w:t>
-      </w:r>
-      <w:r>
-        <w:t xml:space="preserve"> </w:t>
-      </w:r>
-      <w:r>
-        <w:t xml:space="preserve">Diploma thesis, TU Wien.</w:t>
-      </w:r>
-    </w:p>
-    <w:p>
-      <w:pPr>
-        <w:pStyle w:val="BodyText"/>
-      </w:pPr>
-      <w:r>
-        <w:t xml:space="preserve">[5] Huber, D. (2011). The ASTM E57 file format for 3D imaging data exchange.</w:t>
-      </w:r>
-      <w:r>
-        <w:t xml:space="preserve"> </w:t>
-      </w:r>
-      <w:r>
-        <w:rPr>
-          <w:iCs/>
-          <w:i/>
-        </w:rPr>
-        <w:t xml:space="preserve">Proc. SPIE</w:t>
-      </w:r>
-      <w:r>
-        <w:t xml:space="preserve"> </w:t>
-      </w:r>
-      <w:r>
-        <w:t xml:space="preserve">7864, Three-Dimensional Imaging, Interaction, and Measurement,</w:t>
-      </w:r>
-      <w:r>
-        <w:t xml:space="preserve"> </w:t>
-      </w:r>
-      <w:r>
-        <w:t xml:space="preserve">78640A. https://doi.org/10.1117/12.876555</w:t>
-      </w:r>
-    </w:p>
-    <w:p>
-      <w:pPr>
-        <w:pStyle w:val="BodyText"/>
-      </w:pPr>
-      <w:r>
-        <w:t xml:space="preserve">[6] Houshiar, H., Elseberg, J., Borrmann, D., Nüchter, A. (2015). A study of</w:t>
-      </w:r>
-      <w:r>
-        <w:t xml:space="preserve"> </w:t>
-      </w:r>
-      <w:r>
-        <w:t xml:space="preserve">projections for key point based registration of panoramic terrestrial 3D laser</w:t>
-      </w:r>
-      <w:r>
-        <w:t xml:space="preserve"> </w:t>
-      </w:r>
-      <w:r>
-        <w:t xml:space="preserve">scan.</w:t>
-      </w:r>
-      <w:r>
-        <w:t xml:space="preserve"> </w:t>
-      </w:r>
-      <w:r>
-        <w:rPr>
-          <w:iCs/>
-          <w:i/>
-        </w:rPr>
-        <w:t xml:space="preserve">Geo-spatial Information Science</w:t>
-      </w:r>
-      <w:r>
-        <w:t xml:space="preserve"> </w:t>
-      </w:r>
-      <w:r>
-        <w:t xml:space="preserve">18(1), 11–31.</w:t>
-      </w:r>
-      <w:r>
-        <w:t xml:space="preserve"> </w:t>
-      </w:r>
-      <w:r>
-        <w:t xml:space="preserve">https://doi.org/10.1080/10095020.2015.1017913</w:t>
-      </w:r>
-    </w:p>
-    <w:p>
-      <w:pPr>
-        <w:pStyle w:val="BodyText"/>
-      </w:pPr>
-      <w:r>
-        <w:t xml:space="preserve">[7] Kang, Z., et al. (2009). Automatic registration of terrestrial laser scanning</w:t>
-      </w:r>
-      <w:r>
-        <w:t xml:space="preserve"> </w:t>
-      </w:r>
-      <w:r>
-        <w:t xml:space="preserve">point clouds using panoramic reflectance images.</w:t>
-      </w:r>
-      <w:r>
-        <w:t xml:space="preserve"> </w:t>
-      </w:r>
-      <w:r>
-        <w:rPr>
-          <w:iCs/>
-          <w:i/>
-        </w:rPr>
-        <w:t xml:space="preserve">Sensors</w:t>
-      </w:r>
-      <w:r>
-        <w:t xml:space="preserve"> </w:t>
-      </w:r>
-      <w:r>
-        <w:t xml:space="preserve">9(4), 2621–2646.</w:t>
-      </w:r>
-      <w:r>
-        <w:t xml:space="preserve"> </w:t>
-      </w:r>
-      <w:r>
-        <w:t xml:space="preserve">https://doi.org/10.3390/s90402621</w:t>
-      </w:r>
-    </w:p>
-    <w:p>
-      <w:pPr>
-        <w:pStyle w:val="BodyText"/>
-      </w:pPr>
-      <w:r>
-        <w:t xml:space="preserve">[8] Wang, Z., Bovik, A. C., Sheikh, H. R., Simoncelli, E. P. (2004). Image quality</w:t>
-      </w:r>
-      <w:r>
-        <w:t xml:space="preserve"> </w:t>
-      </w:r>
-      <w:r>
-        <w:t xml:space="preserve">assessment: from error visibility to structural similarity.</w:t>
-      </w:r>
-      <w:r>
-        <w:t xml:space="preserve"> </w:t>
-      </w:r>
-      <w:r>
-        <w:rPr>
-          <w:iCs/>
-          <w:i/>
-        </w:rPr>
-        <w:t xml:space="preserve">IEEE Transactions on</w:t>
-      </w:r>
-      <w:r>
-        <w:rPr>
-          <w:iCs/>
-          <w:i/>
-        </w:rPr>
-        <w:t xml:space="preserve"> </w:t>
-      </w:r>
-      <w:r>
-        <w:rPr>
-          <w:iCs/>
-          <w:i/>
-        </w:rPr>
-        <w:t xml:space="preserve">Image Processing</w:t>
-      </w:r>
-      <w:r>
-        <w:t xml:space="preserve"> </w:t>
-      </w:r>
-      <w:r>
-        <w:t xml:space="preserve">13(4), 600–612. https://doi.org/10.1109/TIP.2003.819861</w:t>
-      </w:r>
-    </w:p>
-    <w:p>
-      <w:pPr>
-        <w:pStyle w:val="BodyText"/>
-      </w:pPr>
-      <w:r>
-        <w:t xml:space="preserve">[9] Kuglin, C. D., Hines, D. C. (1975). The phase correlation image alignment</w:t>
-      </w:r>
-      <w:r>
-        <w:t xml:space="preserve"> </w:t>
-      </w:r>
-      <w:r>
-        <w:t xml:space="preserve">method.</w:t>
-      </w:r>
-      <w:r>
-        <w:t xml:space="preserve"> </w:t>
-      </w:r>
-      <w:r>
-        <w:rPr>
-          <w:iCs/>
-          <w:i/>
-        </w:rPr>
-        <w:t xml:space="preserve">Proc. IEEE Int. Conf. on Cybernetics and Society</w:t>
-      </w:r>
-      <w:r>
-        <w:t xml:space="preserve">, 163–165.</w:t>
-      </w:r>
-    </w:p>
-    <w:p>
-      <w:pPr>
-        <w:pStyle w:val="BodyText"/>
-      </w:pPr>
-      <w:r>
-        <w:t xml:space="preserve">[10] Meneghetti, G., Danelljan, M., Felsberg, M., Nordberg, K. (2015). Image</w:t>
-      </w:r>
-      <w:r>
-        <w:t xml:space="preserve"> </w:t>
-      </w:r>
-      <w:r>
-        <w:t xml:space="preserve">alignment for panorama stitching in sparsely structured environments.</w:t>
-      </w:r>
-      <w:r>
-        <w:t xml:space="preserve"> </w:t>
-      </w:r>
-      <w:r>
-        <w:rPr>
-          <w:iCs/>
-          <w:i/>
-        </w:rPr>
-        <w:t xml:space="preserve">Scandinavian Conference on Image Analysis (SCIA)</w:t>
-      </w:r>
-      <w:r>
-        <w:t xml:space="preserve">. Data: CC-BY-4.0,</w:t>
-      </w:r>
-      <w:r>
-        <w:t xml:space="preserve"> </w:t>
-      </w:r>
-      <w:r>
-        <w:t xml:space="preserve">https://doi.org/10.5281/zenodo.19663081</w:t>
-      </w:r>
-    </w:p>
-    <w:p>
-      <w:pPr>
-        <w:pStyle w:val="BodyText"/>
-      </w:pPr>
-      <w:r>
-        <w:t xml:space="preserve">[11] Laino, D., Cabo, C., Prendes, C., et al. (2024). 3DFin: a software for</w:t>
-      </w:r>
-      <w:r>
-        <w:t xml:space="preserve"> </w:t>
-      </w:r>
-      <w:r>
-        <w:t xml:space="preserve">automated 3D forest inventories from terrestrial point clouds.</w:t>
-      </w:r>
-      <w:r>
-        <w:t xml:space="preserve"> </w:t>
-      </w:r>
-      <w:r>
-        <w:rPr>
-          <w:iCs/>
-          <w:i/>
-        </w:rPr>
-        <w:t xml:space="preserve">Forestry</w:t>
-      </w:r>
-      <w:r>
-        <w:t xml:space="preserve"> </w:t>
-      </w:r>
-      <w:r>
-        <w:t xml:space="preserve">97(4),</w:t>
-      </w:r>
-      <w:r>
-        <w:t xml:space="preserve"> </w:t>
-      </w:r>
-      <w:r>
-        <w:t xml:space="preserve">479–496.</w:t>
-      </w:r>
-      <w:r>
-        <w:t xml:space="preserve"> </w:t>
-      </w:r>
-      <w:r>
-        <w:t xml:space="preserve">https://doi.org/10.1093/forestry/cpae020</w:t>
-      </w:r>
-    </w:p>
-    <w:p>
-      <w:pPr>
-        <w:pStyle w:val="BodyText"/>
-      </w:pPr>
-      <w:r>
-        <w:t xml:space="preserve">[12] Laino, D., Cabo, C., Ordóñez, C., et al. (2026). SegmentedForests: a labelled</w:t>
-      </w:r>
-      <w:r>
-        <w:t xml:space="preserve"> </w:t>
-      </w:r>
-      <w:r>
-        <w:t xml:space="preserve">dataset of terrestrial LiDAR point clouds for semantic segmentation of forests.</w:t>
-      </w:r>
-      <w:r>
-        <w:t xml:space="preserve"> </w:t>
-      </w:r>
-      <w:r>
-        <w:rPr>
-          <w:iCs/>
-          <w:i/>
-        </w:rPr>
-        <w:t xml:space="preserve">Forestry</w:t>
-      </w:r>
-      <w:r>
-        <w:t xml:space="preserve"> </w:t>
-      </w:r>
-      <w:r>
-        <w:t xml:space="preserve">99(2). https://doi.org/10.1093/forestry/cpaf062 · Data:</w:t>
-      </w:r>
-      <w:r>
-        <w:t xml:space="preserve"> </w:t>
-      </w:r>
-      <w:r>
-        <w:t xml:space="preserve">https://doi.org/10.5281/zenodo.17396681</w:t>
-      </w:r>
-    </w:p>
-    <w:p>
-      <w:pPr>
-        <w:pStyle w:val="BodyText"/>
-      </w:pPr>
-      <w:r>
-        <w:t xml:space="preserve">[13] Roussel, J.-R., et al. (2020). lidR: An R package for analysis of Airborne</w:t>
-      </w:r>
-      <w:r>
-        <w:t xml:space="preserve"> </w:t>
-      </w:r>
-      <w:r>
-        <w:t xml:space="preserve">Laser Scanning (ALS) data.</w:t>
-      </w:r>
-      <w:r>
-        <w:t xml:space="preserve"> </w:t>
-      </w:r>
-      <w:r>
-        <w:rPr>
-          <w:iCs/>
-          <w:i/>
-        </w:rPr>
-        <w:t xml:space="preserve">Remote Sensing of Environment</w:t>
-      </w:r>
-      <w:r>
-        <w:t xml:space="preserve"> </w:t>
-      </w:r>
-      <w:r>
-        <w:t xml:space="preserve">251, 112061.</w:t>
-      </w:r>
-      <w:r>
-        <w:t xml:space="preserve"> </w:t>
-      </w:r>
-      <w:r>
-        <w:t xml:space="preserve">https://doi.org/10.1016/j.rse.2020.112061</w:t>
-      </w:r>
-    </w:p>
-    <w:p>
-      <w:pPr>
-        <w:pStyle w:val="BodyText"/>
-      </w:pPr>
-      <w:r>
-        <w:t xml:space="preserve">[14] Zhang, W., et al. (2016). An easy-to-use airborne LiDAR data filtering method</w:t>
-      </w:r>
-      <w:r>
-        <w:t xml:space="preserve"> </w:t>
-      </w:r>
-      <w:r>
-        <w:t xml:space="preserve">based on cloth simulation.</w:t>
-      </w:r>
-      <w:r>
-        <w:t xml:space="preserve"> </w:t>
-      </w:r>
-      <w:r>
-        <w:rPr>
-          <w:iCs/>
-          <w:i/>
-        </w:rPr>
-        <w:t xml:space="preserve">Remote Sensing</w:t>
-      </w:r>
-      <w:r>
-        <w:t xml:space="preserve"> </w:t>
-      </w:r>
-      <w:r>
-        <w:t xml:space="preserve">8(6), 501.</w:t>
-      </w:r>
-      <w:r>
-        <w:t xml:space="preserve"> </w:t>
-      </w:r>
-      <w:r>
-        <w:t xml:space="preserve">https://doi.org/10.3390/rs8060501</w:t>
-      </w:r>
-    </w:p>
-    <w:p>
-      <w:pPr>
-        <w:pStyle w:val="BodyText"/>
-      </w:pPr>
-      <w:r>
-        <w:t xml:space="preserve">[15] Brooke, J. (1996). SUS: a</w:t>
-      </w:r>
-      <w:r>
-        <w:t xml:space="preserve"> </w:t>
-      </w:r>
-      <w:r>
-        <w:t xml:space="preserve">“</w:t>
-      </w:r>
-      <w:r>
-        <w:t xml:space="preserve">quick and dirty</w:t>
-      </w:r>
-      <w:r>
-        <w:t xml:space="preserve">”</w:t>
-      </w:r>
-      <w:r>
-        <w:t xml:space="preserve"> </w:t>
-      </w:r>
-      <w:r>
-        <w:t xml:space="preserve">usability scale. In:</w:t>
-      </w:r>
-      <w:r>
-        <w:t xml:space="preserve"> </w:t>
-      </w:r>
-      <w:r>
-        <w:rPr>
-          <w:iCs/>
-          <w:i/>
-        </w:rPr>
-        <w:t xml:space="preserve">Usability</w:t>
-      </w:r>
-      <w:r>
-        <w:rPr>
-          <w:iCs/>
-          <w:i/>
-        </w:rPr>
-        <w:t xml:space="preserve"> </w:t>
-      </w:r>
-      <w:r>
-        <w:rPr>
-          <w:iCs/>
-          <w:i/>
-        </w:rPr>
-        <w:t xml:space="preserve">Evaluation in Industry</w:t>
-      </w:r>
-      <w:r>
-        <w:t xml:space="preserve">, Taylor &amp; Francis, 189–194.</w:t>
-      </w:r>
-    </w:p>
-    <w:p>
-      <w:pPr>
-        <w:pStyle w:val="BodyText"/>
-      </w:pPr>
-      <w:r>
-        <w:t xml:space="preserve">[16] Sauro, J., Lewis, J. R. (2016).</w:t>
-      </w:r>
-      <w:r>
-        <w:t xml:space="preserve"> </w:t>
-      </w:r>
-      <w:r>
-        <w:rPr>
-          <w:iCs/>
-          <w:i/>
-        </w:rPr>
-        <w:t xml:space="preserve">Quantifying the User Experience: Practical</w:t>
-      </w:r>
-      <w:r>
-        <w:rPr>
-          <w:iCs/>
-          <w:i/>
-        </w:rPr>
-        <w:t xml:space="preserve"> </w:t>
-      </w:r>
-      <w:r>
-        <w:rPr>
-          <w:iCs/>
-          <w:i/>
-        </w:rPr>
-        <w:t xml:space="preserve">Statistics for User Research</w:t>
-      </w:r>
-      <w:r>
-        <w:t xml:space="preserve">, 2nd ed., Morgan Kaufmann.</w:t>
-      </w:r>
-    </w:p>
-    <w:p>
-      <w:pPr>
-        <w:pStyle w:val="BodyText"/>
-      </w:pPr>
-      <w:r>
-        <w:t xml:space="preserve">[17] Chang, M., Candotti, A., von Ellenrieder, K., Tomelleri, E., Camurri, M.</w:t>
-      </w:r>
-      <w:r>
-        <w:t xml:space="preserve"> </w:t>
-      </w:r>
-      <w:r>
-        <w:t xml:space="preserve">(2025). Data for:</w:t>
-      </w:r>
-      <w:r>
-        <w:t xml:space="preserve"> </w:t>
-      </w:r>
-      <w:r>
-        <w:t xml:space="preserve">“</w:t>
-      </w:r>
-      <w:r>
-        <w:t xml:space="preserve">A multi-platform LiDAR dataset for standardized forest</w:t>
-      </w:r>
-      <w:r>
-        <w:t xml:space="preserve"> </w:t>
-      </w:r>
-      <w:r>
-        <w:t xml:space="preserve">inventory measurement at long term ecological monitoring sites</w:t>
-      </w:r>
-      <w:r>
-        <w:t xml:space="preserve">”</w:t>
-      </w:r>
-      <w:r>
-        <w:t xml:space="preserve"> </w:t>
-      </w:r>
-      <w:r>
-        <w:t xml:space="preserve">[Dataset].</w:t>
-      </w:r>
-      <w:r>
-        <w:t xml:space="preserve"> </w:t>
-      </w:r>
-      <w:r>
-        <w:t xml:space="preserve">Zenodo. https://doi.org/10.5281/zenodo.17186174</w:t>
-      </w:r>
-    </w:p>
-    <w:p>
-      <w:pPr>
-        <w:pStyle w:val="BodyText"/>
-      </w:pPr>
-      <w:r>
-        <w:rPr>
-          <w:iCs/>
-          <w:i/>
-        </w:rPr>
-        <w:t xml:space="preserve">Software used, with the versions that produced the reported figures:</w:t>
-      </w:r>
-      <w:r>
-        <w:t xml:space="preserve"> </w:t>
-      </w:r>
-      <w:r>
-        <w:t xml:space="preserve">Hugin/Panotools 2024.0.1 (GPL-2.0), Pannellum 2.5.6 (MIT), three.js r160 (MIT),</w:t>
-      </w:r>
-      <w:r>
-        <w:t xml:space="preserve"> </w:t>
-      </w:r>
-      <w:r>
-        <w:t xml:space="preserve">Leaflet 1.9.4 (BSD-2), Caddy 2 (Apache-2.0), Garage 1.0.1 (AGPL-3.0), FastAPI</w:t>
-      </w:r>
-      <w:r>
-        <w:t xml:space="preserve"> </w:t>
-      </w:r>
-      <w:r>
-        <w:t xml:space="preserve">(MIT), NumPy 1.26.4, Pillow 12.3.0, OpenCV 5.0.0, laspy 2.5.4, 3DFin/dendromatics,</w:t>
-      </w:r>
-      <w:r>
-        <w:t xml:space="preserve"> </w:t>
-      </w:r>
-      <w:r>
-        <w:t xml:space="preserve">TreeGrOSS (GPL-3.0, isolated as a separate process).</w:t>
-      </w:r>
-    </w:p>
-    <w:p>
-      <w:pPr>
-        <w:pStyle w:val="BodyText"/>
-      </w:pPr>
-      <w:r>
-        <w:rPr>
-          <w:iCs/>
-          <w:i/>
-        </w:rPr>
         <w:t xml:space="preserve">Checked against publisher records (Oct 2026): [1]–[3], [5]–[7], [10]–[14], [17].</w:t>
       </w:r>
     </w:p>
-    <w:bookmarkEnd w:id="50"/>
+    <w:bookmarkEnd w:id="40"/>
     <w:sectPr/>
   </w:body>
 </w:document>

</xml_diff>

<commit_message>
Paper A + CITATION.cff: Zenodo-DOI 10.5281/zenodo.2332235605
Co-Authored-By: Claude Opus 5.5 <noreply@anthropic.com>
Claude-Session: https://claude.ai/code/session_013WHGNh61Va4DrXQ4AxtPNr
</commit_message>
<xml_diff>
--- a/Paper_ODT/Panorama_Pipeline_Paper/Manuscript_SoftwareX_EN.docx
+++ b/Paper_ODT/Panorama_Pipeline_Paper/Manuscript_SoftwareX_EN.docx
@@ -425,7 +425,7 @@
               <w:jc w:val="left"/>
             </w:pPr>
             <w:r>
-              <w:t xml:space="preserve">[Zenodo DOI to be minted on submission]</w:t>
+              <w:t xml:space="preserve">https://doi.org/10.5281/zenodo.2332235605</w:t>
             </w:r>
           </w:p>
         </w:tc>
@@ -3616,7 +3616,7 @@
         <w:t xml:space="preserve"> </w:t>
       </w:r>
       <w:r>
-        <w:t xml:space="preserve">[Zenodo DOI].</w:t>
+        <w:t xml:space="preserve">https://doi.org/10.5281/zenodo.2332235605.</w:t>
       </w:r>
     </w:p>
     <w:bookmarkEnd w:id="36"/>

</xml_diff>

<commit_message>
Paper A + CITATION.cff: Zenodo-DOI korrigiert auf 10.5281/zenodo.23323560
Co-Authored-By: Claude Opus 5.5 <noreply@anthropic.com>
Claude-Session: https://claude.ai/code/session_013WHGNh61Va4DrXQ4AxtPNr
</commit_message>
<xml_diff>
--- a/Paper_ODT/Panorama_Pipeline_Paper/Manuscript_SoftwareX_EN.docx
+++ b/Paper_ODT/Panorama_Pipeline_Paper/Manuscript_SoftwareX_EN.docx
@@ -425,7 +425,7 @@
               <w:jc w:val="left"/>
             </w:pPr>
             <w:r>
-              <w:t xml:space="preserve">https://doi.org/10.5281/zenodo.2332235605</w:t>
+              <w:t xml:space="preserve">https://doi.org/10.5281/zenodo.23323560</w:t>
             </w:r>
           </w:p>
         </w:tc>
@@ -3616,7 +3616,7 @@
         <w:t xml:space="preserve"> </w:t>
       </w:r>
       <w:r>
-        <w:t xml:space="preserve">https://doi.org/10.5281/zenodo.2332235605.</w:t>
+        <w:t xml:space="preserve">https://doi.org/10.5281/zenodo.23323560.</w:t>
       </w:r>
     </w:p>
     <w:bookmarkEnd w:id="36"/>

</xml_diff>

<commit_message>
Paper A: Abbildungen auf Englisch, PDF-Fassung
make_paper_figures.py beschriftet fig1 (Architektur) und fig2 (Evaluation)
jetzt englisch, passend zum Manuskript; SVG/PNG neu erzeugt. Word-Datei
neu gebaut, PDF (LibreOffice) ergaenzt.

Co-Authored-By: Claude Opus 5.5 <noreply@anthropic.com>
Claude-Session: https://claude.ai/code/session_013WHGNh61Va4DrXQ4AxtPNr
</commit_message>
<xml_diff>
--- a/Paper_ODT/Panorama_Pipeline_Paper/Manuscript_SoftwareX_EN.docx
+++ b/Paper_ODT/Panorama_Pipeline_Paper/Manuscript_SoftwareX_EN.docx
@@ -826,7 +826,7 @@
       <w:r>
         <w:drawing>
           <wp:inline>
-            <wp:extent cx="5334000" cy="3321169"/>
+            <wp:extent cx="5334000" cy="3318933"/>
             <wp:effectExtent b="0" l="0" r="0" t="0"/>
             <wp:docPr descr="Figure 1. Two input classes, one chain. The input class is determined from the data (detect_input_class), not declared by the user: an .e57 container carries pose and is reprojected; a single 2:1 image is taken over as is; several images without pose are stitched. For TLS input, inventory derived from the same point cloud is attached to the scene as georeferenced markers." title="" id="24" name="Picture"/>
             <a:graphic>
@@ -847,7 +847,7 @@
                   <pic:spPr bwMode="auto">
                     <a:xfrm>
                       <a:off x="0" y="0"/>
-                      <a:ext cx="5334000" cy="3321169"/>
+                      <a:ext cx="5334000" cy="3318933"/>
                     </a:xfrm>
                     <a:prstGeom prst="rect">
                       <a:avLst/>
@@ -2310,7 +2310,7 @@
       <w:r>
         <w:drawing>
           <wp:inline>
-            <wp:extent cx="5334000" cy="2255553"/>
+            <wp:extent cx="5334000" cy="2252133"/>
             <wp:effectExtent b="0" l="0" r="0" t="0"/>
             <wp:docPr descr="Figure 2. Panorama evaluation against eleven CC0 references. The pose-based branch is more accurate and reconstructs every scene; the seam offset separates good from failed reconstructions by a factor of ~40 and is therefore usable as a ground-truth-free quality flag. Real captures with parallax lie ~56× above the synthetic case, which makes the synthetic figures a lower bound." title="" id="30" name="Picture"/>
             <a:graphic>
@@ -2331,7 +2331,7 @@
                   <pic:spPr bwMode="auto">
                     <a:xfrm>
                       <a:off x="0" y="0"/>
-                      <a:ext cx="5334000" cy="2255553"/>
+                      <a:ext cx="5334000" cy="2252133"/>
                     </a:xfrm>
                     <a:prstGeom prst="rect">
                       <a:avLst/>

</xml_diff>

<commit_message>
Paper A: Stammdetektions-Vergleich durch Gueltigkeitsbereich ersetzt
Die Vergleichstabelle (Baseline, lidR, CSP, 3DFin) gehoert nicht in ein
Software-Paper ueber die Panorama-Kette und liess 3DFin pauschal besser
erscheinen, als es ist. Stattdessen ein Absatz: 3DFin als Detektor, seine
Werte auf SegmentedForests, und dass sie an der Umfangsabdeckung haengen
(>= 9/16 Sektoren, ~202 Grad; Wiener Plots 280-360 Grad, Renon 180 Grad,
29 von 37 Staemmen ohne BHD). Der vollstaendige Vergleich bleibt im Repo
(scripts/BENCH_DETECTION.md) und ist fuer das Forst-Paper vorgesehen.

Literatur: [13] lidR und [14] CSF waren nur dort zitiert und entfallen;
SUS-Quellen und Renon-Datensatz neu nummeriert ([13]-[15]). Word und PDF
neu erzeugt (9 Seiten).

Co-Authored-By: Claude Opus 5.5 <noreply@anthropic.com>
Claude-Session: https://claude.ai/code/session_013WHGNh61Va4DrXQ4AxtPNr
</commit_message>
<xml_diff>
--- a/Paper_ODT/Panorama_Pipeline_Paper/Manuscript_SoftwareX_EN.docx
+++ b/Paper_ODT/Panorama_Pipeline_Paper/Manuscript_SoftwareX_EN.docx
@@ -1379,407 +1379,100 @@
           <w:iCs/>
           <w:i/>
         </w:rPr>
-        <w:t xml:space="preserve">Validated against ground truth.</w:t>
-      </w:r>
-      <w:r>
-        <w:t xml:space="preserve"> </w:t>
-      </w:r>
-      <w:r>
-        <w:t xml:space="preserve">The inventory path is not a demonstrator. On</w:t>
-      </w:r>
-      <w:r>
-        <w:t xml:space="preserve"> </w:t>
-      </w:r>
-      <w:r>
-        <w:t xml:space="preserve">two TLS plots of the SegmentedForests dataset [12], in which every point is manually</w:t>
-      </w:r>
-      <w:r>
-        <w:t xml:space="preserve"> </w:t>
-      </w:r>
-      <w:r>
-        <w:t xml:space="preserve">classified, stem detection can be scored for accuracy rather than mere agreement</w:t>
-      </w:r>
-      <w:r>
-        <w:t xml:space="preserve"> </w:t>
-      </w:r>
-      <w:r>
-        <w:t xml:space="preserve">(recall / precision; a hit is a detection within 0.6 m of a reference stem):</w:t>
-      </w:r>
-    </w:p>
-    <w:tbl>
-      <w:tblPr>
-        <w:tblStyle w:val="Table"/>
-        <w:tblW w:type="pct" w:w="5000"/>
-        <w:tblLook w:firstRow="1" w:lastRow="0" w:firstColumn="0" w:lastColumn="0" w:noHBand="0" w:noVBand="0" w:val="0020"/>
-        <w:jc w:val="start"/>
-      </w:tblPr>
-      <w:tblGrid>
-        <w:gridCol w:w="2640"/>
-        <w:gridCol w:w="2640"/>
-        <w:gridCol w:w="2640"/>
-      </w:tblGrid>
-      <w:tr>
-        <w:trPr>
-          <w:tblHeader w:val="true"/>
-        </w:trPr>
-        <w:tc>
-          <w:tcPr/>
-          <w:p>
-            <w:pPr>
-              <w:pStyle w:val="Compact"/>
-              <w:jc w:val="left"/>
-            </w:pPr>
-            <w:r>
-              <w:t xml:space="preserve">Method</w:t>
-            </w:r>
-          </w:p>
-        </w:tc>
-        <w:tc>
-          <w:tcPr/>
-          <w:p>
-            <w:pPr>
-              <w:pStyle w:val="Compact"/>
-              <w:jc w:val="right"/>
-            </w:pPr>
-            <w:r>
-              <w:t xml:space="preserve">plot_06 (68 stems)</w:t>
-            </w:r>
-          </w:p>
-        </w:tc>
-        <w:tc>
-          <w:tcPr/>
-          <w:p>
-            <w:pPr>
-              <w:pStyle w:val="Compact"/>
-              <w:jc w:val="right"/>
-            </w:pPr>
-            <w:r>
-              <w:t xml:space="preserve">plot_07 (128 stems)</w:t>
-            </w:r>
-          </w:p>
-        </w:tc>
-      </w:tr>
-      <w:tr>
-        <w:tc>
-          <w:tcPr/>
-          <w:p>
-            <w:pPr>
-              <w:pStyle w:val="Compact"/>
-              <w:jc w:val="left"/>
-            </w:pPr>
-            <w:r>
-              <w:t xml:space="preserve">own numpy baseline</w:t>
-            </w:r>
-          </w:p>
-        </w:tc>
-        <w:tc>
-          <w:tcPr/>
-          <w:p>
-            <w:pPr>
-              <w:pStyle w:val="Compact"/>
-              <w:jc w:val="right"/>
-            </w:pPr>
-            <w:r>
-              <w:t xml:space="preserve">60.3 % / 42.3 %</w:t>
-            </w:r>
-          </w:p>
-        </w:tc>
-        <w:tc>
-          <w:tcPr/>
-          <w:p>
-            <w:pPr>
-              <w:pStyle w:val="Compact"/>
-              <w:jc w:val="right"/>
-            </w:pPr>
-            <w:r>
-              <w:t xml:space="preserve">34.4 % / 74.6 %</w:t>
-            </w:r>
-          </w:p>
-        </w:tc>
-      </w:tr>
-      <w:tr>
-        <w:tc>
-          <w:tcPr/>
-          <w:p>
-            <w:pPr>
-              <w:pStyle w:val="Compact"/>
-              <w:jc w:val="left"/>
-            </w:pPr>
-            <w:r>
-              <w:t xml:space="preserve">+ stem-continuity filter</w:t>
-            </w:r>
-          </w:p>
-        </w:tc>
-        <w:tc>
-          <w:tcPr/>
-          <w:p>
-            <w:pPr>
-              <w:pStyle w:val="Compact"/>
-              <w:jc w:val="right"/>
-            </w:pPr>
-            <w:r>
-              <w:t xml:space="preserve">57.4 % / 70.9 %</w:t>
-            </w:r>
-          </w:p>
-        </w:tc>
-        <w:tc>
-          <w:tcPr/>
-          <w:p>
-            <w:pPr>
-              <w:pStyle w:val="Compact"/>
-              <w:jc w:val="right"/>
-            </w:pPr>
-            <w:r>
-              <w:t xml:space="preserve">—</w:t>
-            </w:r>
-          </w:p>
-        </w:tc>
-      </w:tr>
-      <w:tr>
-        <w:tc>
-          <w:tcPr/>
-          <w:p>
-            <w:pPr>
-              <w:pStyle w:val="Compact"/>
-              <w:jc w:val="left"/>
-            </w:pPr>
-            <w:r>
-              <w:t xml:space="preserve">lidR [13] (own implementation)</w:t>
-            </w:r>
-          </w:p>
-        </w:tc>
-        <w:tc>
-          <w:tcPr/>
-          <w:p>
-            <w:pPr>
-              <w:pStyle w:val="Compact"/>
-              <w:jc w:val="right"/>
-            </w:pPr>
-            <w:r>
-              <w:t xml:space="preserve">66.2 % / 45.9 %</w:t>
-            </w:r>
-          </w:p>
-        </w:tc>
-        <w:tc>
-          <w:tcPr/>
-          <w:p>
-            <w:pPr>
-              <w:pStyle w:val="Compact"/>
-              <w:jc w:val="right"/>
-            </w:pPr>
-            <w:r>
-              <w:t xml:space="preserve">—</w:t>
-            </w:r>
-          </w:p>
-        </w:tc>
-      </w:tr>
-      <w:tr>
-        <w:tc>
-          <w:tcPr/>
-          <w:p>
-            <w:pPr>
-              <w:pStyle w:val="Compact"/>
-              <w:jc w:val="left"/>
-            </w:pPr>
-            <w:r>
-              <w:t xml:space="preserve">CspStandSegmentation</w:t>
-            </w:r>
-          </w:p>
-        </w:tc>
-        <w:tc>
-          <w:tcPr/>
-          <w:p>
-            <w:pPr>
-              <w:pStyle w:val="Compact"/>
-              <w:jc w:val="right"/>
-            </w:pPr>
-            <w:r>
-              <w:t xml:space="preserve">57.4 % / 27.7 %</w:t>
-            </w:r>
-          </w:p>
-        </w:tc>
-        <w:tc>
-          <w:tcPr/>
-          <w:p>
-            <w:pPr>
-              <w:pStyle w:val="Compact"/>
-              <w:jc w:val="right"/>
-            </w:pPr>
-            <w:r>
-              <w:t xml:space="preserve">—</w:t>
-            </w:r>
-          </w:p>
-        </w:tc>
-      </w:tr>
-      <w:tr>
-        <w:tc>
-          <w:tcPr/>
-          <w:p>
-            <w:pPr>
-              <w:pStyle w:val="Compact"/>
-              <w:jc w:val="left"/>
-            </w:pPr>
-            <w:r>
-              <w:rPr>
-                <w:bCs/>
-                <w:b/>
-              </w:rPr>
-              <w:t xml:space="preserve">3DFin</w:t>
-            </w:r>
-            <w:r>
-              <w:t xml:space="preserve"> </w:t>
-            </w:r>
-            <w:r>
-              <w:t xml:space="preserve">[11] (authors’ configuration)</w:t>
-            </w:r>
-          </w:p>
-        </w:tc>
-        <w:tc>
-          <w:tcPr/>
-          <w:p>
-            <w:pPr>
-              <w:pStyle w:val="Compact"/>
-              <w:jc w:val="right"/>
-            </w:pPr>
-            <w:r>
-              <w:rPr>
-                <w:bCs/>
-                <w:b/>
-              </w:rPr>
-              <w:t xml:space="preserve">98.5 % / 95.7 %</w:t>
-            </w:r>
-          </w:p>
-        </w:tc>
-        <w:tc>
-          <w:tcPr/>
-          <w:p>
-            <w:pPr>
-              <w:pStyle w:val="Compact"/>
-              <w:jc w:val="right"/>
-            </w:pPr>
-            <w:r>
-              <w:rPr>
-                <w:bCs/>
-                <w:b/>
-              </w:rPr>
-              <w:t xml:space="preserve">94.5 % / 100 %</w:t>
-            </w:r>
-          </w:p>
-        </w:tc>
-      </w:tr>
-    </w:tbl>
-    <w:p>
-      <w:pPr>
-        <w:pStyle w:val="BodyText"/>
-      </w:pPr>
-      <w:r>
-        <w:t xml:space="preserve">We report the uncomfortable result openly: the established domain tool 3DFin</w:t>
-      </w:r>
-      <w:r>
-        <w:t xml:space="preserve"> </w:t>
-      </w:r>
-      <w:r>
-        <w:t xml:space="preserve">clearly outperforms our own baseline, consistently across both plots, and the</w:t>
-      </w:r>
-      <w:r>
-        <w:t xml:space="preserve"> </w:t>
-      </w:r>
-      <w:r>
-        <w:t xml:space="preserve">chain therefore uses it as the detector on plot-wide TLS clouds rather than</w:t>
-      </w:r>
-      <w:r>
-        <w:t xml:space="preserve"> </w:t>
-      </w:r>
-      <w:r>
-        <w:t xml:space="preserve">merely as a comparison. Because the dataset also labels shrubs, downed wood,</w:t>
-      </w:r>
-      <w:r>
-        <w:t xml:space="preserve"> </w:t>
-      </w:r>
-      <w:r>
-        <w:t xml:space="preserve">rocks, and stakes, it is further verifiable</w:t>
-      </w:r>
-      <w:r>
-        <w:t xml:space="preserve"> </w:t>
-      </w:r>
-      <w:r>
-        <w:rPr>
-          <w:iCs/>
-          <w:i/>
-        </w:rPr>
-        <w:t xml:space="preserve">what</w:t>
-      </w:r>
-      <w:r>
-        <w:t xml:space="preserve"> </w:t>
-      </w:r>
-      <w:r>
-        <w:t xml:space="preserve">the weaker methods detect</w:t>
-      </w:r>
-      <w:r>
-        <w:t xml:space="preserve"> </w:t>
-      </w:r>
-      <w:r>
-        <w:t xml:space="preserve">instead of stems — for the baseline on plot_06, half of the false alarms sit on</w:t>
-      </w:r>
-      <w:r>
-        <w:t xml:space="preserve"> </w:t>
-      </w:r>
-      <w:r>
-        <w:t xml:space="preserve">shrub and ground vegetation.</w:t>
-      </w:r>
-    </w:p>
-    <w:p>
-      <w:pPr>
-        <w:pStyle w:val="BodyText"/>
-      </w:pPr>
-      <w:r>
-        <w:rPr>
-          <w:iCs/>
-          <w:i/>
-        </w:rPr>
-        <w:t xml:space="preserve">Scope.</w:t>
-      </w:r>
-      <w:r>
-        <w:t xml:space="preserve"> </w:t>
-      </w:r>
-      <w:r>
-        <w:t xml:space="preserve">This superiority is conditional on circumferential coverage. On our own</w:t>
-      </w:r>
-      <w:r>
-        <w:t xml:space="preserve"> </w:t>
-      </w:r>
-      <w:r>
-        <w:t xml:space="preserve">Renon stand (median 180° arc versus 280–360° in the reference plots) 3DFin</w:t>
-      </w:r>
-      <w:r>
-        <w:t xml:space="preserve"> </w:t>
-      </w:r>
-      <w:r>
-        <w:t xml:space="preserve">refuses a diameter for 29 of 37 detections — correct behaviour, since the data do</w:t>
-      </w:r>
-      <w:r>
-        <w:t xml:space="preserve"> </w:t>
-      </w:r>
-      <w:r>
-        <w:t xml:space="preserve">not support one; a sweep over the ground-model resolution (cloth simulation</w:t>
-      </w:r>
-      <w:r>
-        <w:t xml:space="preserve"> </w:t>
-      </w:r>
-      <w:r>
-        <w:t xml:space="preserve">filter [14]) does not change this.</w:t>
-      </w:r>
-      <w:r>
-        <w:t xml:space="preserve"> </w:t>
-      </w:r>
-      <w:r>
-        <w:t xml:space="preserve">Our own methods still return numbers there, resting on 180° arcs — a statement</w:t>
-      </w:r>
-      <w:r>
-        <w:t xml:space="preserve"> </w:t>
-      </w:r>
-      <w:r>
-        <w:t xml:space="preserve">about the acquisition, not about the methods.</w:t>
+        <w:t xml:space="preserve">Inventory path and its range of validity.</w:t>
+      </w:r>
+      <w:r>
+        <w:t xml:space="preserve"> </w:t>
+      </w:r>
+      <w:r>
+        <w:t xml:space="preserve">On plot-wide TLS clouds the chain</w:t>
+      </w:r>
+      <w:r>
+        <w:t xml:space="preserve"> </w:t>
+      </w:r>
+      <w:r>
+        <w:t xml:space="preserve">uses 3DFin [11] as stem detector. On two manually labelled plots of the</w:t>
+      </w:r>
+      <w:r>
+        <w:t xml:space="preserve"> </w:t>
+      </w:r>
+      <w:r>
+        <w:t xml:space="preserve">SegmentedForests dataset [12] it reaches 98.5 % recall / 95.7 % precision</w:t>
+      </w:r>
+      <w:r>
+        <w:t xml:space="preserve"> </w:t>
+      </w:r>
+      <w:r>
+        <w:t xml:space="preserve">(plot_06, 68 stems) and 94.5 % / 100 % (plot_07, 128 stems), clearly ahead of</w:t>
+      </w:r>
+      <w:r>
+        <w:t xml:space="preserve"> </w:t>
+      </w:r>
+      <w:r>
+        <w:t xml:space="preserve">the simpler detectors we also tested. This accuracy depends on circumferential</w:t>
+      </w:r>
+      <w:r>
+        <w:t xml:space="preserve"> </w:t>
+      </w:r>
+      <w:r>
+        <w:t xml:space="preserve">stem coverage: 3DFin accepts a diameter only if the stem cross-section at breast</w:t>
+      </w:r>
+      <w:r>
+        <w:t xml:space="preserve"> </w:t>
+      </w:r>
+      <w:r>
+        <w:t xml:space="preserve">height is covered in at least 9 of 16 sectors (≈ 202°). The labelled plots offer a</w:t>
+      </w:r>
+      <w:r>
+        <w:t xml:space="preserve"> </w:t>
+      </w:r>
+      <w:r>
+        <w:t xml:space="preserve">median arc of 280–360°; on the Renon stand, merged from four nearby scan</w:t>
+      </w:r>
+      <w:r>
+        <w:t xml:space="preserve"> </w:t>
+      </w:r>
+      <w:r>
+        <w:t xml:space="preserve">positions, the median is 180°, and 3DFin declines a diameter for 29 of 37 detected</w:t>
+      </w:r>
+      <w:r>
+        <w:t xml:space="preserve"> </w:t>
+      </w:r>
+      <w:r>
+        <w:t xml:space="preserve">stems — correct behaviour, since the data do not support one. The inventory</w:t>
+      </w:r>
+      <w:r>
+        <w:t xml:space="preserve"> </w:t>
+      </w:r>
+      <w:r>
+        <w:t xml:space="preserve">markers are therefore only as reliable as the scan geometry behind them. A</w:t>
+      </w:r>
+      <w:r>
+        <w:t xml:space="preserve"> </w:t>
+      </w:r>
+      <w:r>
+        <w:t xml:space="preserve">systematic comparison of detectors as a function of coverage is beyond the scope</w:t>
+      </w:r>
+      <w:r>
+        <w:t xml:space="preserve"> </w:t>
+      </w:r>
+      <w:r>
+        <w:t xml:space="preserve">of this software paper; per-method results and scripts are documented in the</w:t>
+      </w:r>
+      <w:r>
+        <w:t xml:space="preserve"> </w:t>
+      </w:r>
+      <w:r>
+        <w:t xml:space="preserve">repository (</w:t>
+      </w:r>
+      <w:r>
+        <w:rPr>
+          <w:rStyle w:val="VerbatimChar"/>
+        </w:rPr>
+        <w:t xml:space="preserve">scripts/BENCH_DETECTION.md</w:t>
+      </w:r>
+      <w:r>
+        <w:t xml:space="preserve">).</w:t>
       </w:r>
     </w:p>
     <w:p>
@@ -3562,7 +3255,7 @@
         <w:t xml:space="preserve"> </w:t>
       </w:r>
       <w:r>
-        <w:t xml:space="preserve">branch; and run the prepared usability study (System Usability Scale [15, 16]).</w:t>
+        <w:t xml:space="preserve">branch; and run the prepared usability study (System Usability Scale [13, 14]).</w:t>
       </w:r>
     </w:p>
     <w:bookmarkEnd w:id="35"/>
@@ -3586,7 +3279,7 @@
         <w:t xml:space="preserve"> </w:t>
       </w:r>
       <w:r>
-        <w:t xml:space="preserve">Renon / ICOS IT-Ren (Leica BLK360, E57; CC BY 4.0) [17] and SegmentedForests</w:t>
+        <w:t xml:space="preserve">Renon / ICOS IT-Ren (Leica BLK360, E57; CC BY 4.0) [15] and SegmentedForests</w:t>
       </w:r>
       <w:r>
         <w:t xml:space="preserve"> </w:t>
@@ -4157,13 +3850,25 @@
         <w:pStyle w:val="BodyText"/>
       </w:pPr>
       <w:r>
-        <w:t xml:space="preserve">[13] Roussel, J.-R., et al. (2020). lidR: An R package for analysis of Airborne</w:t>
-      </w:r>
-      <w:r>
-        <w:t xml:space="preserve"> </w:t>
-      </w:r>
-      <w:r>
-        <w:t xml:space="preserve">Laser Scanning (ALS) data.</w:t>
+        <w:t xml:space="preserve">[13] Brooke, J. (1996). SUS: a</w:t>
+      </w:r>
+      <w:r>
+        <w:t xml:space="preserve"> </w:t>
+      </w:r>
+      <w:r>
+        <w:t xml:space="preserve">“</w:t>
+      </w:r>
+      <w:r>
+        <w:t xml:space="preserve">quick and dirty</w:t>
+      </w:r>
+      <w:r>
+        <w:t xml:space="preserve">”</w:t>
+      </w:r>
+      <w:r>
+        <w:t xml:space="preserve"> </w:t>
+      </w:r>
+      <w:r>
+        <w:t xml:space="preserve">usability scale. In:</w:t>
       </w:r>
       <w:r>
         <w:t xml:space="preserve"> </w:t>
@@ -4173,83 +3878,13 @@
           <w:iCs/>
           <w:i/>
         </w:rPr>
-        <w:t xml:space="preserve">Remote Sensing of Environment</w:t>
-      </w:r>
-      <w:r>
-        <w:t xml:space="preserve"> </w:t>
-      </w:r>
-      <w:r>
-        <w:t xml:space="preserve">251, 112061.</w:t>
-      </w:r>
-      <w:r>
-        <w:t xml:space="preserve"> </w:t>
-      </w:r>
-      <w:r>
-        <w:t xml:space="preserve">https://doi.org/10.1016/j.rse.2020.112061</w:t>
-      </w:r>
-    </w:p>
-    <w:p>
-      <w:pPr>
-        <w:pStyle w:val="BodyText"/>
-      </w:pPr>
-      <w:r>
-        <w:t xml:space="preserve">[14] Zhang, W., et al. (2016). An easy-to-use airborne LiDAR data filtering method</w:t>
-      </w:r>
-      <w:r>
-        <w:t xml:space="preserve"> </w:t>
-      </w:r>
-      <w:r>
-        <w:t xml:space="preserve">based on cloth simulation.</w:t>
-      </w:r>
-      <w:r>
-        <w:t xml:space="preserve"> </w:t>
+        <w:t xml:space="preserve">Usability</w:t>
       </w:r>
       <w:r>
         <w:rPr>
           <w:iCs/>
           <w:i/>
         </w:rPr>
-        <w:t xml:space="preserve">Remote Sensing</w:t>
-      </w:r>
-      <w:r>
-        <w:t xml:space="preserve"> </w:t>
-      </w:r>
-      <w:r>
-        <w:t xml:space="preserve">8(6), 501.</w:t>
-      </w:r>
-      <w:r>
-        <w:t xml:space="preserve"> </w:t>
-      </w:r>
-      <w:r>
-        <w:t xml:space="preserve">https://doi.org/10.3390/rs8060501</w:t>
-      </w:r>
-    </w:p>
-    <w:p>
-      <w:pPr>
-        <w:pStyle w:val="BodyText"/>
-      </w:pPr>
-      <w:r>
-        <w:t xml:space="preserve">[15] Brooke, J. (1996). SUS: a</w:t>
-      </w:r>
-      <w:r>
-        <w:t xml:space="preserve"> </w:t>
-      </w:r>
-      <w:r>
-        <w:t xml:space="preserve">“</w:t>
-      </w:r>
-      <w:r>
-        <w:t xml:space="preserve">quick and dirty</w:t>
-      </w:r>
-      <w:r>
-        <w:t xml:space="preserve">”</w:t>
-      </w:r>
-      <w:r>
-        <w:t xml:space="preserve"> </w:t>
-      </w:r>
-      <w:r>
-        <w:t xml:space="preserve">usability scale. In:</w:t>
-      </w:r>
-      <w:r>
         <w:t xml:space="preserve"> </w:t>
       </w:r>
       <w:r>
@@ -4257,34 +3892,34 @@
           <w:iCs/>
           <w:i/>
         </w:rPr>
-        <w:t xml:space="preserve">Usability</w:t>
+        <w:t xml:space="preserve">Evaluation in Industry</w:t>
+      </w:r>
+      <w:r>
+        <w:t xml:space="preserve">, Taylor &amp; Francis, 189–194.</w:t>
+      </w:r>
+    </w:p>
+    <w:p>
+      <w:pPr>
+        <w:pStyle w:val="BodyText"/>
+      </w:pPr>
+      <w:r>
+        <w:t xml:space="preserve">[14] Sauro, J., Lewis, J. R. (2016).</w:t>
+      </w:r>
+      <w:r>
+        <w:t xml:space="preserve"> </w:t>
       </w:r>
       <w:r>
         <w:rPr>
           <w:iCs/>
           <w:i/>
         </w:rPr>
-        <w:t xml:space="preserve"> </w:t>
+        <w:t xml:space="preserve">Quantifying the User Experience: Practical</w:t>
       </w:r>
       <w:r>
         <w:rPr>
           <w:iCs/>
           <w:i/>
         </w:rPr>
-        <w:t xml:space="preserve">Evaluation in Industry</w:t>
-      </w:r>
-      <w:r>
-        <w:t xml:space="preserve">, Taylor &amp; Francis, 189–194.</w:t>
-      </w:r>
-    </w:p>
-    <w:p>
-      <w:pPr>
-        <w:pStyle w:val="BodyText"/>
-      </w:pPr>
-      <w:r>
-        <w:t xml:space="preserve">[16] Sauro, J., Lewis, J. R. (2016).</w:t>
-      </w:r>
-      <w:r>
         <w:t xml:space="preserve"> </w:t>
       </w:r>
       <w:r>
@@ -4292,116 +3927,102 @@
           <w:iCs/>
           <w:i/>
         </w:rPr>
-        <w:t xml:space="preserve">Quantifying the User Experience: Practical</w:t>
-      </w:r>
+        <w:t xml:space="preserve">Statistics for User Research</w:t>
+      </w:r>
+      <w:r>
+        <w:t xml:space="preserve">, 2nd ed., Morgan Kaufmann.</w:t>
+      </w:r>
+    </w:p>
+    <w:p>
+      <w:pPr>
+        <w:pStyle w:val="BodyText"/>
+      </w:pPr>
+      <w:r>
+        <w:t xml:space="preserve">[15] Chang, M., Candotti, A., von Ellenrieder, K., Tomelleri, E., Camurri, M.</w:t>
+      </w:r>
+      <w:r>
+        <w:t xml:space="preserve"> </w:t>
+      </w:r>
+      <w:r>
+        <w:t xml:space="preserve">(2025). Data for:</w:t>
+      </w:r>
+      <w:r>
+        <w:t xml:space="preserve"> </w:t>
+      </w:r>
+      <w:r>
+        <w:t xml:space="preserve">“</w:t>
+      </w:r>
+      <w:r>
+        <w:t xml:space="preserve">A multi-platform LiDAR dataset for standardized forest</w:t>
+      </w:r>
+      <w:r>
+        <w:t xml:space="preserve"> </w:t>
+      </w:r>
+      <w:r>
+        <w:t xml:space="preserve">inventory measurement at long term ecological monitoring sites</w:t>
+      </w:r>
+      <w:r>
+        <w:t xml:space="preserve">”</w:t>
+      </w:r>
+      <w:r>
+        <w:t xml:space="preserve"> </w:t>
+      </w:r>
+      <w:r>
+        <w:t xml:space="preserve">[Dataset].</w:t>
+      </w:r>
+      <w:r>
+        <w:t xml:space="preserve"> </w:t>
+      </w:r>
+      <w:r>
+        <w:t xml:space="preserve">Zenodo. https://doi.org/10.5281/zenodo.17186174</w:t>
+      </w:r>
+    </w:p>
+    <w:p>
+      <w:pPr>
+        <w:pStyle w:val="BodyText"/>
+      </w:pPr>
       <w:r>
         <w:rPr>
           <w:iCs/>
           <w:i/>
         </w:rPr>
-        <w:t xml:space="preserve"> </w:t>
-      </w:r>
+        <w:t xml:space="preserve">Software used, with the versions that produced the reported figures:</w:t>
+      </w:r>
+      <w:r>
+        <w:t xml:space="preserve"> </w:t>
+      </w:r>
+      <w:r>
+        <w:t xml:space="preserve">Hugin/Panotools 2024.0.1 (GPL-2.0), Pannellum 2.5.6 (MIT), three.js r160 (MIT),</w:t>
+      </w:r>
+      <w:r>
+        <w:t xml:space="preserve"> </w:t>
+      </w:r>
+      <w:r>
+        <w:t xml:space="preserve">Leaflet 1.9.4 (BSD-2), Caddy 2 (Apache-2.0), Garage 1.0.1 (AGPL-3.0), FastAPI</w:t>
+      </w:r>
+      <w:r>
+        <w:t xml:space="preserve"> </w:t>
+      </w:r>
+      <w:r>
+        <w:t xml:space="preserve">(MIT), NumPy 1.26.4, Pillow 12.3.0, OpenCV 5.0.0, laspy 2.5.4, 3DFin/dendromatics,</w:t>
+      </w:r>
+      <w:r>
+        <w:t xml:space="preserve"> </w:t>
+      </w:r>
+      <w:r>
+        <w:t xml:space="preserve">TreeGrOSS (GPL-3.0, isolated as a separate process).</w:t>
+      </w:r>
+    </w:p>
+    <w:p>
+      <w:pPr>
+        <w:pStyle w:val="BodyText"/>
+      </w:pPr>
       <w:r>
         <w:rPr>
           <w:iCs/>
           <w:i/>
         </w:rPr>
-        <w:t xml:space="preserve">Statistics for User Research</w:t>
-      </w:r>
-      <w:r>
-        <w:t xml:space="preserve">, 2nd ed., Morgan Kaufmann.</w:t>
-      </w:r>
-    </w:p>
-    <w:p>
-      <w:pPr>
-        <w:pStyle w:val="BodyText"/>
-      </w:pPr>
-      <w:r>
-        <w:t xml:space="preserve">[17] Chang, M., Candotti, A., von Ellenrieder, K., Tomelleri, E., Camurri, M.</w:t>
-      </w:r>
-      <w:r>
-        <w:t xml:space="preserve"> </w:t>
-      </w:r>
-      <w:r>
-        <w:t xml:space="preserve">(2025). Data for:</w:t>
-      </w:r>
-      <w:r>
-        <w:t xml:space="preserve"> </w:t>
-      </w:r>
-      <w:r>
-        <w:t xml:space="preserve">“</w:t>
-      </w:r>
-      <w:r>
-        <w:t xml:space="preserve">A multi-platform LiDAR dataset for standardized forest</w:t>
-      </w:r>
-      <w:r>
-        <w:t xml:space="preserve"> </w:t>
-      </w:r>
-      <w:r>
-        <w:t xml:space="preserve">inventory measurement at long term ecological monitoring sites</w:t>
-      </w:r>
-      <w:r>
-        <w:t xml:space="preserve">”</w:t>
-      </w:r>
-      <w:r>
-        <w:t xml:space="preserve"> </w:t>
-      </w:r>
-      <w:r>
-        <w:t xml:space="preserve">[Dataset].</w:t>
-      </w:r>
-      <w:r>
-        <w:t xml:space="preserve"> </w:t>
-      </w:r>
-      <w:r>
-        <w:t xml:space="preserve">Zenodo. https://doi.org/10.5281/zenodo.17186174</w:t>
-      </w:r>
-    </w:p>
-    <w:p>
-      <w:pPr>
-        <w:pStyle w:val="BodyText"/>
-      </w:pPr>
-      <w:r>
-        <w:rPr>
-          <w:iCs/>
-          <w:i/>
-        </w:rPr>
-        <w:t xml:space="preserve">Software used, with the versions that produced the reported figures:</w:t>
-      </w:r>
-      <w:r>
-        <w:t xml:space="preserve"> </w:t>
-      </w:r>
-      <w:r>
-        <w:t xml:space="preserve">Hugin/Panotools 2024.0.1 (GPL-2.0), Pannellum 2.5.6 (MIT), three.js r160 (MIT),</w:t>
-      </w:r>
-      <w:r>
-        <w:t xml:space="preserve"> </w:t>
-      </w:r>
-      <w:r>
-        <w:t xml:space="preserve">Leaflet 1.9.4 (BSD-2), Caddy 2 (Apache-2.0), Garage 1.0.1 (AGPL-3.0), FastAPI</w:t>
-      </w:r>
-      <w:r>
-        <w:t xml:space="preserve"> </w:t>
-      </w:r>
-      <w:r>
-        <w:t xml:space="preserve">(MIT), NumPy 1.26.4, Pillow 12.3.0, OpenCV 5.0.0, laspy 2.5.4, 3DFin/dendromatics,</w:t>
-      </w:r>
-      <w:r>
-        <w:t xml:space="preserve"> </w:t>
-      </w:r>
-      <w:r>
-        <w:t xml:space="preserve">TreeGrOSS (GPL-3.0, isolated as a separate process).</w:t>
-      </w:r>
-    </w:p>
-    <w:p>
-      <w:pPr>
-        <w:pStyle w:val="BodyText"/>
-      </w:pPr>
-      <w:r>
-        <w:rPr>
-          <w:iCs/>
-          <w:i/>
-        </w:rPr>
-        <w:t xml:space="preserve">Checked against publisher records (Oct 2026): [1]–[3], [5]–[7], [10]–[14], [17].</w:t>
+        <w:t xml:space="preserve">Checked against publisher records (Oct 2026): [1]–[3], [5]–[7], [10]–[12], [15].</w:t>
       </w:r>
     </w:p>
     <w:bookmarkEnd w:id="40"/>

</xml_diff>